<commit_message>
docs(irb): add eeriness scale + voice-similarity check to questionnaires
Add a Perceived Eeriness semantic-differential matrix (Ho & MacDorman 2017;
Zibrek et al. 2018; Guo et al. 2024 precedent) and a voice-similarity
manipulation check, and reformat Raw NASA-TLX into a UCF-theme rating
matrix (0 Very low - 10 Very high). Add the two eeriness citations.

Co-Authored-By: Claude Opus 4.8 <noreply@anthropic.com>
</commit_message>
<xml_diff>
--- a/docs/irb/submission/Participant_Questionnaires.docx
+++ b/docs/irb/submission/Participant_Questionnaires.docx
@@ -308,7 +308,7 @@
           <w:rFonts w:ascii="Arial" w:hAnsi="Arial"/>
           <w:b w:val="0"/>
         </w:rPr>
-        <w:t>Mark each scale from 0 (low) to 100 (high). This packet uses the six raw NASA-TLX subscales without pairwise weighting (Hart &amp; Staveland, 1988; https://doi.org/10.1016/S0166-4115(08)62386-9).</w:t>
+        <w:t>Please rate your workload during this block. Mark one box per row on the 0 (Very low) to 10 (Very high) scale. Raw NASA-TLX, six unweighted subscales (Hart &amp; Staveland, 1988; https://doi.org/10.1016/S0166-4115(08)62386-9).</w:t>
       </w:r>
     </w:p>
     <w:tbl>
@@ -320,9 +320,18 @@
         <w:tblLook w:firstColumn="1" w:firstRow="1" w:lastColumn="0" w:lastRow="0" w:noHBand="0" w:noVBand="1" w:val="04A0"/>
       </w:tblPr>
       <w:tblGrid>
-        <w:gridCol w:w="3360"/>
-        <w:gridCol w:w="3360"/>
-        <w:gridCol w:w="3360"/>
+        <w:gridCol w:w="840"/>
+        <w:gridCol w:w="840"/>
+        <w:gridCol w:w="840"/>
+        <w:gridCol w:w="840"/>
+        <w:gridCol w:w="840"/>
+        <w:gridCol w:w="840"/>
+        <w:gridCol w:w="840"/>
+        <w:gridCol w:w="840"/>
+        <w:gridCol w:w="840"/>
+        <w:gridCol w:w="840"/>
+        <w:gridCol w:w="840"/>
+        <w:gridCol w:w="840"/>
       </w:tblGrid>
       <w:tr>
         <w:trPr>
@@ -331,7 +340,7 @@
         </w:trPr>
         <w:tc>
           <w:tcPr>
-            <w:tcW w:type="dxa" w:w="3360"/>
+            <w:tcW w:type="dxa" w:w="840"/>
             <w:vAlign w:val="center"/>
             <w:tcMar>
               <w:top w:w="40" w:type="dxa"/>
@@ -356,7 +365,7 @@
         </w:tc>
         <w:tc>
           <w:tcPr>
-            <w:tcW w:type="dxa" w:w="3360"/>
+            <w:tcW w:type="dxa" w:w="840"/>
             <w:vAlign w:val="center"/>
             <w:tcMar>
               <w:top w:w="40" w:type="dxa"/>
@@ -375,13 +384,13 @@
                 <w:rFonts w:ascii="Arial" w:hAnsi="Arial"/>
                 <w:b/>
               </w:rPr>
-              <w:t>Prompt</w:t>
-            </w:r>
-          </w:p>
-        </w:tc>
-        <w:tc>
-          <w:tcPr>
-            <w:tcW w:type="dxa" w:w="3360"/>
+              <w:t>0 Very low</w:t>
+            </w:r>
+          </w:p>
+        </w:tc>
+        <w:tc>
+          <w:tcPr>
+            <w:tcW w:type="dxa" w:w="840"/>
             <w:vAlign w:val="center"/>
             <w:tcMar>
               <w:top w:w="40" w:type="dxa"/>
@@ -400,7 +409,232 @@
                 <w:rFonts w:ascii="Arial" w:hAnsi="Arial"/>
                 <w:b/>
               </w:rPr>
-              <w:t>Rating 0–100</w:t>
+              <w:t>1</w:t>
+            </w:r>
+          </w:p>
+        </w:tc>
+        <w:tc>
+          <w:tcPr>
+            <w:tcW w:type="dxa" w:w="840"/>
+            <w:vAlign w:val="center"/>
+            <w:tcMar>
+              <w:top w:w="40" w:type="dxa"/>
+              <w:start w:w="90" w:type="dxa"/>
+              <w:bottom w:w="40" w:type="dxa"/>
+              <w:end w:w="90" w:type="dxa"/>
+            </w:tcMar>
+            <w:shd w:fill="D9EAF7"/>
+          </w:tcPr>
+          <w:p>
+            <w:pPr>
+              <w:spacing w:after="0"/>
+            </w:pPr>
+            <w:r>
+              <w:rPr>
+                <w:rFonts w:ascii="Arial" w:hAnsi="Arial"/>
+                <w:b/>
+              </w:rPr>
+              <w:t>2</w:t>
+            </w:r>
+          </w:p>
+        </w:tc>
+        <w:tc>
+          <w:tcPr>
+            <w:tcW w:type="dxa" w:w="840"/>
+            <w:vAlign w:val="center"/>
+            <w:tcMar>
+              <w:top w:w="40" w:type="dxa"/>
+              <w:start w:w="90" w:type="dxa"/>
+              <w:bottom w:w="40" w:type="dxa"/>
+              <w:end w:w="90" w:type="dxa"/>
+            </w:tcMar>
+            <w:shd w:fill="D9EAF7"/>
+          </w:tcPr>
+          <w:p>
+            <w:pPr>
+              <w:spacing w:after="0"/>
+            </w:pPr>
+            <w:r>
+              <w:rPr>
+                <w:rFonts w:ascii="Arial" w:hAnsi="Arial"/>
+                <w:b/>
+              </w:rPr>
+              <w:t>3</w:t>
+            </w:r>
+          </w:p>
+        </w:tc>
+        <w:tc>
+          <w:tcPr>
+            <w:tcW w:type="dxa" w:w="840"/>
+            <w:vAlign w:val="center"/>
+            <w:tcMar>
+              <w:top w:w="40" w:type="dxa"/>
+              <w:start w:w="90" w:type="dxa"/>
+              <w:bottom w:w="40" w:type="dxa"/>
+              <w:end w:w="90" w:type="dxa"/>
+            </w:tcMar>
+            <w:shd w:fill="D9EAF7"/>
+          </w:tcPr>
+          <w:p>
+            <w:pPr>
+              <w:spacing w:after="0"/>
+            </w:pPr>
+            <w:r>
+              <w:rPr>
+                <w:rFonts w:ascii="Arial" w:hAnsi="Arial"/>
+                <w:b/>
+              </w:rPr>
+              <w:t>4</w:t>
+            </w:r>
+          </w:p>
+        </w:tc>
+        <w:tc>
+          <w:tcPr>
+            <w:tcW w:type="dxa" w:w="840"/>
+            <w:vAlign w:val="center"/>
+            <w:tcMar>
+              <w:top w:w="40" w:type="dxa"/>
+              <w:start w:w="90" w:type="dxa"/>
+              <w:bottom w:w="40" w:type="dxa"/>
+              <w:end w:w="90" w:type="dxa"/>
+            </w:tcMar>
+            <w:shd w:fill="D9EAF7"/>
+          </w:tcPr>
+          <w:p>
+            <w:pPr>
+              <w:spacing w:after="0"/>
+            </w:pPr>
+            <w:r>
+              <w:rPr>
+                <w:rFonts w:ascii="Arial" w:hAnsi="Arial"/>
+                <w:b/>
+              </w:rPr>
+              <w:t>5</w:t>
+            </w:r>
+          </w:p>
+        </w:tc>
+        <w:tc>
+          <w:tcPr>
+            <w:tcW w:type="dxa" w:w="840"/>
+            <w:vAlign w:val="center"/>
+            <w:tcMar>
+              <w:top w:w="40" w:type="dxa"/>
+              <w:start w:w="90" w:type="dxa"/>
+              <w:bottom w:w="40" w:type="dxa"/>
+              <w:end w:w="90" w:type="dxa"/>
+            </w:tcMar>
+            <w:shd w:fill="D9EAF7"/>
+          </w:tcPr>
+          <w:p>
+            <w:pPr>
+              <w:spacing w:after="0"/>
+            </w:pPr>
+            <w:r>
+              <w:rPr>
+                <w:rFonts w:ascii="Arial" w:hAnsi="Arial"/>
+                <w:b/>
+              </w:rPr>
+              <w:t>6</w:t>
+            </w:r>
+          </w:p>
+        </w:tc>
+        <w:tc>
+          <w:tcPr>
+            <w:tcW w:type="dxa" w:w="840"/>
+            <w:vAlign w:val="center"/>
+            <w:tcMar>
+              <w:top w:w="40" w:type="dxa"/>
+              <w:start w:w="90" w:type="dxa"/>
+              <w:bottom w:w="40" w:type="dxa"/>
+              <w:end w:w="90" w:type="dxa"/>
+            </w:tcMar>
+            <w:shd w:fill="D9EAF7"/>
+          </w:tcPr>
+          <w:p>
+            <w:pPr>
+              <w:spacing w:after="0"/>
+            </w:pPr>
+            <w:r>
+              <w:rPr>
+                <w:rFonts w:ascii="Arial" w:hAnsi="Arial"/>
+                <w:b/>
+              </w:rPr>
+              <w:t>7</w:t>
+            </w:r>
+          </w:p>
+        </w:tc>
+        <w:tc>
+          <w:tcPr>
+            <w:tcW w:type="dxa" w:w="840"/>
+            <w:vAlign w:val="center"/>
+            <w:tcMar>
+              <w:top w:w="40" w:type="dxa"/>
+              <w:start w:w="90" w:type="dxa"/>
+              <w:bottom w:w="40" w:type="dxa"/>
+              <w:end w:w="90" w:type="dxa"/>
+            </w:tcMar>
+            <w:shd w:fill="D9EAF7"/>
+          </w:tcPr>
+          <w:p>
+            <w:pPr>
+              <w:spacing w:after="0"/>
+            </w:pPr>
+            <w:r>
+              <w:rPr>
+                <w:rFonts w:ascii="Arial" w:hAnsi="Arial"/>
+                <w:b/>
+              </w:rPr>
+              <w:t>8</w:t>
+            </w:r>
+          </w:p>
+        </w:tc>
+        <w:tc>
+          <w:tcPr>
+            <w:tcW w:type="dxa" w:w="840"/>
+            <w:vAlign w:val="center"/>
+            <w:tcMar>
+              <w:top w:w="40" w:type="dxa"/>
+              <w:start w:w="90" w:type="dxa"/>
+              <w:bottom w:w="40" w:type="dxa"/>
+              <w:end w:w="90" w:type="dxa"/>
+            </w:tcMar>
+            <w:shd w:fill="D9EAF7"/>
+          </w:tcPr>
+          <w:p>
+            <w:pPr>
+              <w:spacing w:after="0"/>
+            </w:pPr>
+            <w:r>
+              <w:rPr>
+                <w:rFonts w:ascii="Arial" w:hAnsi="Arial"/>
+                <w:b/>
+              </w:rPr>
+              <w:t>9</w:t>
+            </w:r>
+          </w:p>
+        </w:tc>
+        <w:tc>
+          <w:tcPr>
+            <w:tcW w:type="dxa" w:w="840"/>
+            <w:vAlign w:val="center"/>
+            <w:tcMar>
+              <w:top w:w="40" w:type="dxa"/>
+              <w:start w:w="90" w:type="dxa"/>
+              <w:bottom w:w="40" w:type="dxa"/>
+              <w:end w:w="90" w:type="dxa"/>
+            </w:tcMar>
+            <w:shd w:fill="D9EAF7"/>
+          </w:tcPr>
+          <w:p>
+            <w:pPr>
+              <w:spacing w:after="0"/>
+            </w:pPr>
+            <w:r>
+              <w:rPr>
+                <w:rFonts w:ascii="Arial" w:hAnsi="Arial"/>
+                <w:b/>
+              </w:rPr>
+              <w:t>10 Very high</w:t>
             </w:r>
           </w:p>
         </w:tc>
@@ -411,73 +645,289 @@
         </w:trPr>
         <w:tc>
           <w:tcPr>
-            <w:tcW w:type="dxa" w:w="3360"/>
-            <w:vAlign w:val="center"/>
-            <w:tcMar>
-              <w:top w:w="40" w:type="dxa"/>
-              <w:start w:w="90" w:type="dxa"/>
-              <w:bottom w:w="40" w:type="dxa"/>
-              <w:end w:w="90" w:type="dxa"/>
-            </w:tcMar>
-          </w:tcPr>
-          <w:p>
-            <w:pPr>
-              <w:spacing w:after="0"/>
-            </w:pPr>
-            <w:r>
-              <w:rPr>
-                <w:rFonts w:ascii="Arial" w:hAnsi="Arial"/>
-                <w:b w:val="0"/>
-              </w:rPr>
-              <w:t>Mental demand</w:t>
-            </w:r>
-          </w:p>
-        </w:tc>
-        <w:tc>
-          <w:tcPr>
-            <w:tcW w:type="dxa" w:w="3360"/>
-            <w:vAlign w:val="center"/>
-            <w:tcMar>
-              <w:top w:w="40" w:type="dxa"/>
-              <w:start w:w="90" w:type="dxa"/>
-              <w:bottom w:w="40" w:type="dxa"/>
-              <w:end w:w="90" w:type="dxa"/>
-            </w:tcMar>
-          </w:tcPr>
-          <w:p>
-            <w:pPr>
-              <w:spacing w:after="0"/>
-            </w:pPr>
-            <w:r>
-              <w:rPr>
-                <w:rFonts w:ascii="Arial" w:hAnsi="Arial"/>
-                <w:b w:val="0"/>
-              </w:rPr>
-              <w:t>How mentally demanding was this block?</w:t>
-            </w:r>
-          </w:p>
-        </w:tc>
-        <w:tc>
-          <w:tcPr>
-            <w:tcW w:type="dxa" w:w="3360"/>
-            <w:vAlign w:val="center"/>
-            <w:tcMar>
-              <w:top w:w="40" w:type="dxa"/>
-              <w:start w:w="90" w:type="dxa"/>
-              <w:bottom w:w="40" w:type="dxa"/>
-              <w:end w:w="90" w:type="dxa"/>
-            </w:tcMar>
-          </w:tcPr>
-          <w:p>
-            <w:pPr>
-              <w:spacing w:after="0"/>
-            </w:pPr>
-            <w:r>
-              <w:rPr>
-                <w:rFonts w:ascii="Arial" w:hAnsi="Arial"/>
-                <w:b w:val="0"/>
-              </w:rPr>
-              <w:t>______</w:t>
+            <w:tcW w:type="dxa" w:w="840"/>
+            <w:vAlign w:val="center"/>
+            <w:tcMar>
+              <w:top w:w="40" w:type="dxa"/>
+              <w:start w:w="90" w:type="dxa"/>
+              <w:bottom w:w="40" w:type="dxa"/>
+              <w:end w:w="90" w:type="dxa"/>
+            </w:tcMar>
+          </w:tcPr>
+          <w:p>
+            <w:pPr>
+              <w:spacing w:after="0"/>
+            </w:pPr>
+            <w:r>
+              <w:rPr>
+                <w:rFonts w:ascii="Arial" w:hAnsi="Arial"/>
+                <w:b w:val="0"/>
+              </w:rPr>
+              <w:t>Mental Demand — How mentally demanding was this block?</w:t>
+            </w:r>
+          </w:p>
+        </w:tc>
+        <w:tc>
+          <w:tcPr>
+            <w:tcW w:type="dxa" w:w="840"/>
+            <w:vAlign w:val="center"/>
+            <w:tcMar>
+              <w:top w:w="40" w:type="dxa"/>
+              <w:start w:w="90" w:type="dxa"/>
+              <w:bottom w:w="40" w:type="dxa"/>
+              <w:end w:w="90" w:type="dxa"/>
+            </w:tcMar>
+          </w:tcPr>
+          <w:p>
+            <w:pPr>
+              <w:spacing w:after="0"/>
+            </w:pPr>
+            <w:r>
+              <w:rPr>
+                <w:rFonts w:ascii="Arial" w:hAnsi="Arial"/>
+                <w:b w:val="0"/>
+              </w:rPr>
+              <w:t>☐</w:t>
+            </w:r>
+          </w:p>
+        </w:tc>
+        <w:tc>
+          <w:tcPr>
+            <w:tcW w:type="dxa" w:w="840"/>
+            <w:vAlign w:val="center"/>
+            <w:tcMar>
+              <w:top w:w="40" w:type="dxa"/>
+              <w:start w:w="90" w:type="dxa"/>
+              <w:bottom w:w="40" w:type="dxa"/>
+              <w:end w:w="90" w:type="dxa"/>
+            </w:tcMar>
+          </w:tcPr>
+          <w:p>
+            <w:pPr>
+              <w:spacing w:after="0"/>
+            </w:pPr>
+            <w:r>
+              <w:rPr>
+                <w:rFonts w:ascii="Arial" w:hAnsi="Arial"/>
+                <w:b w:val="0"/>
+              </w:rPr>
+              <w:t>☐</w:t>
+            </w:r>
+          </w:p>
+        </w:tc>
+        <w:tc>
+          <w:tcPr>
+            <w:tcW w:type="dxa" w:w="840"/>
+            <w:vAlign w:val="center"/>
+            <w:tcMar>
+              <w:top w:w="40" w:type="dxa"/>
+              <w:start w:w="90" w:type="dxa"/>
+              <w:bottom w:w="40" w:type="dxa"/>
+              <w:end w:w="90" w:type="dxa"/>
+            </w:tcMar>
+          </w:tcPr>
+          <w:p>
+            <w:pPr>
+              <w:spacing w:after="0"/>
+            </w:pPr>
+            <w:r>
+              <w:rPr>
+                <w:rFonts w:ascii="Arial" w:hAnsi="Arial"/>
+                <w:b w:val="0"/>
+              </w:rPr>
+              <w:t>☐</w:t>
+            </w:r>
+          </w:p>
+        </w:tc>
+        <w:tc>
+          <w:tcPr>
+            <w:tcW w:type="dxa" w:w="840"/>
+            <w:vAlign w:val="center"/>
+            <w:tcMar>
+              <w:top w:w="40" w:type="dxa"/>
+              <w:start w:w="90" w:type="dxa"/>
+              <w:bottom w:w="40" w:type="dxa"/>
+              <w:end w:w="90" w:type="dxa"/>
+            </w:tcMar>
+          </w:tcPr>
+          <w:p>
+            <w:pPr>
+              <w:spacing w:after="0"/>
+            </w:pPr>
+            <w:r>
+              <w:rPr>
+                <w:rFonts w:ascii="Arial" w:hAnsi="Arial"/>
+                <w:b w:val="0"/>
+              </w:rPr>
+              <w:t>☐</w:t>
+            </w:r>
+          </w:p>
+        </w:tc>
+        <w:tc>
+          <w:tcPr>
+            <w:tcW w:type="dxa" w:w="840"/>
+            <w:vAlign w:val="center"/>
+            <w:tcMar>
+              <w:top w:w="40" w:type="dxa"/>
+              <w:start w:w="90" w:type="dxa"/>
+              <w:bottom w:w="40" w:type="dxa"/>
+              <w:end w:w="90" w:type="dxa"/>
+            </w:tcMar>
+          </w:tcPr>
+          <w:p>
+            <w:pPr>
+              <w:spacing w:after="0"/>
+            </w:pPr>
+            <w:r>
+              <w:rPr>
+                <w:rFonts w:ascii="Arial" w:hAnsi="Arial"/>
+                <w:b w:val="0"/>
+              </w:rPr>
+              <w:t>☐</w:t>
+            </w:r>
+          </w:p>
+        </w:tc>
+        <w:tc>
+          <w:tcPr>
+            <w:tcW w:type="dxa" w:w="840"/>
+            <w:vAlign w:val="center"/>
+            <w:tcMar>
+              <w:top w:w="40" w:type="dxa"/>
+              <w:start w:w="90" w:type="dxa"/>
+              <w:bottom w:w="40" w:type="dxa"/>
+              <w:end w:w="90" w:type="dxa"/>
+            </w:tcMar>
+          </w:tcPr>
+          <w:p>
+            <w:pPr>
+              <w:spacing w:after="0"/>
+            </w:pPr>
+            <w:r>
+              <w:rPr>
+                <w:rFonts w:ascii="Arial" w:hAnsi="Arial"/>
+                <w:b w:val="0"/>
+              </w:rPr>
+              <w:t>☐</w:t>
+            </w:r>
+          </w:p>
+        </w:tc>
+        <w:tc>
+          <w:tcPr>
+            <w:tcW w:type="dxa" w:w="840"/>
+            <w:vAlign w:val="center"/>
+            <w:tcMar>
+              <w:top w:w="40" w:type="dxa"/>
+              <w:start w:w="90" w:type="dxa"/>
+              <w:bottom w:w="40" w:type="dxa"/>
+              <w:end w:w="90" w:type="dxa"/>
+            </w:tcMar>
+          </w:tcPr>
+          <w:p>
+            <w:pPr>
+              <w:spacing w:after="0"/>
+            </w:pPr>
+            <w:r>
+              <w:rPr>
+                <w:rFonts w:ascii="Arial" w:hAnsi="Arial"/>
+                <w:b w:val="0"/>
+              </w:rPr>
+              <w:t>☐</w:t>
+            </w:r>
+          </w:p>
+        </w:tc>
+        <w:tc>
+          <w:tcPr>
+            <w:tcW w:type="dxa" w:w="840"/>
+            <w:vAlign w:val="center"/>
+            <w:tcMar>
+              <w:top w:w="40" w:type="dxa"/>
+              <w:start w:w="90" w:type="dxa"/>
+              <w:bottom w:w="40" w:type="dxa"/>
+              <w:end w:w="90" w:type="dxa"/>
+            </w:tcMar>
+          </w:tcPr>
+          <w:p>
+            <w:pPr>
+              <w:spacing w:after="0"/>
+            </w:pPr>
+            <w:r>
+              <w:rPr>
+                <w:rFonts w:ascii="Arial" w:hAnsi="Arial"/>
+                <w:b w:val="0"/>
+              </w:rPr>
+              <w:t>☐</w:t>
+            </w:r>
+          </w:p>
+        </w:tc>
+        <w:tc>
+          <w:tcPr>
+            <w:tcW w:type="dxa" w:w="840"/>
+            <w:vAlign w:val="center"/>
+            <w:tcMar>
+              <w:top w:w="40" w:type="dxa"/>
+              <w:start w:w="90" w:type="dxa"/>
+              <w:bottom w:w="40" w:type="dxa"/>
+              <w:end w:w="90" w:type="dxa"/>
+            </w:tcMar>
+          </w:tcPr>
+          <w:p>
+            <w:pPr>
+              <w:spacing w:after="0"/>
+            </w:pPr>
+            <w:r>
+              <w:rPr>
+                <w:rFonts w:ascii="Arial" w:hAnsi="Arial"/>
+                <w:b w:val="0"/>
+              </w:rPr>
+              <w:t>☐</w:t>
+            </w:r>
+          </w:p>
+        </w:tc>
+        <w:tc>
+          <w:tcPr>
+            <w:tcW w:type="dxa" w:w="840"/>
+            <w:vAlign w:val="center"/>
+            <w:tcMar>
+              <w:top w:w="40" w:type="dxa"/>
+              <w:start w:w="90" w:type="dxa"/>
+              <w:bottom w:w="40" w:type="dxa"/>
+              <w:end w:w="90" w:type="dxa"/>
+            </w:tcMar>
+          </w:tcPr>
+          <w:p>
+            <w:pPr>
+              <w:spacing w:after="0"/>
+            </w:pPr>
+            <w:r>
+              <w:rPr>
+                <w:rFonts w:ascii="Arial" w:hAnsi="Arial"/>
+                <w:b w:val="0"/>
+              </w:rPr>
+              <w:t>☐</w:t>
+            </w:r>
+          </w:p>
+        </w:tc>
+        <w:tc>
+          <w:tcPr>
+            <w:tcW w:type="dxa" w:w="840"/>
+            <w:vAlign w:val="center"/>
+            <w:tcMar>
+              <w:top w:w="40" w:type="dxa"/>
+              <w:start w:w="90" w:type="dxa"/>
+              <w:bottom w:w="40" w:type="dxa"/>
+              <w:end w:w="90" w:type="dxa"/>
+            </w:tcMar>
+          </w:tcPr>
+          <w:p>
+            <w:pPr>
+              <w:spacing w:after="0"/>
+            </w:pPr>
+            <w:r>
+              <w:rPr>
+                <w:rFonts w:ascii="Arial" w:hAnsi="Arial"/>
+                <w:b w:val="0"/>
+              </w:rPr>
+              <w:t>☐</w:t>
             </w:r>
           </w:p>
         </w:tc>
@@ -488,73 +938,289 @@
         </w:trPr>
         <w:tc>
           <w:tcPr>
-            <w:tcW w:type="dxa" w:w="3360"/>
-            <w:vAlign w:val="center"/>
-            <w:tcMar>
-              <w:top w:w="40" w:type="dxa"/>
-              <w:start w:w="90" w:type="dxa"/>
-              <w:bottom w:w="40" w:type="dxa"/>
-              <w:end w:w="90" w:type="dxa"/>
-            </w:tcMar>
-          </w:tcPr>
-          <w:p>
-            <w:pPr>
-              <w:spacing w:after="0"/>
-            </w:pPr>
-            <w:r>
-              <w:rPr>
-                <w:rFonts w:ascii="Arial" w:hAnsi="Arial"/>
-                <w:b w:val="0"/>
-              </w:rPr>
-              <w:t>Physical demand</w:t>
-            </w:r>
-          </w:p>
-        </w:tc>
-        <w:tc>
-          <w:tcPr>
-            <w:tcW w:type="dxa" w:w="3360"/>
-            <w:vAlign w:val="center"/>
-            <w:tcMar>
-              <w:top w:w="40" w:type="dxa"/>
-              <w:start w:w="90" w:type="dxa"/>
-              <w:bottom w:w="40" w:type="dxa"/>
-              <w:end w:w="90" w:type="dxa"/>
-            </w:tcMar>
-          </w:tcPr>
-          <w:p>
-            <w:pPr>
-              <w:spacing w:after="0"/>
-            </w:pPr>
-            <w:r>
-              <w:rPr>
-                <w:rFonts w:ascii="Arial" w:hAnsi="Arial"/>
-                <w:b w:val="0"/>
-              </w:rPr>
-              <w:t>How physically demanding was this block?</w:t>
-            </w:r>
-          </w:p>
-        </w:tc>
-        <w:tc>
-          <w:tcPr>
-            <w:tcW w:type="dxa" w:w="3360"/>
-            <w:vAlign w:val="center"/>
-            <w:tcMar>
-              <w:top w:w="40" w:type="dxa"/>
-              <w:start w:w="90" w:type="dxa"/>
-              <w:bottom w:w="40" w:type="dxa"/>
-              <w:end w:w="90" w:type="dxa"/>
-            </w:tcMar>
-          </w:tcPr>
-          <w:p>
-            <w:pPr>
-              <w:spacing w:after="0"/>
-            </w:pPr>
-            <w:r>
-              <w:rPr>
-                <w:rFonts w:ascii="Arial" w:hAnsi="Arial"/>
-                <w:b w:val="0"/>
-              </w:rPr>
-              <w:t>______</w:t>
+            <w:tcW w:type="dxa" w:w="840"/>
+            <w:vAlign w:val="center"/>
+            <w:tcMar>
+              <w:top w:w="40" w:type="dxa"/>
+              <w:start w:w="90" w:type="dxa"/>
+              <w:bottom w:w="40" w:type="dxa"/>
+              <w:end w:w="90" w:type="dxa"/>
+            </w:tcMar>
+          </w:tcPr>
+          <w:p>
+            <w:pPr>
+              <w:spacing w:after="0"/>
+            </w:pPr>
+            <w:r>
+              <w:rPr>
+                <w:rFonts w:ascii="Arial" w:hAnsi="Arial"/>
+                <w:b w:val="0"/>
+              </w:rPr>
+              <w:t>Physical Demand — How physically demanding was this block?</w:t>
+            </w:r>
+          </w:p>
+        </w:tc>
+        <w:tc>
+          <w:tcPr>
+            <w:tcW w:type="dxa" w:w="840"/>
+            <w:vAlign w:val="center"/>
+            <w:tcMar>
+              <w:top w:w="40" w:type="dxa"/>
+              <w:start w:w="90" w:type="dxa"/>
+              <w:bottom w:w="40" w:type="dxa"/>
+              <w:end w:w="90" w:type="dxa"/>
+            </w:tcMar>
+          </w:tcPr>
+          <w:p>
+            <w:pPr>
+              <w:spacing w:after="0"/>
+            </w:pPr>
+            <w:r>
+              <w:rPr>
+                <w:rFonts w:ascii="Arial" w:hAnsi="Arial"/>
+                <w:b w:val="0"/>
+              </w:rPr>
+              <w:t>☐</w:t>
+            </w:r>
+          </w:p>
+        </w:tc>
+        <w:tc>
+          <w:tcPr>
+            <w:tcW w:type="dxa" w:w="840"/>
+            <w:vAlign w:val="center"/>
+            <w:tcMar>
+              <w:top w:w="40" w:type="dxa"/>
+              <w:start w:w="90" w:type="dxa"/>
+              <w:bottom w:w="40" w:type="dxa"/>
+              <w:end w:w="90" w:type="dxa"/>
+            </w:tcMar>
+          </w:tcPr>
+          <w:p>
+            <w:pPr>
+              <w:spacing w:after="0"/>
+            </w:pPr>
+            <w:r>
+              <w:rPr>
+                <w:rFonts w:ascii="Arial" w:hAnsi="Arial"/>
+                <w:b w:val="0"/>
+              </w:rPr>
+              <w:t>☐</w:t>
+            </w:r>
+          </w:p>
+        </w:tc>
+        <w:tc>
+          <w:tcPr>
+            <w:tcW w:type="dxa" w:w="840"/>
+            <w:vAlign w:val="center"/>
+            <w:tcMar>
+              <w:top w:w="40" w:type="dxa"/>
+              <w:start w:w="90" w:type="dxa"/>
+              <w:bottom w:w="40" w:type="dxa"/>
+              <w:end w:w="90" w:type="dxa"/>
+            </w:tcMar>
+          </w:tcPr>
+          <w:p>
+            <w:pPr>
+              <w:spacing w:after="0"/>
+            </w:pPr>
+            <w:r>
+              <w:rPr>
+                <w:rFonts w:ascii="Arial" w:hAnsi="Arial"/>
+                <w:b w:val="0"/>
+              </w:rPr>
+              <w:t>☐</w:t>
+            </w:r>
+          </w:p>
+        </w:tc>
+        <w:tc>
+          <w:tcPr>
+            <w:tcW w:type="dxa" w:w="840"/>
+            <w:vAlign w:val="center"/>
+            <w:tcMar>
+              <w:top w:w="40" w:type="dxa"/>
+              <w:start w:w="90" w:type="dxa"/>
+              <w:bottom w:w="40" w:type="dxa"/>
+              <w:end w:w="90" w:type="dxa"/>
+            </w:tcMar>
+          </w:tcPr>
+          <w:p>
+            <w:pPr>
+              <w:spacing w:after="0"/>
+            </w:pPr>
+            <w:r>
+              <w:rPr>
+                <w:rFonts w:ascii="Arial" w:hAnsi="Arial"/>
+                <w:b w:val="0"/>
+              </w:rPr>
+              <w:t>☐</w:t>
+            </w:r>
+          </w:p>
+        </w:tc>
+        <w:tc>
+          <w:tcPr>
+            <w:tcW w:type="dxa" w:w="840"/>
+            <w:vAlign w:val="center"/>
+            <w:tcMar>
+              <w:top w:w="40" w:type="dxa"/>
+              <w:start w:w="90" w:type="dxa"/>
+              <w:bottom w:w="40" w:type="dxa"/>
+              <w:end w:w="90" w:type="dxa"/>
+            </w:tcMar>
+          </w:tcPr>
+          <w:p>
+            <w:pPr>
+              <w:spacing w:after="0"/>
+            </w:pPr>
+            <w:r>
+              <w:rPr>
+                <w:rFonts w:ascii="Arial" w:hAnsi="Arial"/>
+                <w:b w:val="0"/>
+              </w:rPr>
+              <w:t>☐</w:t>
+            </w:r>
+          </w:p>
+        </w:tc>
+        <w:tc>
+          <w:tcPr>
+            <w:tcW w:type="dxa" w:w="840"/>
+            <w:vAlign w:val="center"/>
+            <w:tcMar>
+              <w:top w:w="40" w:type="dxa"/>
+              <w:start w:w="90" w:type="dxa"/>
+              <w:bottom w:w="40" w:type="dxa"/>
+              <w:end w:w="90" w:type="dxa"/>
+            </w:tcMar>
+          </w:tcPr>
+          <w:p>
+            <w:pPr>
+              <w:spacing w:after="0"/>
+            </w:pPr>
+            <w:r>
+              <w:rPr>
+                <w:rFonts w:ascii="Arial" w:hAnsi="Arial"/>
+                <w:b w:val="0"/>
+              </w:rPr>
+              <w:t>☐</w:t>
+            </w:r>
+          </w:p>
+        </w:tc>
+        <w:tc>
+          <w:tcPr>
+            <w:tcW w:type="dxa" w:w="840"/>
+            <w:vAlign w:val="center"/>
+            <w:tcMar>
+              <w:top w:w="40" w:type="dxa"/>
+              <w:start w:w="90" w:type="dxa"/>
+              <w:bottom w:w="40" w:type="dxa"/>
+              <w:end w:w="90" w:type="dxa"/>
+            </w:tcMar>
+          </w:tcPr>
+          <w:p>
+            <w:pPr>
+              <w:spacing w:after="0"/>
+            </w:pPr>
+            <w:r>
+              <w:rPr>
+                <w:rFonts w:ascii="Arial" w:hAnsi="Arial"/>
+                <w:b w:val="0"/>
+              </w:rPr>
+              <w:t>☐</w:t>
+            </w:r>
+          </w:p>
+        </w:tc>
+        <w:tc>
+          <w:tcPr>
+            <w:tcW w:type="dxa" w:w="840"/>
+            <w:vAlign w:val="center"/>
+            <w:tcMar>
+              <w:top w:w="40" w:type="dxa"/>
+              <w:start w:w="90" w:type="dxa"/>
+              <w:bottom w:w="40" w:type="dxa"/>
+              <w:end w:w="90" w:type="dxa"/>
+            </w:tcMar>
+          </w:tcPr>
+          <w:p>
+            <w:pPr>
+              <w:spacing w:after="0"/>
+            </w:pPr>
+            <w:r>
+              <w:rPr>
+                <w:rFonts w:ascii="Arial" w:hAnsi="Arial"/>
+                <w:b w:val="0"/>
+              </w:rPr>
+              <w:t>☐</w:t>
+            </w:r>
+          </w:p>
+        </w:tc>
+        <w:tc>
+          <w:tcPr>
+            <w:tcW w:type="dxa" w:w="840"/>
+            <w:vAlign w:val="center"/>
+            <w:tcMar>
+              <w:top w:w="40" w:type="dxa"/>
+              <w:start w:w="90" w:type="dxa"/>
+              <w:bottom w:w="40" w:type="dxa"/>
+              <w:end w:w="90" w:type="dxa"/>
+            </w:tcMar>
+          </w:tcPr>
+          <w:p>
+            <w:pPr>
+              <w:spacing w:after="0"/>
+            </w:pPr>
+            <w:r>
+              <w:rPr>
+                <w:rFonts w:ascii="Arial" w:hAnsi="Arial"/>
+                <w:b w:val="0"/>
+              </w:rPr>
+              <w:t>☐</w:t>
+            </w:r>
+          </w:p>
+        </w:tc>
+        <w:tc>
+          <w:tcPr>
+            <w:tcW w:type="dxa" w:w="840"/>
+            <w:vAlign w:val="center"/>
+            <w:tcMar>
+              <w:top w:w="40" w:type="dxa"/>
+              <w:start w:w="90" w:type="dxa"/>
+              <w:bottom w:w="40" w:type="dxa"/>
+              <w:end w:w="90" w:type="dxa"/>
+            </w:tcMar>
+          </w:tcPr>
+          <w:p>
+            <w:pPr>
+              <w:spacing w:after="0"/>
+            </w:pPr>
+            <w:r>
+              <w:rPr>
+                <w:rFonts w:ascii="Arial" w:hAnsi="Arial"/>
+                <w:b w:val="0"/>
+              </w:rPr>
+              <w:t>☐</w:t>
+            </w:r>
+          </w:p>
+        </w:tc>
+        <w:tc>
+          <w:tcPr>
+            <w:tcW w:type="dxa" w:w="840"/>
+            <w:vAlign w:val="center"/>
+            <w:tcMar>
+              <w:top w:w="40" w:type="dxa"/>
+              <w:start w:w="90" w:type="dxa"/>
+              <w:bottom w:w="40" w:type="dxa"/>
+              <w:end w:w="90" w:type="dxa"/>
+            </w:tcMar>
+          </w:tcPr>
+          <w:p>
+            <w:pPr>
+              <w:spacing w:after="0"/>
+            </w:pPr>
+            <w:r>
+              <w:rPr>
+                <w:rFonts w:ascii="Arial" w:hAnsi="Arial"/>
+                <w:b w:val="0"/>
+              </w:rPr>
+              <w:t>☐</w:t>
             </w:r>
           </w:p>
         </w:tc>
@@ -565,73 +1231,289 @@
         </w:trPr>
         <w:tc>
           <w:tcPr>
-            <w:tcW w:type="dxa" w:w="3360"/>
-            <w:vAlign w:val="center"/>
-            <w:tcMar>
-              <w:top w:w="40" w:type="dxa"/>
-              <w:start w:w="90" w:type="dxa"/>
-              <w:bottom w:w="40" w:type="dxa"/>
-              <w:end w:w="90" w:type="dxa"/>
-            </w:tcMar>
-          </w:tcPr>
-          <w:p>
-            <w:pPr>
-              <w:spacing w:after="0"/>
-            </w:pPr>
-            <w:r>
-              <w:rPr>
-                <w:rFonts w:ascii="Arial" w:hAnsi="Arial"/>
-                <w:b w:val="0"/>
-              </w:rPr>
-              <w:t>Temporal demand</w:t>
-            </w:r>
-          </w:p>
-        </w:tc>
-        <w:tc>
-          <w:tcPr>
-            <w:tcW w:type="dxa" w:w="3360"/>
-            <w:vAlign w:val="center"/>
-            <w:tcMar>
-              <w:top w:w="40" w:type="dxa"/>
-              <w:start w:w="90" w:type="dxa"/>
-              <w:bottom w:w="40" w:type="dxa"/>
-              <w:end w:w="90" w:type="dxa"/>
-            </w:tcMar>
-          </w:tcPr>
-          <w:p>
-            <w:pPr>
-              <w:spacing w:after="0"/>
-            </w:pPr>
-            <w:r>
-              <w:rPr>
-                <w:rFonts w:ascii="Arial" w:hAnsi="Arial"/>
-                <w:b w:val="0"/>
-              </w:rPr>
-              <w:t>How hurried or rushed did the pace feel?</w:t>
-            </w:r>
-          </w:p>
-        </w:tc>
-        <w:tc>
-          <w:tcPr>
-            <w:tcW w:type="dxa" w:w="3360"/>
-            <w:vAlign w:val="center"/>
-            <w:tcMar>
-              <w:top w:w="40" w:type="dxa"/>
-              <w:start w:w="90" w:type="dxa"/>
-              <w:bottom w:w="40" w:type="dxa"/>
-              <w:end w:w="90" w:type="dxa"/>
-            </w:tcMar>
-          </w:tcPr>
-          <w:p>
-            <w:pPr>
-              <w:spacing w:after="0"/>
-            </w:pPr>
-            <w:r>
-              <w:rPr>
-                <w:rFonts w:ascii="Arial" w:hAnsi="Arial"/>
-                <w:b w:val="0"/>
-              </w:rPr>
-              <w:t>______</w:t>
+            <w:tcW w:type="dxa" w:w="840"/>
+            <w:vAlign w:val="center"/>
+            <w:tcMar>
+              <w:top w:w="40" w:type="dxa"/>
+              <w:start w:w="90" w:type="dxa"/>
+              <w:bottom w:w="40" w:type="dxa"/>
+              <w:end w:w="90" w:type="dxa"/>
+            </w:tcMar>
+          </w:tcPr>
+          <w:p>
+            <w:pPr>
+              <w:spacing w:after="0"/>
+            </w:pPr>
+            <w:r>
+              <w:rPr>
+                <w:rFonts w:ascii="Arial" w:hAnsi="Arial"/>
+                <w:b w:val="0"/>
+              </w:rPr>
+              <w:t>Temporal Demand — How hurried or rushed did you feel during this block?</w:t>
+            </w:r>
+          </w:p>
+        </w:tc>
+        <w:tc>
+          <w:tcPr>
+            <w:tcW w:type="dxa" w:w="840"/>
+            <w:vAlign w:val="center"/>
+            <w:tcMar>
+              <w:top w:w="40" w:type="dxa"/>
+              <w:start w:w="90" w:type="dxa"/>
+              <w:bottom w:w="40" w:type="dxa"/>
+              <w:end w:w="90" w:type="dxa"/>
+            </w:tcMar>
+          </w:tcPr>
+          <w:p>
+            <w:pPr>
+              <w:spacing w:after="0"/>
+            </w:pPr>
+            <w:r>
+              <w:rPr>
+                <w:rFonts w:ascii="Arial" w:hAnsi="Arial"/>
+                <w:b w:val="0"/>
+              </w:rPr>
+              <w:t>☐</w:t>
+            </w:r>
+          </w:p>
+        </w:tc>
+        <w:tc>
+          <w:tcPr>
+            <w:tcW w:type="dxa" w:w="840"/>
+            <w:vAlign w:val="center"/>
+            <w:tcMar>
+              <w:top w:w="40" w:type="dxa"/>
+              <w:start w:w="90" w:type="dxa"/>
+              <w:bottom w:w="40" w:type="dxa"/>
+              <w:end w:w="90" w:type="dxa"/>
+            </w:tcMar>
+          </w:tcPr>
+          <w:p>
+            <w:pPr>
+              <w:spacing w:after="0"/>
+            </w:pPr>
+            <w:r>
+              <w:rPr>
+                <w:rFonts w:ascii="Arial" w:hAnsi="Arial"/>
+                <w:b w:val="0"/>
+              </w:rPr>
+              <w:t>☐</w:t>
+            </w:r>
+          </w:p>
+        </w:tc>
+        <w:tc>
+          <w:tcPr>
+            <w:tcW w:type="dxa" w:w="840"/>
+            <w:vAlign w:val="center"/>
+            <w:tcMar>
+              <w:top w:w="40" w:type="dxa"/>
+              <w:start w:w="90" w:type="dxa"/>
+              <w:bottom w:w="40" w:type="dxa"/>
+              <w:end w:w="90" w:type="dxa"/>
+            </w:tcMar>
+          </w:tcPr>
+          <w:p>
+            <w:pPr>
+              <w:spacing w:after="0"/>
+            </w:pPr>
+            <w:r>
+              <w:rPr>
+                <w:rFonts w:ascii="Arial" w:hAnsi="Arial"/>
+                <w:b w:val="0"/>
+              </w:rPr>
+              <w:t>☐</w:t>
+            </w:r>
+          </w:p>
+        </w:tc>
+        <w:tc>
+          <w:tcPr>
+            <w:tcW w:type="dxa" w:w="840"/>
+            <w:vAlign w:val="center"/>
+            <w:tcMar>
+              <w:top w:w="40" w:type="dxa"/>
+              <w:start w:w="90" w:type="dxa"/>
+              <w:bottom w:w="40" w:type="dxa"/>
+              <w:end w:w="90" w:type="dxa"/>
+            </w:tcMar>
+          </w:tcPr>
+          <w:p>
+            <w:pPr>
+              <w:spacing w:after="0"/>
+            </w:pPr>
+            <w:r>
+              <w:rPr>
+                <w:rFonts w:ascii="Arial" w:hAnsi="Arial"/>
+                <w:b w:val="0"/>
+              </w:rPr>
+              <w:t>☐</w:t>
+            </w:r>
+          </w:p>
+        </w:tc>
+        <w:tc>
+          <w:tcPr>
+            <w:tcW w:type="dxa" w:w="840"/>
+            <w:vAlign w:val="center"/>
+            <w:tcMar>
+              <w:top w:w="40" w:type="dxa"/>
+              <w:start w:w="90" w:type="dxa"/>
+              <w:bottom w:w="40" w:type="dxa"/>
+              <w:end w:w="90" w:type="dxa"/>
+            </w:tcMar>
+          </w:tcPr>
+          <w:p>
+            <w:pPr>
+              <w:spacing w:after="0"/>
+            </w:pPr>
+            <w:r>
+              <w:rPr>
+                <w:rFonts w:ascii="Arial" w:hAnsi="Arial"/>
+                <w:b w:val="0"/>
+              </w:rPr>
+              <w:t>☐</w:t>
+            </w:r>
+          </w:p>
+        </w:tc>
+        <w:tc>
+          <w:tcPr>
+            <w:tcW w:type="dxa" w:w="840"/>
+            <w:vAlign w:val="center"/>
+            <w:tcMar>
+              <w:top w:w="40" w:type="dxa"/>
+              <w:start w:w="90" w:type="dxa"/>
+              <w:bottom w:w="40" w:type="dxa"/>
+              <w:end w:w="90" w:type="dxa"/>
+            </w:tcMar>
+          </w:tcPr>
+          <w:p>
+            <w:pPr>
+              <w:spacing w:after="0"/>
+            </w:pPr>
+            <w:r>
+              <w:rPr>
+                <w:rFonts w:ascii="Arial" w:hAnsi="Arial"/>
+                <w:b w:val="0"/>
+              </w:rPr>
+              <w:t>☐</w:t>
+            </w:r>
+          </w:p>
+        </w:tc>
+        <w:tc>
+          <w:tcPr>
+            <w:tcW w:type="dxa" w:w="840"/>
+            <w:vAlign w:val="center"/>
+            <w:tcMar>
+              <w:top w:w="40" w:type="dxa"/>
+              <w:start w:w="90" w:type="dxa"/>
+              <w:bottom w:w="40" w:type="dxa"/>
+              <w:end w:w="90" w:type="dxa"/>
+            </w:tcMar>
+          </w:tcPr>
+          <w:p>
+            <w:pPr>
+              <w:spacing w:after="0"/>
+            </w:pPr>
+            <w:r>
+              <w:rPr>
+                <w:rFonts w:ascii="Arial" w:hAnsi="Arial"/>
+                <w:b w:val="0"/>
+              </w:rPr>
+              <w:t>☐</w:t>
+            </w:r>
+          </w:p>
+        </w:tc>
+        <w:tc>
+          <w:tcPr>
+            <w:tcW w:type="dxa" w:w="840"/>
+            <w:vAlign w:val="center"/>
+            <w:tcMar>
+              <w:top w:w="40" w:type="dxa"/>
+              <w:start w:w="90" w:type="dxa"/>
+              <w:bottom w:w="40" w:type="dxa"/>
+              <w:end w:w="90" w:type="dxa"/>
+            </w:tcMar>
+          </w:tcPr>
+          <w:p>
+            <w:pPr>
+              <w:spacing w:after="0"/>
+            </w:pPr>
+            <w:r>
+              <w:rPr>
+                <w:rFonts w:ascii="Arial" w:hAnsi="Arial"/>
+                <w:b w:val="0"/>
+              </w:rPr>
+              <w:t>☐</w:t>
+            </w:r>
+          </w:p>
+        </w:tc>
+        <w:tc>
+          <w:tcPr>
+            <w:tcW w:type="dxa" w:w="840"/>
+            <w:vAlign w:val="center"/>
+            <w:tcMar>
+              <w:top w:w="40" w:type="dxa"/>
+              <w:start w:w="90" w:type="dxa"/>
+              <w:bottom w:w="40" w:type="dxa"/>
+              <w:end w:w="90" w:type="dxa"/>
+            </w:tcMar>
+          </w:tcPr>
+          <w:p>
+            <w:pPr>
+              <w:spacing w:after="0"/>
+            </w:pPr>
+            <w:r>
+              <w:rPr>
+                <w:rFonts w:ascii="Arial" w:hAnsi="Arial"/>
+                <w:b w:val="0"/>
+              </w:rPr>
+              <w:t>☐</w:t>
+            </w:r>
+          </w:p>
+        </w:tc>
+        <w:tc>
+          <w:tcPr>
+            <w:tcW w:type="dxa" w:w="840"/>
+            <w:vAlign w:val="center"/>
+            <w:tcMar>
+              <w:top w:w="40" w:type="dxa"/>
+              <w:start w:w="90" w:type="dxa"/>
+              <w:bottom w:w="40" w:type="dxa"/>
+              <w:end w:w="90" w:type="dxa"/>
+            </w:tcMar>
+          </w:tcPr>
+          <w:p>
+            <w:pPr>
+              <w:spacing w:after="0"/>
+            </w:pPr>
+            <w:r>
+              <w:rPr>
+                <w:rFonts w:ascii="Arial" w:hAnsi="Arial"/>
+                <w:b w:val="0"/>
+              </w:rPr>
+              <w:t>☐</w:t>
+            </w:r>
+          </w:p>
+        </w:tc>
+        <w:tc>
+          <w:tcPr>
+            <w:tcW w:type="dxa" w:w="840"/>
+            <w:vAlign w:val="center"/>
+            <w:tcMar>
+              <w:top w:w="40" w:type="dxa"/>
+              <w:start w:w="90" w:type="dxa"/>
+              <w:bottom w:w="40" w:type="dxa"/>
+              <w:end w:w="90" w:type="dxa"/>
+            </w:tcMar>
+          </w:tcPr>
+          <w:p>
+            <w:pPr>
+              <w:spacing w:after="0"/>
+            </w:pPr>
+            <w:r>
+              <w:rPr>
+                <w:rFonts w:ascii="Arial" w:hAnsi="Arial"/>
+                <w:b w:val="0"/>
+              </w:rPr>
+              <w:t>☐</w:t>
             </w:r>
           </w:p>
         </w:tc>
@@ -642,73 +1524,289 @@
         </w:trPr>
         <w:tc>
           <w:tcPr>
-            <w:tcW w:type="dxa" w:w="3360"/>
-            <w:vAlign w:val="center"/>
-            <w:tcMar>
-              <w:top w:w="40" w:type="dxa"/>
-              <w:start w:w="90" w:type="dxa"/>
-              <w:bottom w:w="40" w:type="dxa"/>
-              <w:end w:w="90" w:type="dxa"/>
-            </w:tcMar>
-          </w:tcPr>
-          <w:p>
-            <w:pPr>
-              <w:spacing w:after="0"/>
-            </w:pPr>
-            <w:r>
-              <w:rPr>
-                <w:rFonts w:ascii="Arial" w:hAnsi="Arial"/>
-                <w:b w:val="0"/>
-              </w:rPr>
-              <w:t>Performance</w:t>
-            </w:r>
-          </w:p>
-        </w:tc>
-        <w:tc>
-          <w:tcPr>
-            <w:tcW w:type="dxa" w:w="3360"/>
-            <w:vAlign w:val="center"/>
-            <w:tcMar>
-              <w:top w:w="40" w:type="dxa"/>
-              <w:start w:w="90" w:type="dxa"/>
-              <w:bottom w:w="40" w:type="dxa"/>
-              <w:end w:w="90" w:type="dxa"/>
-            </w:tcMar>
-          </w:tcPr>
-          <w:p>
-            <w:pPr>
-              <w:spacing w:after="0"/>
-            </w:pPr>
-            <w:r>
-              <w:rPr>
-                <w:rFonts w:ascii="Arial" w:hAnsi="Arial"/>
-                <w:b w:val="0"/>
-              </w:rPr>
-              <w:t>How successful were you in accomplishing what you were asked to do? 0 = perfect, 100 = failure.</w:t>
-            </w:r>
-          </w:p>
-        </w:tc>
-        <w:tc>
-          <w:tcPr>
-            <w:tcW w:type="dxa" w:w="3360"/>
-            <w:vAlign w:val="center"/>
-            <w:tcMar>
-              <w:top w:w="40" w:type="dxa"/>
-              <w:start w:w="90" w:type="dxa"/>
-              <w:bottom w:w="40" w:type="dxa"/>
-              <w:end w:w="90" w:type="dxa"/>
-            </w:tcMar>
-          </w:tcPr>
-          <w:p>
-            <w:pPr>
-              <w:spacing w:after="0"/>
-            </w:pPr>
-            <w:r>
-              <w:rPr>
-                <w:rFonts w:ascii="Arial" w:hAnsi="Arial"/>
-                <w:b w:val="0"/>
-              </w:rPr>
-              <w:t>______</w:t>
+            <w:tcW w:type="dxa" w:w="840"/>
+            <w:vAlign w:val="center"/>
+            <w:tcMar>
+              <w:top w:w="40" w:type="dxa"/>
+              <w:start w:w="90" w:type="dxa"/>
+              <w:bottom w:w="40" w:type="dxa"/>
+              <w:end w:w="90" w:type="dxa"/>
+            </w:tcMar>
+          </w:tcPr>
+          <w:p>
+            <w:pPr>
+              <w:spacing w:after="0"/>
+            </w:pPr>
+            <w:r>
+              <w:rPr>
+                <w:rFonts w:ascii="Arial" w:hAnsi="Arial"/>
+                <w:b w:val="0"/>
+              </w:rPr>
+              <w:t>Performance — How unsuccessful were you in accomplishing the task? (0 = perfect, 10 = failure)</w:t>
+            </w:r>
+          </w:p>
+        </w:tc>
+        <w:tc>
+          <w:tcPr>
+            <w:tcW w:type="dxa" w:w="840"/>
+            <w:vAlign w:val="center"/>
+            <w:tcMar>
+              <w:top w:w="40" w:type="dxa"/>
+              <w:start w:w="90" w:type="dxa"/>
+              <w:bottom w:w="40" w:type="dxa"/>
+              <w:end w:w="90" w:type="dxa"/>
+            </w:tcMar>
+          </w:tcPr>
+          <w:p>
+            <w:pPr>
+              <w:spacing w:after="0"/>
+            </w:pPr>
+            <w:r>
+              <w:rPr>
+                <w:rFonts w:ascii="Arial" w:hAnsi="Arial"/>
+                <w:b w:val="0"/>
+              </w:rPr>
+              <w:t>☐</w:t>
+            </w:r>
+          </w:p>
+        </w:tc>
+        <w:tc>
+          <w:tcPr>
+            <w:tcW w:type="dxa" w:w="840"/>
+            <w:vAlign w:val="center"/>
+            <w:tcMar>
+              <w:top w:w="40" w:type="dxa"/>
+              <w:start w:w="90" w:type="dxa"/>
+              <w:bottom w:w="40" w:type="dxa"/>
+              <w:end w:w="90" w:type="dxa"/>
+            </w:tcMar>
+          </w:tcPr>
+          <w:p>
+            <w:pPr>
+              <w:spacing w:after="0"/>
+            </w:pPr>
+            <w:r>
+              <w:rPr>
+                <w:rFonts w:ascii="Arial" w:hAnsi="Arial"/>
+                <w:b w:val="0"/>
+              </w:rPr>
+              <w:t>☐</w:t>
+            </w:r>
+          </w:p>
+        </w:tc>
+        <w:tc>
+          <w:tcPr>
+            <w:tcW w:type="dxa" w:w="840"/>
+            <w:vAlign w:val="center"/>
+            <w:tcMar>
+              <w:top w:w="40" w:type="dxa"/>
+              <w:start w:w="90" w:type="dxa"/>
+              <w:bottom w:w="40" w:type="dxa"/>
+              <w:end w:w="90" w:type="dxa"/>
+            </w:tcMar>
+          </w:tcPr>
+          <w:p>
+            <w:pPr>
+              <w:spacing w:after="0"/>
+            </w:pPr>
+            <w:r>
+              <w:rPr>
+                <w:rFonts w:ascii="Arial" w:hAnsi="Arial"/>
+                <w:b w:val="0"/>
+              </w:rPr>
+              <w:t>☐</w:t>
+            </w:r>
+          </w:p>
+        </w:tc>
+        <w:tc>
+          <w:tcPr>
+            <w:tcW w:type="dxa" w:w="840"/>
+            <w:vAlign w:val="center"/>
+            <w:tcMar>
+              <w:top w:w="40" w:type="dxa"/>
+              <w:start w:w="90" w:type="dxa"/>
+              <w:bottom w:w="40" w:type="dxa"/>
+              <w:end w:w="90" w:type="dxa"/>
+            </w:tcMar>
+          </w:tcPr>
+          <w:p>
+            <w:pPr>
+              <w:spacing w:after="0"/>
+            </w:pPr>
+            <w:r>
+              <w:rPr>
+                <w:rFonts w:ascii="Arial" w:hAnsi="Arial"/>
+                <w:b w:val="0"/>
+              </w:rPr>
+              <w:t>☐</w:t>
+            </w:r>
+          </w:p>
+        </w:tc>
+        <w:tc>
+          <w:tcPr>
+            <w:tcW w:type="dxa" w:w="840"/>
+            <w:vAlign w:val="center"/>
+            <w:tcMar>
+              <w:top w:w="40" w:type="dxa"/>
+              <w:start w:w="90" w:type="dxa"/>
+              <w:bottom w:w="40" w:type="dxa"/>
+              <w:end w:w="90" w:type="dxa"/>
+            </w:tcMar>
+          </w:tcPr>
+          <w:p>
+            <w:pPr>
+              <w:spacing w:after="0"/>
+            </w:pPr>
+            <w:r>
+              <w:rPr>
+                <w:rFonts w:ascii="Arial" w:hAnsi="Arial"/>
+                <w:b w:val="0"/>
+              </w:rPr>
+              <w:t>☐</w:t>
+            </w:r>
+          </w:p>
+        </w:tc>
+        <w:tc>
+          <w:tcPr>
+            <w:tcW w:type="dxa" w:w="840"/>
+            <w:vAlign w:val="center"/>
+            <w:tcMar>
+              <w:top w:w="40" w:type="dxa"/>
+              <w:start w:w="90" w:type="dxa"/>
+              <w:bottom w:w="40" w:type="dxa"/>
+              <w:end w:w="90" w:type="dxa"/>
+            </w:tcMar>
+          </w:tcPr>
+          <w:p>
+            <w:pPr>
+              <w:spacing w:after="0"/>
+            </w:pPr>
+            <w:r>
+              <w:rPr>
+                <w:rFonts w:ascii="Arial" w:hAnsi="Arial"/>
+                <w:b w:val="0"/>
+              </w:rPr>
+              <w:t>☐</w:t>
+            </w:r>
+          </w:p>
+        </w:tc>
+        <w:tc>
+          <w:tcPr>
+            <w:tcW w:type="dxa" w:w="840"/>
+            <w:vAlign w:val="center"/>
+            <w:tcMar>
+              <w:top w:w="40" w:type="dxa"/>
+              <w:start w:w="90" w:type="dxa"/>
+              <w:bottom w:w="40" w:type="dxa"/>
+              <w:end w:w="90" w:type="dxa"/>
+            </w:tcMar>
+          </w:tcPr>
+          <w:p>
+            <w:pPr>
+              <w:spacing w:after="0"/>
+            </w:pPr>
+            <w:r>
+              <w:rPr>
+                <w:rFonts w:ascii="Arial" w:hAnsi="Arial"/>
+                <w:b w:val="0"/>
+              </w:rPr>
+              <w:t>☐</w:t>
+            </w:r>
+          </w:p>
+        </w:tc>
+        <w:tc>
+          <w:tcPr>
+            <w:tcW w:type="dxa" w:w="840"/>
+            <w:vAlign w:val="center"/>
+            <w:tcMar>
+              <w:top w:w="40" w:type="dxa"/>
+              <w:start w:w="90" w:type="dxa"/>
+              <w:bottom w:w="40" w:type="dxa"/>
+              <w:end w:w="90" w:type="dxa"/>
+            </w:tcMar>
+          </w:tcPr>
+          <w:p>
+            <w:pPr>
+              <w:spacing w:after="0"/>
+            </w:pPr>
+            <w:r>
+              <w:rPr>
+                <w:rFonts w:ascii="Arial" w:hAnsi="Arial"/>
+                <w:b w:val="0"/>
+              </w:rPr>
+              <w:t>☐</w:t>
+            </w:r>
+          </w:p>
+        </w:tc>
+        <w:tc>
+          <w:tcPr>
+            <w:tcW w:type="dxa" w:w="840"/>
+            <w:vAlign w:val="center"/>
+            <w:tcMar>
+              <w:top w:w="40" w:type="dxa"/>
+              <w:start w:w="90" w:type="dxa"/>
+              <w:bottom w:w="40" w:type="dxa"/>
+              <w:end w:w="90" w:type="dxa"/>
+            </w:tcMar>
+          </w:tcPr>
+          <w:p>
+            <w:pPr>
+              <w:spacing w:after="0"/>
+            </w:pPr>
+            <w:r>
+              <w:rPr>
+                <w:rFonts w:ascii="Arial" w:hAnsi="Arial"/>
+                <w:b w:val="0"/>
+              </w:rPr>
+              <w:t>☐</w:t>
+            </w:r>
+          </w:p>
+        </w:tc>
+        <w:tc>
+          <w:tcPr>
+            <w:tcW w:type="dxa" w:w="840"/>
+            <w:vAlign w:val="center"/>
+            <w:tcMar>
+              <w:top w:w="40" w:type="dxa"/>
+              <w:start w:w="90" w:type="dxa"/>
+              <w:bottom w:w="40" w:type="dxa"/>
+              <w:end w:w="90" w:type="dxa"/>
+            </w:tcMar>
+          </w:tcPr>
+          <w:p>
+            <w:pPr>
+              <w:spacing w:after="0"/>
+            </w:pPr>
+            <w:r>
+              <w:rPr>
+                <w:rFonts w:ascii="Arial" w:hAnsi="Arial"/>
+                <w:b w:val="0"/>
+              </w:rPr>
+              <w:t>☐</w:t>
+            </w:r>
+          </w:p>
+        </w:tc>
+        <w:tc>
+          <w:tcPr>
+            <w:tcW w:type="dxa" w:w="840"/>
+            <w:vAlign w:val="center"/>
+            <w:tcMar>
+              <w:top w:w="40" w:type="dxa"/>
+              <w:start w:w="90" w:type="dxa"/>
+              <w:bottom w:w="40" w:type="dxa"/>
+              <w:end w:w="90" w:type="dxa"/>
+            </w:tcMar>
+          </w:tcPr>
+          <w:p>
+            <w:pPr>
+              <w:spacing w:after="0"/>
+            </w:pPr>
+            <w:r>
+              <w:rPr>
+                <w:rFonts w:ascii="Arial" w:hAnsi="Arial"/>
+                <w:b w:val="0"/>
+              </w:rPr>
+              <w:t>☐</w:t>
             </w:r>
           </w:p>
         </w:tc>
@@ -719,73 +1817,289 @@
         </w:trPr>
         <w:tc>
           <w:tcPr>
-            <w:tcW w:type="dxa" w:w="3360"/>
-            <w:vAlign w:val="center"/>
-            <w:tcMar>
-              <w:top w:w="40" w:type="dxa"/>
-              <w:start w:w="90" w:type="dxa"/>
-              <w:bottom w:w="40" w:type="dxa"/>
-              <w:end w:w="90" w:type="dxa"/>
-            </w:tcMar>
-          </w:tcPr>
-          <w:p>
-            <w:pPr>
-              <w:spacing w:after="0"/>
-            </w:pPr>
-            <w:r>
-              <w:rPr>
-                <w:rFonts w:ascii="Arial" w:hAnsi="Arial"/>
-                <w:b w:val="0"/>
-              </w:rPr>
-              <w:t>Effort</w:t>
-            </w:r>
-          </w:p>
-        </w:tc>
-        <w:tc>
-          <w:tcPr>
-            <w:tcW w:type="dxa" w:w="3360"/>
-            <w:vAlign w:val="center"/>
-            <w:tcMar>
-              <w:top w:w="40" w:type="dxa"/>
-              <w:start w:w="90" w:type="dxa"/>
-              <w:bottom w:w="40" w:type="dxa"/>
-              <w:end w:w="90" w:type="dxa"/>
-            </w:tcMar>
-          </w:tcPr>
-          <w:p>
-            <w:pPr>
-              <w:spacing w:after="0"/>
-            </w:pPr>
-            <w:r>
-              <w:rPr>
-                <w:rFonts w:ascii="Arial" w:hAnsi="Arial"/>
-                <w:b w:val="0"/>
-              </w:rPr>
-              <w:t>How hard did you have to work to accomplish your level of performance?</w:t>
-            </w:r>
-          </w:p>
-        </w:tc>
-        <w:tc>
-          <w:tcPr>
-            <w:tcW w:type="dxa" w:w="3360"/>
-            <w:vAlign w:val="center"/>
-            <w:tcMar>
-              <w:top w:w="40" w:type="dxa"/>
-              <w:start w:w="90" w:type="dxa"/>
-              <w:bottom w:w="40" w:type="dxa"/>
-              <w:end w:w="90" w:type="dxa"/>
-            </w:tcMar>
-          </w:tcPr>
-          <w:p>
-            <w:pPr>
-              <w:spacing w:after="0"/>
-            </w:pPr>
-            <w:r>
-              <w:rPr>
-                <w:rFonts w:ascii="Arial" w:hAnsi="Arial"/>
-                <w:b w:val="0"/>
-              </w:rPr>
-              <w:t>______</w:t>
+            <w:tcW w:type="dxa" w:w="840"/>
+            <w:vAlign w:val="center"/>
+            <w:tcMar>
+              <w:top w:w="40" w:type="dxa"/>
+              <w:start w:w="90" w:type="dxa"/>
+              <w:bottom w:w="40" w:type="dxa"/>
+              <w:end w:w="90" w:type="dxa"/>
+            </w:tcMar>
+          </w:tcPr>
+          <w:p>
+            <w:pPr>
+              <w:spacing w:after="0"/>
+            </w:pPr>
+            <w:r>
+              <w:rPr>
+                <w:rFonts w:ascii="Arial" w:hAnsi="Arial"/>
+                <w:b w:val="0"/>
+              </w:rPr>
+              <w:t>Effort — How hard did you have to work to achieve your level of performance?</w:t>
+            </w:r>
+          </w:p>
+        </w:tc>
+        <w:tc>
+          <w:tcPr>
+            <w:tcW w:type="dxa" w:w="840"/>
+            <w:vAlign w:val="center"/>
+            <w:tcMar>
+              <w:top w:w="40" w:type="dxa"/>
+              <w:start w:w="90" w:type="dxa"/>
+              <w:bottom w:w="40" w:type="dxa"/>
+              <w:end w:w="90" w:type="dxa"/>
+            </w:tcMar>
+          </w:tcPr>
+          <w:p>
+            <w:pPr>
+              <w:spacing w:after="0"/>
+            </w:pPr>
+            <w:r>
+              <w:rPr>
+                <w:rFonts w:ascii="Arial" w:hAnsi="Arial"/>
+                <w:b w:val="0"/>
+              </w:rPr>
+              <w:t>☐</w:t>
+            </w:r>
+          </w:p>
+        </w:tc>
+        <w:tc>
+          <w:tcPr>
+            <w:tcW w:type="dxa" w:w="840"/>
+            <w:vAlign w:val="center"/>
+            <w:tcMar>
+              <w:top w:w="40" w:type="dxa"/>
+              <w:start w:w="90" w:type="dxa"/>
+              <w:bottom w:w="40" w:type="dxa"/>
+              <w:end w:w="90" w:type="dxa"/>
+            </w:tcMar>
+          </w:tcPr>
+          <w:p>
+            <w:pPr>
+              <w:spacing w:after="0"/>
+            </w:pPr>
+            <w:r>
+              <w:rPr>
+                <w:rFonts w:ascii="Arial" w:hAnsi="Arial"/>
+                <w:b w:val="0"/>
+              </w:rPr>
+              <w:t>☐</w:t>
+            </w:r>
+          </w:p>
+        </w:tc>
+        <w:tc>
+          <w:tcPr>
+            <w:tcW w:type="dxa" w:w="840"/>
+            <w:vAlign w:val="center"/>
+            <w:tcMar>
+              <w:top w:w="40" w:type="dxa"/>
+              <w:start w:w="90" w:type="dxa"/>
+              <w:bottom w:w="40" w:type="dxa"/>
+              <w:end w:w="90" w:type="dxa"/>
+            </w:tcMar>
+          </w:tcPr>
+          <w:p>
+            <w:pPr>
+              <w:spacing w:after="0"/>
+            </w:pPr>
+            <w:r>
+              <w:rPr>
+                <w:rFonts w:ascii="Arial" w:hAnsi="Arial"/>
+                <w:b w:val="0"/>
+              </w:rPr>
+              <w:t>☐</w:t>
+            </w:r>
+          </w:p>
+        </w:tc>
+        <w:tc>
+          <w:tcPr>
+            <w:tcW w:type="dxa" w:w="840"/>
+            <w:vAlign w:val="center"/>
+            <w:tcMar>
+              <w:top w:w="40" w:type="dxa"/>
+              <w:start w:w="90" w:type="dxa"/>
+              <w:bottom w:w="40" w:type="dxa"/>
+              <w:end w:w="90" w:type="dxa"/>
+            </w:tcMar>
+          </w:tcPr>
+          <w:p>
+            <w:pPr>
+              <w:spacing w:after="0"/>
+            </w:pPr>
+            <w:r>
+              <w:rPr>
+                <w:rFonts w:ascii="Arial" w:hAnsi="Arial"/>
+                <w:b w:val="0"/>
+              </w:rPr>
+              <w:t>☐</w:t>
+            </w:r>
+          </w:p>
+        </w:tc>
+        <w:tc>
+          <w:tcPr>
+            <w:tcW w:type="dxa" w:w="840"/>
+            <w:vAlign w:val="center"/>
+            <w:tcMar>
+              <w:top w:w="40" w:type="dxa"/>
+              <w:start w:w="90" w:type="dxa"/>
+              <w:bottom w:w="40" w:type="dxa"/>
+              <w:end w:w="90" w:type="dxa"/>
+            </w:tcMar>
+          </w:tcPr>
+          <w:p>
+            <w:pPr>
+              <w:spacing w:after="0"/>
+            </w:pPr>
+            <w:r>
+              <w:rPr>
+                <w:rFonts w:ascii="Arial" w:hAnsi="Arial"/>
+                <w:b w:val="0"/>
+              </w:rPr>
+              <w:t>☐</w:t>
+            </w:r>
+          </w:p>
+        </w:tc>
+        <w:tc>
+          <w:tcPr>
+            <w:tcW w:type="dxa" w:w="840"/>
+            <w:vAlign w:val="center"/>
+            <w:tcMar>
+              <w:top w:w="40" w:type="dxa"/>
+              <w:start w:w="90" w:type="dxa"/>
+              <w:bottom w:w="40" w:type="dxa"/>
+              <w:end w:w="90" w:type="dxa"/>
+            </w:tcMar>
+          </w:tcPr>
+          <w:p>
+            <w:pPr>
+              <w:spacing w:after="0"/>
+            </w:pPr>
+            <w:r>
+              <w:rPr>
+                <w:rFonts w:ascii="Arial" w:hAnsi="Arial"/>
+                <w:b w:val="0"/>
+              </w:rPr>
+              <w:t>☐</w:t>
+            </w:r>
+          </w:p>
+        </w:tc>
+        <w:tc>
+          <w:tcPr>
+            <w:tcW w:type="dxa" w:w="840"/>
+            <w:vAlign w:val="center"/>
+            <w:tcMar>
+              <w:top w:w="40" w:type="dxa"/>
+              <w:start w:w="90" w:type="dxa"/>
+              <w:bottom w:w="40" w:type="dxa"/>
+              <w:end w:w="90" w:type="dxa"/>
+            </w:tcMar>
+          </w:tcPr>
+          <w:p>
+            <w:pPr>
+              <w:spacing w:after="0"/>
+            </w:pPr>
+            <w:r>
+              <w:rPr>
+                <w:rFonts w:ascii="Arial" w:hAnsi="Arial"/>
+                <w:b w:val="0"/>
+              </w:rPr>
+              <w:t>☐</w:t>
+            </w:r>
+          </w:p>
+        </w:tc>
+        <w:tc>
+          <w:tcPr>
+            <w:tcW w:type="dxa" w:w="840"/>
+            <w:vAlign w:val="center"/>
+            <w:tcMar>
+              <w:top w:w="40" w:type="dxa"/>
+              <w:start w:w="90" w:type="dxa"/>
+              <w:bottom w:w="40" w:type="dxa"/>
+              <w:end w:w="90" w:type="dxa"/>
+            </w:tcMar>
+          </w:tcPr>
+          <w:p>
+            <w:pPr>
+              <w:spacing w:after="0"/>
+            </w:pPr>
+            <w:r>
+              <w:rPr>
+                <w:rFonts w:ascii="Arial" w:hAnsi="Arial"/>
+                <w:b w:val="0"/>
+              </w:rPr>
+              <w:t>☐</w:t>
+            </w:r>
+          </w:p>
+        </w:tc>
+        <w:tc>
+          <w:tcPr>
+            <w:tcW w:type="dxa" w:w="840"/>
+            <w:vAlign w:val="center"/>
+            <w:tcMar>
+              <w:top w:w="40" w:type="dxa"/>
+              <w:start w:w="90" w:type="dxa"/>
+              <w:bottom w:w="40" w:type="dxa"/>
+              <w:end w:w="90" w:type="dxa"/>
+            </w:tcMar>
+          </w:tcPr>
+          <w:p>
+            <w:pPr>
+              <w:spacing w:after="0"/>
+            </w:pPr>
+            <w:r>
+              <w:rPr>
+                <w:rFonts w:ascii="Arial" w:hAnsi="Arial"/>
+                <w:b w:val="0"/>
+              </w:rPr>
+              <w:t>☐</w:t>
+            </w:r>
+          </w:p>
+        </w:tc>
+        <w:tc>
+          <w:tcPr>
+            <w:tcW w:type="dxa" w:w="840"/>
+            <w:vAlign w:val="center"/>
+            <w:tcMar>
+              <w:top w:w="40" w:type="dxa"/>
+              <w:start w:w="90" w:type="dxa"/>
+              <w:bottom w:w="40" w:type="dxa"/>
+              <w:end w:w="90" w:type="dxa"/>
+            </w:tcMar>
+          </w:tcPr>
+          <w:p>
+            <w:pPr>
+              <w:spacing w:after="0"/>
+            </w:pPr>
+            <w:r>
+              <w:rPr>
+                <w:rFonts w:ascii="Arial" w:hAnsi="Arial"/>
+                <w:b w:val="0"/>
+              </w:rPr>
+              <w:t>☐</w:t>
+            </w:r>
+          </w:p>
+        </w:tc>
+        <w:tc>
+          <w:tcPr>
+            <w:tcW w:type="dxa" w:w="840"/>
+            <w:vAlign w:val="center"/>
+            <w:tcMar>
+              <w:top w:w="40" w:type="dxa"/>
+              <w:start w:w="90" w:type="dxa"/>
+              <w:bottom w:w="40" w:type="dxa"/>
+              <w:end w:w="90" w:type="dxa"/>
+            </w:tcMar>
+          </w:tcPr>
+          <w:p>
+            <w:pPr>
+              <w:spacing w:after="0"/>
+            </w:pPr>
+            <w:r>
+              <w:rPr>
+                <w:rFonts w:ascii="Arial" w:hAnsi="Arial"/>
+                <w:b w:val="0"/>
+              </w:rPr>
+              <w:t>☐</w:t>
             </w:r>
           </w:p>
         </w:tc>
@@ -796,73 +2110,289 @@
         </w:trPr>
         <w:tc>
           <w:tcPr>
-            <w:tcW w:type="dxa" w:w="3360"/>
-            <w:vAlign w:val="center"/>
-            <w:tcMar>
-              <w:top w:w="40" w:type="dxa"/>
-              <w:start w:w="90" w:type="dxa"/>
-              <w:bottom w:w="40" w:type="dxa"/>
-              <w:end w:w="90" w:type="dxa"/>
-            </w:tcMar>
-          </w:tcPr>
-          <w:p>
-            <w:pPr>
-              <w:spacing w:after="0"/>
-            </w:pPr>
-            <w:r>
-              <w:rPr>
-                <w:rFonts w:ascii="Arial" w:hAnsi="Arial"/>
-                <w:b w:val="0"/>
-              </w:rPr>
-              <w:t>Frustration</w:t>
-            </w:r>
-          </w:p>
-        </w:tc>
-        <w:tc>
-          <w:tcPr>
-            <w:tcW w:type="dxa" w:w="3360"/>
-            <w:vAlign w:val="center"/>
-            <w:tcMar>
-              <w:top w:w="40" w:type="dxa"/>
-              <w:start w:w="90" w:type="dxa"/>
-              <w:bottom w:w="40" w:type="dxa"/>
-              <w:end w:w="90" w:type="dxa"/>
-            </w:tcMar>
-          </w:tcPr>
-          <w:p>
-            <w:pPr>
-              <w:spacing w:after="0"/>
-            </w:pPr>
-            <w:r>
-              <w:rPr>
-                <w:rFonts w:ascii="Arial" w:hAnsi="Arial"/>
-                <w:b w:val="0"/>
-              </w:rPr>
-              <w:t>How insecure, discouraged, irritated, stressed, and annoyed were you?</w:t>
-            </w:r>
-          </w:p>
-        </w:tc>
-        <w:tc>
-          <w:tcPr>
-            <w:tcW w:type="dxa" w:w="3360"/>
-            <w:vAlign w:val="center"/>
-            <w:tcMar>
-              <w:top w:w="40" w:type="dxa"/>
-              <w:start w:w="90" w:type="dxa"/>
-              <w:bottom w:w="40" w:type="dxa"/>
-              <w:end w:w="90" w:type="dxa"/>
-            </w:tcMar>
-          </w:tcPr>
-          <w:p>
-            <w:pPr>
-              <w:spacing w:after="0"/>
-            </w:pPr>
-            <w:r>
-              <w:rPr>
-                <w:rFonts w:ascii="Arial" w:hAnsi="Arial"/>
-                <w:b w:val="0"/>
-              </w:rPr>
-              <w:t>______</w:t>
+            <w:tcW w:type="dxa" w:w="840"/>
+            <w:vAlign w:val="center"/>
+            <w:tcMar>
+              <w:top w:w="40" w:type="dxa"/>
+              <w:start w:w="90" w:type="dxa"/>
+              <w:bottom w:w="40" w:type="dxa"/>
+              <w:end w:w="90" w:type="dxa"/>
+            </w:tcMar>
+          </w:tcPr>
+          <w:p>
+            <w:pPr>
+              <w:spacing w:after="0"/>
+            </w:pPr>
+            <w:r>
+              <w:rPr>
+                <w:rFonts w:ascii="Arial" w:hAnsi="Arial"/>
+                <w:b w:val="0"/>
+              </w:rPr>
+              <w:t>Frustration — How insecure, discouraged, irritated, stressed, or annoyed did you feel?</w:t>
+            </w:r>
+          </w:p>
+        </w:tc>
+        <w:tc>
+          <w:tcPr>
+            <w:tcW w:type="dxa" w:w="840"/>
+            <w:vAlign w:val="center"/>
+            <w:tcMar>
+              <w:top w:w="40" w:type="dxa"/>
+              <w:start w:w="90" w:type="dxa"/>
+              <w:bottom w:w="40" w:type="dxa"/>
+              <w:end w:w="90" w:type="dxa"/>
+            </w:tcMar>
+          </w:tcPr>
+          <w:p>
+            <w:pPr>
+              <w:spacing w:after="0"/>
+            </w:pPr>
+            <w:r>
+              <w:rPr>
+                <w:rFonts w:ascii="Arial" w:hAnsi="Arial"/>
+                <w:b w:val="0"/>
+              </w:rPr>
+              <w:t>☐</w:t>
+            </w:r>
+          </w:p>
+        </w:tc>
+        <w:tc>
+          <w:tcPr>
+            <w:tcW w:type="dxa" w:w="840"/>
+            <w:vAlign w:val="center"/>
+            <w:tcMar>
+              <w:top w:w="40" w:type="dxa"/>
+              <w:start w:w="90" w:type="dxa"/>
+              <w:bottom w:w="40" w:type="dxa"/>
+              <w:end w:w="90" w:type="dxa"/>
+            </w:tcMar>
+          </w:tcPr>
+          <w:p>
+            <w:pPr>
+              <w:spacing w:after="0"/>
+            </w:pPr>
+            <w:r>
+              <w:rPr>
+                <w:rFonts w:ascii="Arial" w:hAnsi="Arial"/>
+                <w:b w:val="0"/>
+              </w:rPr>
+              <w:t>☐</w:t>
+            </w:r>
+          </w:p>
+        </w:tc>
+        <w:tc>
+          <w:tcPr>
+            <w:tcW w:type="dxa" w:w="840"/>
+            <w:vAlign w:val="center"/>
+            <w:tcMar>
+              <w:top w:w="40" w:type="dxa"/>
+              <w:start w:w="90" w:type="dxa"/>
+              <w:bottom w:w="40" w:type="dxa"/>
+              <w:end w:w="90" w:type="dxa"/>
+            </w:tcMar>
+          </w:tcPr>
+          <w:p>
+            <w:pPr>
+              <w:spacing w:after="0"/>
+            </w:pPr>
+            <w:r>
+              <w:rPr>
+                <w:rFonts w:ascii="Arial" w:hAnsi="Arial"/>
+                <w:b w:val="0"/>
+              </w:rPr>
+              <w:t>☐</w:t>
+            </w:r>
+          </w:p>
+        </w:tc>
+        <w:tc>
+          <w:tcPr>
+            <w:tcW w:type="dxa" w:w="840"/>
+            <w:vAlign w:val="center"/>
+            <w:tcMar>
+              <w:top w:w="40" w:type="dxa"/>
+              <w:start w:w="90" w:type="dxa"/>
+              <w:bottom w:w="40" w:type="dxa"/>
+              <w:end w:w="90" w:type="dxa"/>
+            </w:tcMar>
+          </w:tcPr>
+          <w:p>
+            <w:pPr>
+              <w:spacing w:after="0"/>
+            </w:pPr>
+            <w:r>
+              <w:rPr>
+                <w:rFonts w:ascii="Arial" w:hAnsi="Arial"/>
+                <w:b w:val="0"/>
+              </w:rPr>
+              <w:t>☐</w:t>
+            </w:r>
+          </w:p>
+        </w:tc>
+        <w:tc>
+          <w:tcPr>
+            <w:tcW w:type="dxa" w:w="840"/>
+            <w:vAlign w:val="center"/>
+            <w:tcMar>
+              <w:top w:w="40" w:type="dxa"/>
+              <w:start w:w="90" w:type="dxa"/>
+              <w:bottom w:w="40" w:type="dxa"/>
+              <w:end w:w="90" w:type="dxa"/>
+            </w:tcMar>
+          </w:tcPr>
+          <w:p>
+            <w:pPr>
+              <w:spacing w:after="0"/>
+            </w:pPr>
+            <w:r>
+              <w:rPr>
+                <w:rFonts w:ascii="Arial" w:hAnsi="Arial"/>
+                <w:b w:val="0"/>
+              </w:rPr>
+              <w:t>☐</w:t>
+            </w:r>
+          </w:p>
+        </w:tc>
+        <w:tc>
+          <w:tcPr>
+            <w:tcW w:type="dxa" w:w="840"/>
+            <w:vAlign w:val="center"/>
+            <w:tcMar>
+              <w:top w:w="40" w:type="dxa"/>
+              <w:start w:w="90" w:type="dxa"/>
+              <w:bottom w:w="40" w:type="dxa"/>
+              <w:end w:w="90" w:type="dxa"/>
+            </w:tcMar>
+          </w:tcPr>
+          <w:p>
+            <w:pPr>
+              <w:spacing w:after="0"/>
+            </w:pPr>
+            <w:r>
+              <w:rPr>
+                <w:rFonts w:ascii="Arial" w:hAnsi="Arial"/>
+                <w:b w:val="0"/>
+              </w:rPr>
+              <w:t>☐</w:t>
+            </w:r>
+          </w:p>
+        </w:tc>
+        <w:tc>
+          <w:tcPr>
+            <w:tcW w:type="dxa" w:w="840"/>
+            <w:vAlign w:val="center"/>
+            <w:tcMar>
+              <w:top w:w="40" w:type="dxa"/>
+              <w:start w:w="90" w:type="dxa"/>
+              <w:bottom w:w="40" w:type="dxa"/>
+              <w:end w:w="90" w:type="dxa"/>
+            </w:tcMar>
+          </w:tcPr>
+          <w:p>
+            <w:pPr>
+              <w:spacing w:after="0"/>
+            </w:pPr>
+            <w:r>
+              <w:rPr>
+                <w:rFonts w:ascii="Arial" w:hAnsi="Arial"/>
+                <w:b w:val="0"/>
+              </w:rPr>
+              <w:t>☐</w:t>
+            </w:r>
+          </w:p>
+        </w:tc>
+        <w:tc>
+          <w:tcPr>
+            <w:tcW w:type="dxa" w:w="840"/>
+            <w:vAlign w:val="center"/>
+            <w:tcMar>
+              <w:top w:w="40" w:type="dxa"/>
+              <w:start w:w="90" w:type="dxa"/>
+              <w:bottom w:w="40" w:type="dxa"/>
+              <w:end w:w="90" w:type="dxa"/>
+            </w:tcMar>
+          </w:tcPr>
+          <w:p>
+            <w:pPr>
+              <w:spacing w:after="0"/>
+            </w:pPr>
+            <w:r>
+              <w:rPr>
+                <w:rFonts w:ascii="Arial" w:hAnsi="Arial"/>
+                <w:b w:val="0"/>
+              </w:rPr>
+              <w:t>☐</w:t>
+            </w:r>
+          </w:p>
+        </w:tc>
+        <w:tc>
+          <w:tcPr>
+            <w:tcW w:type="dxa" w:w="840"/>
+            <w:vAlign w:val="center"/>
+            <w:tcMar>
+              <w:top w:w="40" w:type="dxa"/>
+              <w:start w:w="90" w:type="dxa"/>
+              <w:bottom w:w="40" w:type="dxa"/>
+              <w:end w:w="90" w:type="dxa"/>
+            </w:tcMar>
+          </w:tcPr>
+          <w:p>
+            <w:pPr>
+              <w:spacing w:after="0"/>
+            </w:pPr>
+            <w:r>
+              <w:rPr>
+                <w:rFonts w:ascii="Arial" w:hAnsi="Arial"/>
+                <w:b w:val="0"/>
+              </w:rPr>
+              <w:t>☐</w:t>
+            </w:r>
+          </w:p>
+        </w:tc>
+        <w:tc>
+          <w:tcPr>
+            <w:tcW w:type="dxa" w:w="840"/>
+            <w:vAlign w:val="center"/>
+            <w:tcMar>
+              <w:top w:w="40" w:type="dxa"/>
+              <w:start w:w="90" w:type="dxa"/>
+              <w:bottom w:w="40" w:type="dxa"/>
+              <w:end w:w="90" w:type="dxa"/>
+            </w:tcMar>
+          </w:tcPr>
+          <w:p>
+            <w:pPr>
+              <w:spacing w:after="0"/>
+            </w:pPr>
+            <w:r>
+              <w:rPr>
+                <w:rFonts w:ascii="Arial" w:hAnsi="Arial"/>
+                <w:b w:val="0"/>
+              </w:rPr>
+              <w:t>☐</w:t>
+            </w:r>
+          </w:p>
+        </w:tc>
+        <w:tc>
+          <w:tcPr>
+            <w:tcW w:type="dxa" w:w="840"/>
+            <w:vAlign w:val="center"/>
+            <w:tcMar>
+              <w:top w:w="40" w:type="dxa"/>
+              <w:start w:w="90" w:type="dxa"/>
+              <w:bottom w:w="40" w:type="dxa"/>
+              <w:end w:w="90" w:type="dxa"/>
+            </w:tcMar>
+          </w:tcPr>
+          <w:p>
+            <w:pPr>
+              <w:spacing w:after="0"/>
+            </w:pPr>
+            <w:r>
+              <w:rPr>
+                <w:rFonts w:ascii="Arial" w:hAnsi="Arial"/>
+                <w:b w:val="0"/>
+              </w:rPr>
+              <w:t>☐</w:t>
             </w:r>
           </w:p>
         </w:tc>
@@ -1119,6 +2649,1398 @@
           <w:b w:val="0"/>
         </w:rPr>
         <w:t>• Did you take an unplanned break or experience an interruption? ☐ No ☐ Yes: ______</w:t>
+      </w:r>
+    </w:p>
+    <w:p>
+      <w:pPr>
+        <w:pStyle w:val="Heading1"/>
+      </w:pPr>
+      <w:r>
+        <w:rPr>
+          <w:rFonts w:ascii="Arial" w:hAnsi="Arial"/>
+          <w:b/>
+        </w:rPr>
+        <w:t>Perceived Eeriness (after each block)</w:t>
+      </w:r>
+    </w:p>
+    <w:p>
+      <w:r>
+        <w:rPr>
+          <w:rFonts w:ascii="Arial" w:hAnsi="Arial"/>
+          <w:b w:val="0"/>
+        </w:rPr>
+        <w:t xml:space="preserve">For each pair, mark the box that best describes how the assistant's voice felt during this block (1 to 7). Adapted from the Ho &amp; MacDorman (2017) Eeriness index; the eeriness construct was applied to self-similar voices by Zibrek et al. (2018) and Guo et al. (2024). </w:t>
+      </w:r>
+      <w:r>
+        <w:rPr>
+          <w:rFonts w:ascii="Arial" w:hAnsi="Arial"/>
+          <w:b/>
+        </w:rPr>
+        <w:t>[Transcribe the exact validated anchor pairs from Ho &amp; MacDorman (2017) before participant use.]</w:t>
+      </w:r>
+    </w:p>
+    <w:tbl>
+      <w:tblPr>
+        <w:tblStyle w:val="TableGrid"/>
+        <w:tblW w:type="auto" w:w="0"/>
+        <w:jc w:val="center"/>
+        <w:tblLayout w:type="autofit"/>
+        <w:tblLook w:firstColumn="1" w:firstRow="1" w:lastColumn="0" w:lastRow="0" w:noHBand="0" w:noVBand="1" w:val="04A0"/>
+      </w:tblPr>
+      <w:tblGrid>
+        <w:gridCol w:w="1120"/>
+        <w:gridCol w:w="1120"/>
+        <w:gridCol w:w="1120"/>
+        <w:gridCol w:w="1120"/>
+        <w:gridCol w:w="1120"/>
+        <w:gridCol w:w="1120"/>
+        <w:gridCol w:w="1120"/>
+        <w:gridCol w:w="1120"/>
+        <w:gridCol w:w="1120"/>
+      </w:tblGrid>
+      <w:tr>
+        <w:trPr>
+          <w:cantSplit/>
+          <w:tblHeader w:val="true"/>
+        </w:trPr>
+        <w:tc>
+          <w:tcPr>
+            <w:tcW w:type="dxa" w:w="1120"/>
+            <w:vAlign w:val="center"/>
+            <w:tcMar>
+              <w:top w:w="40" w:type="dxa"/>
+              <w:start w:w="90" w:type="dxa"/>
+              <w:bottom w:w="40" w:type="dxa"/>
+              <w:end w:w="90" w:type="dxa"/>
+            </w:tcMar>
+            <w:shd w:fill="D9EAF7"/>
+          </w:tcPr>
+          <w:p>
+            <w:pPr>
+              <w:spacing w:after="0"/>
+            </w:pPr>
+            <w:r>
+              <w:rPr>
+                <w:rFonts w:ascii="Arial" w:hAnsi="Arial"/>
+                <w:b/>
+              </w:rPr>
+              <w:t>The voice felt…</w:t>
+            </w:r>
+          </w:p>
+        </w:tc>
+        <w:tc>
+          <w:tcPr>
+            <w:tcW w:type="dxa" w:w="1120"/>
+            <w:vAlign w:val="center"/>
+            <w:tcMar>
+              <w:top w:w="40" w:type="dxa"/>
+              <w:start w:w="90" w:type="dxa"/>
+              <w:bottom w:w="40" w:type="dxa"/>
+              <w:end w:w="90" w:type="dxa"/>
+            </w:tcMar>
+            <w:shd w:fill="D9EAF7"/>
+          </w:tcPr>
+          <w:p>
+            <w:pPr>
+              <w:spacing w:after="0"/>
+            </w:pPr>
+            <w:r>
+              <w:rPr>
+                <w:rFonts w:ascii="Arial" w:hAnsi="Arial"/>
+                <w:b/>
+              </w:rPr>
+              <w:t>1</w:t>
+            </w:r>
+          </w:p>
+        </w:tc>
+        <w:tc>
+          <w:tcPr>
+            <w:tcW w:type="dxa" w:w="1120"/>
+            <w:vAlign w:val="center"/>
+            <w:tcMar>
+              <w:top w:w="40" w:type="dxa"/>
+              <w:start w:w="90" w:type="dxa"/>
+              <w:bottom w:w="40" w:type="dxa"/>
+              <w:end w:w="90" w:type="dxa"/>
+            </w:tcMar>
+            <w:shd w:fill="D9EAF7"/>
+          </w:tcPr>
+          <w:p>
+            <w:pPr>
+              <w:spacing w:after="0"/>
+            </w:pPr>
+            <w:r>
+              <w:rPr>
+                <w:rFonts w:ascii="Arial" w:hAnsi="Arial"/>
+                <w:b/>
+              </w:rPr>
+              <w:t>2</w:t>
+            </w:r>
+          </w:p>
+        </w:tc>
+        <w:tc>
+          <w:tcPr>
+            <w:tcW w:type="dxa" w:w="1120"/>
+            <w:vAlign w:val="center"/>
+            <w:tcMar>
+              <w:top w:w="40" w:type="dxa"/>
+              <w:start w:w="90" w:type="dxa"/>
+              <w:bottom w:w="40" w:type="dxa"/>
+              <w:end w:w="90" w:type="dxa"/>
+            </w:tcMar>
+            <w:shd w:fill="D9EAF7"/>
+          </w:tcPr>
+          <w:p>
+            <w:pPr>
+              <w:spacing w:after="0"/>
+            </w:pPr>
+            <w:r>
+              <w:rPr>
+                <w:rFonts w:ascii="Arial" w:hAnsi="Arial"/>
+                <w:b/>
+              </w:rPr>
+              <w:t>3</w:t>
+            </w:r>
+          </w:p>
+        </w:tc>
+        <w:tc>
+          <w:tcPr>
+            <w:tcW w:type="dxa" w:w="1120"/>
+            <w:vAlign w:val="center"/>
+            <w:tcMar>
+              <w:top w:w="40" w:type="dxa"/>
+              <w:start w:w="90" w:type="dxa"/>
+              <w:bottom w:w="40" w:type="dxa"/>
+              <w:end w:w="90" w:type="dxa"/>
+            </w:tcMar>
+            <w:shd w:fill="D9EAF7"/>
+          </w:tcPr>
+          <w:p>
+            <w:pPr>
+              <w:spacing w:after="0"/>
+            </w:pPr>
+            <w:r>
+              <w:rPr>
+                <w:rFonts w:ascii="Arial" w:hAnsi="Arial"/>
+                <w:b/>
+              </w:rPr>
+              <w:t>4</w:t>
+            </w:r>
+          </w:p>
+        </w:tc>
+        <w:tc>
+          <w:tcPr>
+            <w:tcW w:type="dxa" w:w="1120"/>
+            <w:vAlign w:val="center"/>
+            <w:tcMar>
+              <w:top w:w="40" w:type="dxa"/>
+              <w:start w:w="90" w:type="dxa"/>
+              <w:bottom w:w="40" w:type="dxa"/>
+              <w:end w:w="90" w:type="dxa"/>
+            </w:tcMar>
+            <w:shd w:fill="D9EAF7"/>
+          </w:tcPr>
+          <w:p>
+            <w:pPr>
+              <w:spacing w:after="0"/>
+            </w:pPr>
+            <w:r>
+              <w:rPr>
+                <w:rFonts w:ascii="Arial" w:hAnsi="Arial"/>
+                <w:b/>
+              </w:rPr>
+              <w:t>5</w:t>
+            </w:r>
+          </w:p>
+        </w:tc>
+        <w:tc>
+          <w:tcPr>
+            <w:tcW w:type="dxa" w:w="1120"/>
+            <w:vAlign w:val="center"/>
+            <w:tcMar>
+              <w:top w:w="40" w:type="dxa"/>
+              <w:start w:w="90" w:type="dxa"/>
+              <w:bottom w:w="40" w:type="dxa"/>
+              <w:end w:w="90" w:type="dxa"/>
+            </w:tcMar>
+            <w:shd w:fill="D9EAF7"/>
+          </w:tcPr>
+          <w:p>
+            <w:pPr>
+              <w:spacing w:after="0"/>
+            </w:pPr>
+            <w:r>
+              <w:rPr>
+                <w:rFonts w:ascii="Arial" w:hAnsi="Arial"/>
+                <w:b/>
+              </w:rPr>
+              <w:t>6</w:t>
+            </w:r>
+          </w:p>
+        </w:tc>
+        <w:tc>
+          <w:tcPr>
+            <w:tcW w:type="dxa" w:w="1120"/>
+            <w:vAlign w:val="center"/>
+            <w:tcMar>
+              <w:top w:w="40" w:type="dxa"/>
+              <w:start w:w="90" w:type="dxa"/>
+              <w:bottom w:w="40" w:type="dxa"/>
+              <w:end w:w="90" w:type="dxa"/>
+            </w:tcMar>
+            <w:shd w:fill="D9EAF7"/>
+          </w:tcPr>
+          <w:p>
+            <w:pPr>
+              <w:spacing w:after="0"/>
+            </w:pPr>
+            <w:r>
+              <w:rPr>
+                <w:rFonts w:ascii="Arial" w:hAnsi="Arial"/>
+                <w:b/>
+              </w:rPr>
+              <w:t>7</w:t>
+            </w:r>
+          </w:p>
+        </w:tc>
+        <w:tc>
+          <w:tcPr>
+            <w:tcW w:type="dxa" w:w="1120"/>
+            <w:vAlign w:val="center"/>
+            <w:tcMar>
+              <w:top w:w="40" w:type="dxa"/>
+              <w:start w:w="90" w:type="dxa"/>
+              <w:bottom w:w="40" w:type="dxa"/>
+              <w:end w:w="90" w:type="dxa"/>
+            </w:tcMar>
+            <w:shd w:fill="D9EAF7"/>
+          </w:tcPr>
+          <w:p>
+            <w:pPr>
+              <w:spacing w:after="0"/>
+            </w:pPr>
+            <w:r>
+              <w:rPr>
+                <w:rFonts w:ascii="Arial" w:hAnsi="Arial"/>
+                <w:b/>
+              </w:rPr>
+              <w:t>…the voice felt</w:t>
+            </w:r>
+          </w:p>
+        </w:tc>
+      </w:tr>
+      <w:tr>
+        <w:trPr>
+          <w:cantSplit/>
+        </w:trPr>
+        <w:tc>
+          <w:tcPr>
+            <w:tcW w:type="dxa" w:w="1120"/>
+            <w:vAlign w:val="center"/>
+            <w:tcMar>
+              <w:top w:w="40" w:type="dxa"/>
+              <w:start w:w="90" w:type="dxa"/>
+              <w:bottom w:w="40" w:type="dxa"/>
+              <w:end w:w="90" w:type="dxa"/>
+            </w:tcMar>
+          </w:tcPr>
+          <w:p>
+            <w:pPr>
+              <w:spacing w:after="0"/>
+            </w:pPr>
+            <w:r>
+              <w:rPr>
+                <w:rFonts w:ascii="Arial" w:hAnsi="Arial"/>
+                <w:b w:val="0"/>
+              </w:rPr>
+              <w:t>Reassuring</w:t>
+            </w:r>
+          </w:p>
+        </w:tc>
+        <w:tc>
+          <w:tcPr>
+            <w:tcW w:type="dxa" w:w="1120"/>
+            <w:vAlign w:val="center"/>
+            <w:tcMar>
+              <w:top w:w="40" w:type="dxa"/>
+              <w:start w:w="90" w:type="dxa"/>
+              <w:bottom w:w="40" w:type="dxa"/>
+              <w:end w:w="90" w:type="dxa"/>
+            </w:tcMar>
+          </w:tcPr>
+          <w:p>
+            <w:pPr>
+              <w:spacing w:after="0"/>
+            </w:pPr>
+            <w:r>
+              <w:rPr>
+                <w:rFonts w:ascii="Arial" w:hAnsi="Arial"/>
+                <w:b w:val="0"/>
+              </w:rPr>
+              <w:t>☐</w:t>
+            </w:r>
+          </w:p>
+        </w:tc>
+        <w:tc>
+          <w:tcPr>
+            <w:tcW w:type="dxa" w:w="1120"/>
+            <w:vAlign w:val="center"/>
+            <w:tcMar>
+              <w:top w:w="40" w:type="dxa"/>
+              <w:start w:w="90" w:type="dxa"/>
+              <w:bottom w:w="40" w:type="dxa"/>
+              <w:end w:w="90" w:type="dxa"/>
+            </w:tcMar>
+          </w:tcPr>
+          <w:p>
+            <w:pPr>
+              <w:spacing w:after="0"/>
+            </w:pPr>
+            <w:r>
+              <w:rPr>
+                <w:rFonts w:ascii="Arial" w:hAnsi="Arial"/>
+                <w:b w:val="0"/>
+              </w:rPr>
+              <w:t>☐</w:t>
+            </w:r>
+          </w:p>
+        </w:tc>
+        <w:tc>
+          <w:tcPr>
+            <w:tcW w:type="dxa" w:w="1120"/>
+            <w:vAlign w:val="center"/>
+            <w:tcMar>
+              <w:top w:w="40" w:type="dxa"/>
+              <w:start w:w="90" w:type="dxa"/>
+              <w:bottom w:w="40" w:type="dxa"/>
+              <w:end w:w="90" w:type="dxa"/>
+            </w:tcMar>
+          </w:tcPr>
+          <w:p>
+            <w:pPr>
+              <w:spacing w:after="0"/>
+            </w:pPr>
+            <w:r>
+              <w:rPr>
+                <w:rFonts w:ascii="Arial" w:hAnsi="Arial"/>
+                <w:b w:val="0"/>
+              </w:rPr>
+              <w:t>☐</w:t>
+            </w:r>
+          </w:p>
+        </w:tc>
+        <w:tc>
+          <w:tcPr>
+            <w:tcW w:type="dxa" w:w="1120"/>
+            <w:vAlign w:val="center"/>
+            <w:tcMar>
+              <w:top w:w="40" w:type="dxa"/>
+              <w:start w:w="90" w:type="dxa"/>
+              <w:bottom w:w="40" w:type="dxa"/>
+              <w:end w:w="90" w:type="dxa"/>
+            </w:tcMar>
+          </w:tcPr>
+          <w:p>
+            <w:pPr>
+              <w:spacing w:after="0"/>
+            </w:pPr>
+            <w:r>
+              <w:rPr>
+                <w:rFonts w:ascii="Arial" w:hAnsi="Arial"/>
+                <w:b w:val="0"/>
+              </w:rPr>
+              <w:t>☐</w:t>
+            </w:r>
+          </w:p>
+        </w:tc>
+        <w:tc>
+          <w:tcPr>
+            <w:tcW w:type="dxa" w:w="1120"/>
+            <w:vAlign w:val="center"/>
+            <w:tcMar>
+              <w:top w:w="40" w:type="dxa"/>
+              <w:start w:w="90" w:type="dxa"/>
+              <w:bottom w:w="40" w:type="dxa"/>
+              <w:end w:w="90" w:type="dxa"/>
+            </w:tcMar>
+          </w:tcPr>
+          <w:p>
+            <w:pPr>
+              <w:spacing w:after="0"/>
+            </w:pPr>
+            <w:r>
+              <w:rPr>
+                <w:rFonts w:ascii="Arial" w:hAnsi="Arial"/>
+                <w:b w:val="0"/>
+              </w:rPr>
+              <w:t>☐</w:t>
+            </w:r>
+          </w:p>
+        </w:tc>
+        <w:tc>
+          <w:tcPr>
+            <w:tcW w:type="dxa" w:w="1120"/>
+            <w:vAlign w:val="center"/>
+            <w:tcMar>
+              <w:top w:w="40" w:type="dxa"/>
+              <w:start w:w="90" w:type="dxa"/>
+              <w:bottom w:w="40" w:type="dxa"/>
+              <w:end w:w="90" w:type="dxa"/>
+            </w:tcMar>
+          </w:tcPr>
+          <w:p>
+            <w:pPr>
+              <w:spacing w:after="0"/>
+            </w:pPr>
+            <w:r>
+              <w:rPr>
+                <w:rFonts w:ascii="Arial" w:hAnsi="Arial"/>
+                <w:b w:val="0"/>
+              </w:rPr>
+              <w:t>☐</w:t>
+            </w:r>
+          </w:p>
+        </w:tc>
+        <w:tc>
+          <w:tcPr>
+            <w:tcW w:type="dxa" w:w="1120"/>
+            <w:vAlign w:val="center"/>
+            <w:tcMar>
+              <w:top w:w="40" w:type="dxa"/>
+              <w:start w:w="90" w:type="dxa"/>
+              <w:bottom w:w="40" w:type="dxa"/>
+              <w:end w:w="90" w:type="dxa"/>
+            </w:tcMar>
+          </w:tcPr>
+          <w:p>
+            <w:pPr>
+              <w:spacing w:after="0"/>
+            </w:pPr>
+            <w:r>
+              <w:rPr>
+                <w:rFonts w:ascii="Arial" w:hAnsi="Arial"/>
+                <w:b w:val="0"/>
+              </w:rPr>
+              <w:t>☐</w:t>
+            </w:r>
+          </w:p>
+        </w:tc>
+        <w:tc>
+          <w:tcPr>
+            <w:tcW w:type="dxa" w:w="1120"/>
+            <w:vAlign w:val="center"/>
+            <w:tcMar>
+              <w:top w:w="40" w:type="dxa"/>
+              <w:start w:w="90" w:type="dxa"/>
+              <w:bottom w:w="40" w:type="dxa"/>
+              <w:end w:w="90" w:type="dxa"/>
+            </w:tcMar>
+          </w:tcPr>
+          <w:p>
+            <w:pPr>
+              <w:spacing w:after="0"/>
+            </w:pPr>
+            <w:r>
+              <w:rPr>
+                <w:rFonts w:ascii="Arial" w:hAnsi="Arial"/>
+                <w:b w:val="0"/>
+              </w:rPr>
+              <w:t>Eerie</w:t>
+            </w:r>
+          </w:p>
+        </w:tc>
+      </w:tr>
+      <w:tr>
+        <w:trPr>
+          <w:cantSplit/>
+        </w:trPr>
+        <w:tc>
+          <w:tcPr>
+            <w:tcW w:type="dxa" w:w="1120"/>
+            <w:vAlign w:val="center"/>
+            <w:tcMar>
+              <w:top w:w="40" w:type="dxa"/>
+              <w:start w:w="90" w:type="dxa"/>
+              <w:bottom w:w="40" w:type="dxa"/>
+              <w:end w:w="90" w:type="dxa"/>
+            </w:tcMar>
+          </w:tcPr>
+          <w:p>
+            <w:pPr>
+              <w:spacing w:after="0"/>
+            </w:pPr>
+            <w:r>
+              <w:rPr>
+                <w:rFonts w:ascii="Arial" w:hAnsi="Arial"/>
+                <w:b w:val="0"/>
+              </w:rPr>
+              <w:t>Natural</w:t>
+            </w:r>
+          </w:p>
+        </w:tc>
+        <w:tc>
+          <w:tcPr>
+            <w:tcW w:type="dxa" w:w="1120"/>
+            <w:vAlign w:val="center"/>
+            <w:tcMar>
+              <w:top w:w="40" w:type="dxa"/>
+              <w:start w:w="90" w:type="dxa"/>
+              <w:bottom w:w="40" w:type="dxa"/>
+              <w:end w:w="90" w:type="dxa"/>
+            </w:tcMar>
+          </w:tcPr>
+          <w:p>
+            <w:pPr>
+              <w:spacing w:after="0"/>
+            </w:pPr>
+            <w:r>
+              <w:rPr>
+                <w:rFonts w:ascii="Arial" w:hAnsi="Arial"/>
+                <w:b w:val="0"/>
+              </w:rPr>
+              <w:t>☐</w:t>
+            </w:r>
+          </w:p>
+        </w:tc>
+        <w:tc>
+          <w:tcPr>
+            <w:tcW w:type="dxa" w:w="1120"/>
+            <w:vAlign w:val="center"/>
+            <w:tcMar>
+              <w:top w:w="40" w:type="dxa"/>
+              <w:start w:w="90" w:type="dxa"/>
+              <w:bottom w:w="40" w:type="dxa"/>
+              <w:end w:w="90" w:type="dxa"/>
+            </w:tcMar>
+          </w:tcPr>
+          <w:p>
+            <w:pPr>
+              <w:spacing w:after="0"/>
+            </w:pPr>
+            <w:r>
+              <w:rPr>
+                <w:rFonts w:ascii="Arial" w:hAnsi="Arial"/>
+                <w:b w:val="0"/>
+              </w:rPr>
+              <w:t>☐</w:t>
+            </w:r>
+          </w:p>
+        </w:tc>
+        <w:tc>
+          <w:tcPr>
+            <w:tcW w:type="dxa" w:w="1120"/>
+            <w:vAlign w:val="center"/>
+            <w:tcMar>
+              <w:top w:w="40" w:type="dxa"/>
+              <w:start w:w="90" w:type="dxa"/>
+              <w:bottom w:w="40" w:type="dxa"/>
+              <w:end w:w="90" w:type="dxa"/>
+            </w:tcMar>
+          </w:tcPr>
+          <w:p>
+            <w:pPr>
+              <w:spacing w:after="0"/>
+            </w:pPr>
+            <w:r>
+              <w:rPr>
+                <w:rFonts w:ascii="Arial" w:hAnsi="Arial"/>
+                <w:b w:val="0"/>
+              </w:rPr>
+              <w:t>☐</w:t>
+            </w:r>
+          </w:p>
+        </w:tc>
+        <w:tc>
+          <w:tcPr>
+            <w:tcW w:type="dxa" w:w="1120"/>
+            <w:vAlign w:val="center"/>
+            <w:tcMar>
+              <w:top w:w="40" w:type="dxa"/>
+              <w:start w:w="90" w:type="dxa"/>
+              <w:bottom w:w="40" w:type="dxa"/>
+              <w:end w:w="90" w:type="dxa"/>
+            </w:tcMar>
+          </w:tcPr>
+          <w:p>
+            <w:pPr>
+              <w:spacing w:after="0"/>
+            </w:pPr>
+            <w:r>
+              <w:rPr>
+                <w:rFonts w:ascii="Arial" w:hAnsi="Arial"/>
+                <w:b w:val="0"/>
+              </w:rPr>
+              <w:t>☐</w:t>
+            </w:r>
+          </w:p>
+        </w:tc>
+        <w:tc>
+          <w:tcPr>
+            <w:tcW w:type="dxa" w:w="1120"/>
+            <w:vAlign w:val="center"/>
+            <w:tcMar>
+              <w:top w:w="40" w:type="dxa"/>
+              <w:start w:w="90" w:type="dxa"/>
+              <w:bottom w:w="40" w:type="dxa"/>
+              <w:end w:w="90" w:type="dxa"/>
+            </w:tcMar>
+          </w:tcPr>
+          <w:p>
+            <w:pPr>
+              <w:spacing w:after="0"/>
+            </w:pPr>
+            <w:r>
+              <w:rPr>
+                <w:rFonts w:ascii="Arial" w:hAnsi="Arial"/>
+                <w:b w:val="0"/>
+              </w:rPr>
+              <w:t>☐</w:t>
+            </w:r>
+          </w:p>
+        </w:tc>
+        <w:tc>
+          <w:tcPr>
+            <w:tcW w:type="dxa" w:w="1120"/>
+            <w:vAlign w:val="center"/>
+            <w:tcMar>
+              <w:top w:w="40" w:type="dxa"/>
+              <w:start w:w="90" w:type="dxa"/>
+              <w:bottom w:w="40" w:type="dxa"/>
+              <w:end w:w="90" w:type="dxa"/>
+            </w:tcMar>
+          </w:tcPr>
+          <w:p>
+            <w:pPr>
+              <w:spacing w:after="0"/>
+            </w:pPr>
+            <w:r>
+              <w:rPr>
+                <w:rFonts w:ascii="Arial" w:hAnsi="Arial"/>
+                <w:b w:val="0"/>
+              </w:rPr>
+              <w:t>☐</w:t>
+            </w:r>
+          </w:p>
+        </w:tc>
+        <w:tc>
+          <w:tcPr>
+            <w:tcW w:type="dxa" w:w="1120"/>
+            <w:vAlign w:val="center"/>
+            <w:tcMar>
+              <w:top w:w="40" w:type="dxa"/>
+              <w:start w:w="90" w:type="dxa"/>
+              <w:bottom w:w="40" w:type="dxa"/>
+              <w:end w:w="90" w:type="dxa"/>
+            </w:tcMar>
+          </w:tcPr>
+          <w:p>
+            <w:pPr>
+              <w:spacing w:after="0"/>
+            </w:pPr>
+            <w:r>
+              <w:rPr>
+                <w:rFonts w:ascii="Arial" w:hAnsi="Arial"/>
+                <w:b w:val="0"/>
+              </w:rPr>
+              <w:t>☐</w:t>
+            </w:r>
+          </w:p>
+        </w:tc>
+        <w:tc>
+          <w:tcPr>
+            <w:tcW w:type="dxa" w:w="1120"/>
+            <w:vAlign w:val="center"/>
+            <w:tcMar>
+              <w:top w:w="40" w:type="dxa"/>
+              <w:start w:w="90" w:type="dxa"/>
+              <w:bottom w:w="40" w:type="dxa"/>
+              <w:end w:w="90" w:type="dxa"/>
+            </w:tcMar>
+          </w:tcPr>
+          <w:p>
+            <w:pPr>
+              <w:spacing w:after="0"/>
+            </w:pPr>
+            <w:r>
+              <w:rPr>
+                <w:rFonts w:ascii="Arial" w:hAnsi="Arial"/>
+                <w:b w:val="0"/>
+              </w:rPr>
+              <w:t>Uncanny</w:t>
+            </w:r>
+          </w:p>
+        </w:tc>
+      </w:tr>
+      <w:tr>
+        <w:trPr>
+          <w:cantSplit/>
+        </w:trPr>
+        <w:tc>
+          <w:tcPr>
+            <w:tcW w:type="dxa" w:w="1120"/>
+            <w:vAlign w:val="center"/>
+            <w:tcMar>
+              <w:top w:w="40" w:type="dxa"/>
+              <w:start w:w="90" w:type="dxa"/>
+              <w:bottom w:w="40" w:type="dxa"/>
+              <w:end w:w="90" w:type="dxa"/>
+            </w:tcMar>
+          </w:tcPr>
+          <w:p>
+            <w:pPr>
+              <w:spacing w:after="0"/>
+            </w:pPr>
+            <w:r>
+              <w:rPr>
+                <w:rFonts w:ascii="Arial" w:hAnsi="Arial"/>
+                <w:b w:val="0"/>
+              </w:rPr>
+              <w:t>Comforting</w:t>
+            </w:r>
+          </w:p>
+        </w:tc>
+        <w:tc>
+          <w:tcPr>
+            <w:tcW w:type="dxa" w:w="1120"/>
+            <w:vAlign w:val="center"/>
+            <w:tcMar>
+              <w:top w:w="40" w:type="dxa"/>
+              <w:start w:w="90" w:type="dxa"/>
+              <w:bottom w:w="40" w:type="dxa"/>
+              <w:end w:w="90" w:type="dxa"/>
+            </w:tcMar>
+          </w:tcPr>
+          <w:p>
+            <w:pPr>
+              <w:spacing w:after="0"/>
+            </w:pPr>
+            <w:r>
+              <w:rPr>
+                <w:rFonts w:ascii="Arial" w:hAnsi="Arial"/>
+                <w:b w:val="0"/>
+              </w:rPr>
+              <w:t>☐</w:t>
+            </w:r>
+          </w:p>
+        </w:tc>
+        <w:tc>
+          <w:tcPr>
+            <w:tcW w:type="dxa" w:w="1120"/>
+            <w:vAlign w:val="center"/>
+            <w:tcMar>
+              <w:top w:w="40" w:type="dxa"/>
+              <w:start w:w="90" w:type="dxa"/>
+              <w:bottom w:w="40" w:type="dxa"/>
+              <w:end w:w="90" w:type="dxa"/>
+            </w:tcMar>
+          </w:tcPr>
+          <w:p>
+            <w:pPr>
+              <w:spacing w:after="0"/>
+            </w:pPr>
+            <w:r>
+              <w:rPr>
+                <w:rFonts w:ascii="Arial" w:hAnsi="Arial"/>
+                <w:b w:val="0"/>
+              </w:rPr>
+              <w:t>☐</w:t>
+            </w:r>
+          </w:p>
+        </w:tc>
+        <w:tc>
+          <w:tcPr>
+            <w:tcW w:type="dxa" w:w="1120"/>
+            <w:vAlign w:val="center"/>
+            <w:tcMar>
+              <w:top w:w="40" w:type="dxa"/>
+              <w:start w:w="90" w:type="dxa"/>
+              <w:bottom w:w="40" w:type="dxa"/>
+              <w:end w:w="90" w:type="dxa"/>
+            </w:tcMar>
+          </w:tcPr>
+          <w:p>
+            <w:pPr>
+              <w:spacing w:after="0"/>
+            </w:pPr>
+            <w:r>
+              <w:rPr>
+                <w:rFonts w:ascii="Arial" w:hAnsi="Arial"/>
+                <w:b w:val="0"/>
+              </w:rPr>
+              <w:t>☐</w:t>
+            </w:r>
+          </w:p>
+        </w:tc>
+        <w:tc>
+          <w:tcPr>
+            <w:tcW w:type="dxa" w:w="1120"/>
+            <w:vAlign w:val="center"/>
+            <w:tcMar>
+              <w:top w:w="40" w:type="dxa"/>
+              <w:start w:w="90" w:type="dxa"/>
+              <w:bottom w:w="40" w:type="dxa"/>
+              <w:end w:w="90" w:type="dxa"/>
+            </w:tcMar>
+          </w:tcPr>
+          <w:p>
+            <w:pPr>
+              <w:spacing w:after="0"/>
+            </w:pPr>
+            <w:r>
+              <w:rPr>
+                <w:rFonts w:ascii="Arial" w:hAnsi="Arial"/>
+                <w:b w:val="0"/>
+              </w:rPr>
+              <w:t>☐</w:t>
+            </w:r>
+          </w:p>
+        </w:tc>
+        <w:tc>
+          <w:tcPr>
+            <w:tcW w:type="dxa" w:w="1120"/>
+            <w:vAlign w:val="center"/>
+            <w:tcMar>
+              <w:top w:w="40" w:type="dxa"/>
+              <w:start w:w="90" w:type="dxa"/>
+              <w:bottom w:w="40" w:type="dxa"/>
+              <w:end w:w="90" w:type="dxa"/>
+            </w:tcMar>
+          </w:tcPr>
+          <w:p>
+            <w:pPr>
+              <w:spacing w:after="0"/>
+            </w:pPr>
+            <w:r>
+              <w:rPr>
+                <w:rFonts w:ascii="Arial" w:hAnsi="Arial"/>
+                <w:b w:val="0"/>
+              </w:rPr>
+              <w:t>☐</w:t>
+            </w:r>
+          </w:p>
+        </w:tc>
+        <w:tc>
+          <w:tcPr>
+            <w:tcW w:type="dxa" w:w="1120"/>
+            <w:vAlign w:val="center"/>
+            <w:tcMar>
+              <w:top w:w="40" w:type="dxa"/>
+              <w:start w:w="90" w:type="dxa"/>
+              <w:bottom w:w="40" w:type="dxa"/>
+              <w:end w:w="90" w:type="dxa"/>
+            </w:tcMar>
+          </w:tcPr>
+          <w:p>
+            <w:pPr>
+              <w:spacing w:after="0"/>
+            </w:pPr>
+            <w:r>
+              <w:rPr>
+                <w:rFonts w:ascii="Arial" w:hAnsi="Arial"/>
+                <w:b w:val="0"/>
+              </w:rPr>
+              <w:t>☐</w:t>
+            </w:r>
+          </w:p>
+        </w:tc>
+        <w:tc>
+          <w:tcPr>
+            <w:tcW w:type="dxa" w:w="1120"/>
+            <w:vAlign w:val="center"/>
+            <w:tcMar>
+              <w:top w:w="40" w:type="dxa"/>
+              <w:start w:w="90" w:type="dxa"/>
+              <w:bottom w:w="40" w:type="dxa"/>
+              <w:end w:w="90" w:type="dxa"/>
+            </w:tcMar>
+          </w:tcPr>
+          <w:p>
+            <w:pPr>
+              <w:spacing w:after="0"/>
+            </w:pPr>
+            <w:r>
+              <w:rPr>
+                <w:rFonts w:ascii="Arial" w:hAnsi="Arial"/>
+                <w:b w:val="0"/>
+              </w:rPr>
+              <w:t>☐</w:t>
+            </w:r>
+          </w:p>
+        </w:tc>
+        <w:tc>
+          <w:tcPr>
+            <w:tcW w:type="dxa" w:w="1120"/>
+            <w:vAlign w:val="center"/>
+            <w:tcMar>
+              <w:top w:w="40" w:type="dxa"/>
+              <w:start w:w="90" w:type="dxa"/>
+              <w:bottom w:w="40" w:type="dxa"/>
+              <w:end w:w="90" w:type="dxa"/>
+            </w:tcMar>
+          </w:tcPr>
+          <w:p>
+            <w:pPr>
+              <w:spacing w:after="0"/>
+            </w:pPr>
+            <w:r>
+              <w:rPr>
+                <w:rFonts w:ascii="Arial" w:hAnsi="Arial"/>
+                <w:b w:val="0"/>
+              </w:rPr>
+              <w:t>Creepy</w:t>
+            </w:r>
+          </w:p>
+        </w:tc>
+      </w:tr>
+    </w:tbl>
+    <w:p>
+      <w:pPr>
+        <w:spacing w:after="0"/>
+      </w:pPr>
+    </w:p>
+    <w:p>
+      <w:r>
+        <w:rPr>
+          <w:rFonts w:ascii="Arial" w:hAnsi="Arial"/>
+          <w:b w:val="0"/>
+        </w:rPr>
+        <w:t>Perceived voice similarity (manipulation check):</w:t>
+      </w:r>
+    </w:p>
+    <w:tbl>
+      <w:tblPr>
+        <w:tblStyle w:val="TableGrid"/>
+        <w:tblW w:type="auto" w:w="0"/>
+        <w:jc w:val="center"/>
+        <w:tblLayout w:type="autofit"/>
+        <w:tblLook w:firstColumn="1" w:firstRow="1" w:lastColumn="0" w:lastRow="0" w:noHBand="0" w:noVBand="1" w:val="04A0"/>
+      </w:tblPr>
+      <w:tblGrid>
+        <w:gridCol w:w="1260"/>
+        <w:gridCol w:w="1260"/>
+        <w:gridCol w:w="1260"/>
+        <w:gridCol w:w="1260"/>
+        <w:gridCol w:w="1260"/>
+        <w:gridCol w:w="1260"/>
+        <w:gridCol w:w="1260"/>
+        <w:gridCol w:w="1260"/>
+      </w:tblGrid>
+      <w:tr>
+        <w:trPr>
+          <w:cantSplit/>
+          <w:tblHeader w:val="true"/>
+        </w:trPr>
+        <w:tc>
+          <w:tcPr>
+            <w:tcW w:type="dxa" w:w="1260"/>
+            <w:vAlign w:val="center"/>
+            <w:tcMar>
+              <w:top w:w="40" w:type="dxa"/>
+              <w:start w:w="90" w:type="dxa"/>
+              <w:bottom w:w="40" w:type="dxa"/>
+              <w:end w:w="90" w:type="dxa"/>
+            </w:tcMar>
+            <w:shd w:fill="D9EAF7"/>
+          </w:tcPr>
+          <w:p>
+            <w:pPr>
+              <w:spacing w:after="0"/>
+            </w:pPr>
+            <w:r>
+              <w:rPr>
+                <w:rFonts w:ascii="Arial" w:hAnsi="Arial"/>
+                <w:b/>
+              </w:rPr>
+              <w:t>Statement</w:t>
+            </w:r>
+          </w:p>
+        </w:tc>
+        <w:tc>
+          <w:tcPr>
+            <w:tcW w:type="dxa" w:w="1260"/>
+            <w:vAlign w:val="center"/>
+            <w:tcMar>
+              <w:top w:w="40" w:type="dxa"/>
+              <w:start w:w="90" w:type="dxa"/>
+              <w:bottom w:w="40" w:type="dxa"/>
+              <w:end w:w="90" w:type="dxa"/>
+            </w:tcMar>
+            <w:shd w:fill="D9EAF7"/>
+          </w:tcPr>
+          <w:p>
+            <w:pPr>
+              <w:spacing w:after="0"/>
+            </w:pPr>
+            <w:r>
+              <w:rPr>
+                <w:rFonts w:ascii="Arial" w:hAnsi="Arial"/>
+                <w:b/>
+              </w:rPr>
+              <w:t>1 Not at all</w:t>
+            </w:r>
+          </w:p>
+        </w:tc>
+        <w:tc>
+          <w:tcPr>
+            <w:tcW w:type="dxa" w:w="1260"/>
+            <w:vAlign w:val="center"/>
+            <w:tcMar>
+              <w:top w:w="40" w:type="dxa"/>
+              <w:start w:w="90" w:type="dxa"/>
+              <w:bottom w:w="40" w:type="dxa"/>
+              <w:end w:w="90" w:type="dxa"/>
+            </w:tcMar>
+            <w:shd w:fill="D9EAF7"/>
+          </w:tcPr>
+          <w:p>
+            <w:pPr>
+              <w:spacing w:after="0"/>
+            </w:pPr>
+            <w:r>
+              <w:rPr>
+                <w:rFonts w:ascii="Arial" w:hAnsi="Arial"/>
+                <w:b/>
+              </w:rPr>
+              <w:t>2</w:t>
+            </w:r>
+          </w:p>
+        </w:tc>
+        <w:tc>
+          <w:tcPr>
+            <w:tcW w:type="dxa" w:w="1260"/>
+            <w:vAlign w:val="center"/>
+            <w:tcMar>
+              <w:top w:w="40" w:type="dxa"/>
+              <w:start w:w="90" w:type="dxa"/>
+              <w:bottom w:w="40" w:type="dxa"/>
+              <w:end w:w="90" w:type="dxa"/>
+            </w:tcMar>
+            <w:shd w:fill="D9EAF7"/>
+          </w:tcPr>
+          <w:p>
+            <w:pPr>
+              <w:spacing w:after="0"/>
+            </w:pPr>
+            <w:r>
+              <w:rPr>
+                <w:rFonts w:ascii="Arial" w:hAnsi="Arial"/>
+                <w:b/>
+              </w:rPr>
+              <w:t>3</w:t>
+            </w:r>
+          </w:p>
+        </w:tc>
+        <w:tc>
+          <w:tcPr>
+            <w:tcW w:type="dxa" w:w="1260"/>
+            <w:vAlign w:val="center"/>
+            <w:tcMar>
+              <w:top w:w="40" w:type="dxa"/>
+              <w:start w:w="90" w:type="dxa"/>
+              <w:bottom w:w="40" w:type="dxa"/>
+              <w:end w:w="90" w:type="dxa"/>
+            </w:tcMar>
+            <w:shd w:fill="D9EAF7"/>
+          </w:tcPr>
+          <w:p>
+            <w:pPr>
+              <w:spacing w:after="0"/>
+            </w:pPr>
+            <w:r>
+              <w:rPr>
+                <w:rFonts w:ascii="Arial" w:hAnsi="Arial"/>
+                <w:b/>
+              </w:rPr>
+              <w:t>4</w:t>
+            </w:r>
+          </w:p>
+        </w:tc>
+        <w:tc>
+          <w:tcPr>
+            <w:tcW w:type="dxa" w:w="1260"/>
+            <w:vAlign w:val="center"/>
+            <w:tcMar>
+              <w:top w:w="40" w:type="dxa"/>
+              <w:start w:w="90" w:type="dxa"/>
+              <w:bottom w:w="40" w:type="dxa"/>
+              <w:end w:w="90" w:type="dxa"/>
+            </w:tcMar>
+            <w:shd w:fill="D9EAF7"/>
+          </w:tcPr>
+          <w:p>
+            <w:pPr>
+              <w:spacing w:after="0"/>
+            </w:pPr>
+            <w:r>
+              <w:rPr>
+                <w:rFonts w:ascii="Arial" w:hAnsi="Arial"/>
+                <w:b/>
+              </w:rPr>
+              <w:t>5</w:t>
+            </w:r>
+          </w:p>
+        </w:tc>
+        <w:tc>
+          <w:tcPr>
+            <w:tcW w:type="dxa" w:w="1260"/>
+            <w:vAlign w:val="center"/>
+            <w:tcMar>
+              <w:top w:w="40" w:type="dxa"/>
+              <w:start w:w="90" w:type="dxa"/>
+              <w:bottom w:w="40" w:type="dxa"/>
+              <w:end w:w="90" w:type="dxa"/>
+            </w:tcMar>
+            <w:shd w:fill="D9EAF7"/>
+          </w:tcPr>
+          <w:p>
+            <w:pPr>
+              <w:spacing w:after="0"/>
+            </w:pPr>
+            <w:r>
+              <w:rPr>
+                <w:rFonts w:ascii="Arial" w:hAnsi="Arial"/>
+                <w:b/>
+              </w:rPr>
+              <w:t>6</w:t>
+            </w:r>
+          </w:p>
+        </w:tc>
+        <w:tc>
+          <w:tcPr>
+            <w:tcW w:type="dxa" w:w="1260"/>
+            <w:vAlign w:val="center"/>
+            <w:tcMar>
+              <w:top w:w="40" w:type="dxa"/>
+              <w:start w:w="90" w:type="dxa"/>
+              <w:bottom w:w="40" w:type="dxa"/>
+              <w:end w:w="90" w:type="dxa"/>
+            </w:tcMar>
+            <w:shd w:fill="D9EAF7"/>
+          </w:tcPr>
+          <w:p>
+            <w:pPr>
+              <w:spacing w:after="0"/>
+            </w:pPr>
+            <w:r>
+              <w:rPr>
+                <w:rFonts w:ascii="Arial" w:hAnsi="Arial"/>
+                <w:b/>
+              </w:rPr>
+              <w:t>7 Extremely</w:t>
+            </w:r>
+          </w:p>
+        </w:tc>
+      </w:tr>
+      <w:tr>
+        <w:trPr>
+          <w:cantSplit/>
+        </w:trPr>
+        <w:tc>
+          <w:tcPr>
+            <w:tcW w:type="dxa" w:w="1260"/>
+            <w:vAlign w:val="center"/>
+            <w:tcMar>
+              <w:top w:w="40" w:type="dxa"/>
+              <w:start w:w="90" w:type="dxa"/>
+              <w:bottom w:w="40" w:type="dxa"/>
+              <w:end w:w="90" w:type="dxa"/>
+            </w:tcMar>
+          </w:tcPr>
+          <w:p>
+            <w:pPr>
+              <w:spacing w:after="0"/>
+            </w:pPr>
+            <w:r>
+              <w:rPr>
+                <w:rFonts w:ascii="Arial" w:hAnsi="Arial"/>
+                <w:b w:val="0"/>
+              </w:rPr>
+              <w:t>How much did the assistant's voice sound like your own voice?</w:t>
+            </w:r>
+          </w:p>
+        </w:tc>
+        <w:tc>
+          <w:tcPr>
+            <w:tcW w:type="dxa" w:w="1260"/>
+            <w:vAlign w:val="center"/>
+            <w:tcMar>
+              <w:top w:w="40" w:type="dxa"/>
+              <w:start w:w="90" w:type="dxa"/>
+              <w:bottom w:w="40" w:type="dxa"/>
+              <w:end w:w="90" w:type="dxa"/>
+            </w:tcMar>
+          </w:tcPr>
+          <w:p>
+            <w:pPr>
+              <w:spacing w:after="0"/>
+            </w:pPr>
+            <w:r>
+              <w:rPr>
+                <w:rFonts w:ascii="Arial" w:hAnsi="Arial"/>
+                <w:b w:val="0"/>
+              </w:rPr>
+              <w:t>☐</w:t>
+            </w:r>
+          </w:p>
+        </w:tc>
+        <w:tc>
+          <w:tcPr>
+            <w:tcW w:type="dxa" w:w="1260"/>
+            <w:vAlign w:val="center"/>
+            <w:tcMar>
+              <w:top w:w="40" w:type="dxa"/>
+              <w:start w:w="90" w:type="dxa"/>
+              <w:bottom w:w="40" w:type="dxa"/>
+              <w:end w:w="90" w:type="dxa"/>
+            </w:tcMar>
+          </w:tcPr>
+          <w:p>
+            <w:pPr>
+              <w:spacing w:after="0"/>
+            </w:pPr>
+            <w:r>
+              <w:rPr>
+                <w:rFonts w:ascii="Arial" w:hAnsi="Arial"/>
+                <w:b w:val="0"/>
+              </w:rPr>
+              <w:t>☐</w:t>
+            </w:r>
+          </w:p>
+        </w:tc>
+        <w:tc>
+          <w:tcPr>
+            <w:tcW w:type="dxa" w:w="1260"/>
+            <w:vAlign w:val="center"/>
+            <w:tcMar>
+              <w:top w:w="40" w:type="dxa"/>
+              <w:start w:w="90" w:type="dxa"/>
+              <w:bottom w:w="40" w:type="dxa"/>
+              <w:end w:w="90" w:type="dxa"/>
+            </w:tcMar>
+          </w:tcPr>
+          <w:p>
+            <w:pPr>
+              <w:spacing w:after="0"/>
+            </w:pPr>
+            <w:r>
+              <w:rPr>
+                <w:rFonts w:ascii="Arial" w:hAnsi="Arial"/>
+                <w:b w:val="0"/>
+              </w:rPr>
+              <w:t>☐</w:t>
+            </w:r>
+          </w:p>
+        </w:tc>
+        <w:tc>
+          <w:tcPr>
+            <w:tcW w:type="dxa" w:w="1260"/>
+            <w:vAlign w:val="center"/>
+            <w:tcMar>
+              <w:top w:w="40" w:type="dxa"/>
+              <w:start w:w="90" w:type="dxa"/>
+              <w:bottom w:w="40" w:type="dxa"/>
+              <w:end w:w="90" w:type="dxa"/>
+            </w:tcMar>
+          </w:tcPr>
+          <w:p>
+            <w:pPr>
+              <w:spacing w:after="0"/>
+            </w:pPr>
+            <w:r>
+              <w:rPr>
+                <w:rFonts w:ascii="Arial" w:hAnsi="Arial"/>
+                <w:b w:val="0"/>
+              </w:rPr>
+              <w:t>☐</w:t>
+            </w:r>
+          </w:p>
+        </w:tc>
+        <w:tc>
+          <w:tcPr>
+            <w:tcW w:type="dxa" w:w="1260"/>
+            <w:vAlign w:val="center"/>
+            <w:tcMar>
+              <w:top w:w="40" w:type="dxa"/>
+              <w:start w:w="90" w:type="dxa"/>
+              <w:bottom w:w="40" w:type="dxa"/>
+              <w:end w:w="90" w:type="dxa"/>
+            </w:tcMar>
+          </w:tcPr>
+          <w:p>
+            <w:pPr>
+              <w:spacing w:after="0"/>
+            </w:pPr>
+            <w:r>
+              <w:rPr>
+                <w:rFonts w:ascii="Arial" w:hAnsi="Arial"/>
+                <w:b w:val="0"/>
+              </w:rPr>
+              <w:t>☐</w:t>
+            </w:r>
+          </w:p>
+        </w:tc>
+        <w:tc>
+          <w:tcPr>
+            <w:tcW w:type="dxa" w:w="1260"/>
+            <w:vAlign w:val="center"/>
+            <w:tcMar>
+              <w:top w:w="40" w:type="dxa"/>
+              <w:start w:w="90" w:type="dxa"/>
+              <w:bottom w:w="40" w:type="dxa"/>
+              <w:end w:w="90" w:type="dxa"/>
+            </w:tcMar>
+          </w:tcPr>
+          <w:p>
+            <w:pPr>
+              <w:spacing w:after="0"/>
+            </w:pPr>
+            <w:r>
+              <w:rPr>
+                <w:rFonts w:ascii="Arial" w:hAnsi="Arial"/>
+                <w:b w:val="0"/>
+              </w:rPr>
+              <w:t>☐</w:t>
+            </w:r>
+          </w:p>
+        </w:tc>
+        <w:tc>
+          <w:tcPr>
+            <w:tcW w:type="dxa" w:w="1260"/>
+            <w:vAlign w:val="center"/>
+            <w:tcMar>
+              <w:top w:w="40" w:type="dxa"/>
+              <w:start w:w="90" w:type="dxa"/>
+              <w:bottom w:w="40" w:type="dxa"/>
+              <w:end w:w="90" w:type="dxa"/>
+            </w:tcMar>
+          </w:tcPr>
+          <w:p>
+            <w:pPr>
+              <w:spacing w:after="0"/>
+            </w:pPr>
+            <w:r>
+              <w:rPr>
+                <w:rFonts w:ascii="Arial" w:hAnsi="Arial"/>
+                <w:b w:val="0"/>
+              </w:rPr>
+              <w:t>☐</w:t>
+            </w:r>
+          </w:p>
+        </w:tc>
+      </w:tr>
+    </w:tbl>
+    <w:p>
+      <w:pPr>
+        <w:spacing w:after="0"/>
+      </w:pPr>
+    </w:p>
+    <w:p>
+      <w:r>
+        <w:rPr>
+          <w:rFonts w:ascii="Arial" w:hAnsi="Arial"/>
+          <w:b w:val="0"/>
+        </w:rPr>
+        <w:t>Analyze the three eeriness items as a mean eeriness score and the similarity item as a manipulation check; do not exclude participants based on these ratings.</w:t>
       </w:r>
     </w:p>
     <w:p>
@@ -3481,7 +6403,7 @@
           <w:rFonts w:ascii="Arial" w:hAnsi="Arial"/>
           <w:b w:val="0"/>
         </w:rPr>
-        <w:t>• Administer Raw NASA-TLX after each of the four blocks on 0–100 scales without pairwise weighting.</w:t>
+        <w:t>• Administer Raw NASA-TLX after each of the four blocks as a six-subscale matrix on a 0 (Very low) to 10 (Very high) scale, without pairwise weighting.</w:t>
       </w:r>
     </w:p>
     <w:p>
@@ -3508,6 +6430,19 @@
           <w:b w:val="0"/>
         </w:rPr>
         <w:t>• Administer the nine fixed study-created items after every block and items 10–11 after gaze-contingent blocks only. Keep the order fixed to reduce administration variance.</w:t>
+      </w:r>
+    </w:p>
+    <w:p>
+      <w:pPr>
+        <w:spacing w:after="40"/>
+        <w:ind w:left="360" w:hanging="259"/>
+      </w:pPr>
+      <w:r>
+        <w:rPr>
+          <w:rFonts w:ascii="Arial" w:hAnsi="Arial"/>
+          <w:b w:val="0"/>
+        </w:rPr>
+        <w:t>• Administer the perceived-eeriness semantic differential (Ho &amp; MacDorman, 2017; Zibrek et al., 2018) and the voice-similarity manipulation check after every block; finalize the exact validated eeriness anchors from the source before participant use.</w:t>
       </w:r>
     </w:p>
     <w:p>
@@ -3543,6 +6478,24 @@
           <w:b w:val="0"/>
         </w:rPr>
         <w:t>Reference: Kennedy, R. S., Lane, N. E., Berbaum, K. S., &amp; Lilienthal, M. G. (1993). Simulator Sickness Questionnaire. *The International Journal of Aviation Psychology, 3*(3), 203–220. https://doi.org/10.1207/s15327108ijap0303_3</w:t>
+      </w:r>
+    </w:p>
+    <w:p>
+      <w:r>
+        <w:rPr>
+          <w:rFonts w:ascii="Arial" w:hAnsi="Arial"/>
+          <w:b w:val="0"/>
+        </w:rPr>
+        <w:t>Reference (eeriness): Ho, C.-C., &amp; MacDorman, K. F. (2017). Measuring the uncanny valley effect: Refinements to indices for perceived humanness, attractiveness, and eeriness. *International Journal of Social Robotics, 9*(1), 129–139. https://doi.org/10.1007/s12369-016-0380-9</w:t>
+      </w:r>
+    </w:p>
+    <w:p>
+      <w:r>
+        <w:rPr>
+          <w:rFonts w:ascii="Arial" w:hAnsi="Arial"/>
+          <w:b w:val="0"/>
+        </w:rPr>
+        <w:t>Reference (self-similar voice precedent): Zibrek, K., Kokkinara, E., &amp; McDonnell, R. (2018). The effect of realistic appearance of virtual characters in immersive environments. *IEEE TVCG, 24*(4), 1681–1690. https://doi.org/10.1109/TVCG.2018.2794638; Guo, S., Choi, M., Kao, D., &amp; Mousas, C. (2024). Collaborating with My Doppelgänger. *PACM CGIT, 7*(1). https://doi.org/10.1145/3651288</w:t>
       </w:r>
     </w:p>
     <w:sectPr>

</xml_diff>

<commit_message>
docs(irb): add IPQ presence questionnaire (07_Presence.pdf)
Add the 14-item igroup Presence Questionnaire (Schubert et al. 2001) to
questionnaires.md + a UCF-themed 07_Presence.pdf, and add a reusable
scripts/build-questionnaire-pdfs.py generator. Add the IPQ citation.

Co-Authored-By: Claude Opus 4.8 <noreply@anthropic.com>
</commit_message>
<xml_diff>
--- a/docs/irb/submission/Participant_Questionnaires.docx
+++ b/docs/irb/submission/Participant_Questionnaires.docx
@@ -4188,6 +4188,3040 @@
           <w:b w:val="0"/>
         </w:rPr>
         <w:t>9. What would you change about the hints, voice, or task? ____________________</w:t>
+      </w:r>
+    </w:p>
+    <w:p>
+      <w:pPr>
+        <w:pStyle w:val="Heading1"/>
+      </w:pPr>
+      <w:r>
+        <w:rPr>
+          <w:rFonts w:ascii="Arial" w:hAnsi="Arial"/>
+          <w:b/>
+        </w:rPr>
+        <w:t>Presence Questionnaire (post-session)</w:t>
+      </w:r>
+    </w:p>
+    <w:p>
+      <w:r>
+        <w:rPr>
+          <w:rFonts w:ascii="Arial" w:hAnsi="Arial"/>
+          <w:b w:val="0"/>
+        </w:rPr>
+        <w:t xml:space="preserve">igroup Presence Questionnaire (IPQ; Schubert, Friedmann, &amp; Regenbrecht, 2001) — 14 items across General Presence, Spatial Presence, Involvement, and Experienced Realism. Rate each item from 1 to 7. </w:t>
+      </w:r>
+      <w:r>
+        <w:rPr>
+          <w:rFonts w:ascii="Arial" w:hAnsi="Arial"/>
+          <w:b/>
+        </w:rPr>
+        <w:t>[Apply the exact igroup.org anchors before participant use: most items use “fully disagree (1)” to “fully agree (7),” while G1, INV1, REAL1, and REAL3 use item-specific anchors.]</w:t>
+      </w:r>
+    </w:p>
+    <w:tbl>
+      <w:tblPr>
+        <w:tblStyle w:val="TableGrid"/>
+        <w:tblW w:type="auto" w:w="0"/>
+        <w:jc w:val="center"/>
+        <w:tblLayout w:type="autofit"/>
+        <w:tblLook w:firstColumn="1" w:firstRow="1" w:lastColumn="0" w:lastRow="0" w:noHBand="0" w:noVBand="1" w:val="04A0"/>
+      </w:tblPr>
+      <w:tblGrid>
+        <w:gridCol w:w="1260"/>
+        <w:gridCol w:w="1260"/>
+        <w:gridCol w:w="1260"/>
+        <w:gridCol w:w="1260"/>
+        <w:gridCol w:w="1260"/>
+        <w:gridCol w:w="1260"/>
+        <w:gridCol w:w="1260"/>
+        <w:gridCol w:w="1260"/>
+      </w:tblGrid>
+      <w:tr>
+        <w:trPr>
+          <w:cantSplit/>
+          <w:tblHeader w:val="true"/>
+        </w:trPr>
+        <w:tc>
+          <w:tcPr>
+            <w:tcW w:type="dxa" w:w="1260"/>
+            <w:vAlign w:val="center"/>
+            <w:tcMar>
+              <w:top w:w="40" w:type="dxa"/>
+              <w:start w:w="90" w:type="dxa"/>
+              <w:bottom w:w="40" w:type="dxa"/>
+              <w:end w:w="90" w:type="dxa"/>
+            </w:tcMar>
+            <w:shd w:fill="D9EAF7"/>
+          </w:tcPr>
+          <w:p>
+            <w:pPr>
+              <w:spacing w:after="0"/>
+            </w:pPr>
+            <w:r>
+              <w:rPr>
+                <w:rFonts w:ascii="Arial" w:hAnsi="Arial"/>
+                <w:b/>
+              </w:rPr>
+              <w:t>Item</w:t>
+            </w:r>
+          </w:p>
+        </w:tc>
+        <w:tc>
+          <w:tcPr>
+            <w:tcW w:type="dxa" w:w="1260"/>
+            <w:vAlign w:val="center"/>
+            <w:tcMar>
+              <w:top w:w="40" w:type="dxa"/>
+              <w:start w:w="90" w:type="dxa"/>
+              <w:bottom w:w="40" w:type="dxa"/>
+              <w:end w:w="90" w:type="dxa"/>
+            </w:tcMar>
+            <w:shd w:fill="D9EAF7"/>
+          </w:tcPr>
+          <w:p>
+            <w:pPr>
+              <w:spacing w:after="0"/>
+            </w:pPr>
+            <w:r>
+              <w:rPr>
+                <w:rFonts w:ascii="Arial" w:hAnsi="Arial"/>
+                <w:b/>
+              </w:rPr>
+              <w:t>1 Fully disagree</w:t>
+            </w:r>
+          </w:p>
+        </w:tc>
+        <w:tc>
+          <w:tcPr>
+            <w:tcW w:type="dxa" w:w="1260"/>
+            <w:vAlign w:val="center"/>
+            <w:tcMar>
+              <w:top w:w="40" w:type="dxa"/>
+              <w:start w:w="90" w:type="dxa"/>
+              <w:bottom w:w="40" w:type="dxa"/>
+              <w:end w:w="90" w:type="dxa"/>
+            </w:tcMar>
+            <w:shd w:fill="D9EAF7"/>
+          </w:tcPr>
+          <w:p>
+            <w:pPr>
+              <w:spacing w:after="0"/>
+            </w:pPr>
+            <w:r>
+              <w:rPr>
+                <w:rFonts w:ascii="Arial" w:hAnsi="Arial"/>
+                <w:b/>
+              </w:rPr>
+              <w:t>2</w:t>
+            </w:r>
+          </w:p>
+        </w:tc>
+        <w:tc>
+          <w:tcPr>
+            <w:tcW w:type="dxa" w:w="1260"/>
+            <w:vAlign w:val="center"/>
+            <w:tcMar>
+              <w:top w:w="40" w:type="dxa"/>
+              <w:start w:w="90" w:type="dxa"/>
+              <w:bottom w:w="40" w:type="dxa"/>
+              <w:end w:w="90" w:type="dxa"/>
+            </w:tcMar>
+            <w:shd w:fill="D9EAF7"/>
+          </w:tcPr>
+          <w:p>
+            <w:pPr>
+              <w:spacing w:after="0"/>
+            </w:pPr>
+            <w:r>
+              <w:rPr>
+                <w:rFonts w:ascii="Arial" w:hAnsi="Arial"/>
+                <w:b/>
+              </w:rPr>
+              <w:t>3</w:t>
+            </w:r>
+          </w:p>
+        </w:tc>
+        <w:tc>
+          <w:tcPr>
+            <w:tcW w:type="dxa" w:w="1260"/>
+            <w:vAlign w:val="center"/>
+            <w:tcMar>
+              <w:top w:w="40" w:type="dxa"/>
+              <w:start w:w="90" w:type="dxa"/>
+              <w:bottom w:w="40" w:type="dxa"/>
+              <w:end w:w="90" w:type="dxa"/>
+            </w:tcMar>
+            <w:shd w:fill="D9EAF7"/>
+          </w:tcPr>
+          <w:p>
+            <w:pPr>
+              <w:spacing w:after="0"/>
+            </w:pPr>
+            <w:r>
+              <w:rPr>
+                <w:rFonts w:ascii="Arial" w:hAnsi="Arial"/>
+                <w:b/>
+              </w:rPr>
+              <w:t>4</w:t>
+            </w:r>
+          </w:p>
+        </w:tc>
+        <w:tc>
+          <w:tcPr>
+            <w:tcW w:type="dxa" w:w="1260"/>
+            <w:vAlign w:val="center"/>
+            <w:tcMar>
+              <w:top w:w="40" w:type="dxa"/>
+              <w:start w:w="90" w:type="dxa"/>
+              <w:bottom w:w="40" w:type="dxa"/>
+              <w:end w:w="90" w:type="dxa"/>
+            </w:tcMar>
+            <w:shd w:fill="D9EAF7"/>
+          </w:tcPr>
+          <w:p>
+            <w:pPr>
+              <w:spacing w:after="0"/>
+            </w:pPr>
+            <w:r>
+              <w:rPr>
+                <w:rFonts w:ascii="Arial" w:hAnsi="Arial"/>
+                <w:b/>
+              </w:rPr>
+              <w:t>5</w:t>
+            </w:r>
+          </w:p>
+        </w:tc>
+        <w:tc>
+          <w:tcPr>
+            <w:tcW w:type="dxa" w:w="1260"/>
+            <w:vAlign w:val="center"/>
+            <w:tcMar>
+              <w:top w:w="40" w:type="dxa"/>
+              <w:start w:w="90" w:type="dxa"/>
+              <w:bottom w:w="40" w:type="dxa"/>
+              <w:end w:w="90" w:type="dxa"/>
+            </w:tcMar>
+            <w:shd w:fill="D9EAF7"/>
+          </w:tcPr>
+          <w:p>
+            <w:pPr>
+              <w:spacing w:after="0"/>
+            </w:pPr>
+            <w:r>
+              <w:rPr>
+                <w:rFonts w:ascii="Arial" w:hAnsi="Arial"/>
+                <w:b/>
+              </w:rPr>
+              <w:t>6</w:t>
+            </w:r>
+          </w:p>
+        </w:tc>
+        <w:tc>
+          <w:tcPr>
+            <w:tcW w:type="dxa" w:w="1260"/>
+            <w:vAlign w:val="center"/>
+            <w:tcMar>
+              <w:top w:w="40" w:type="dxa"/>
+              <w:start w:w="90" w:type="dxa"/>
+              <w:bottom w:w="40" w:type="dxa"/>
+              <w:end w:w="90" w:type="dxa"/>
+            </w:tcMar>
+            <w:shd w:fill="D9EAF7"/>
+          </w:tcPr>
+          <w:p>
+            <w:pPr>
+              <w:spacing w:after="0"/>
+            </w:pPr>
+            <w:r>
+              <w:rPr>
+                <w:rFonts w:ascii="Arial" w:hAnsi="Arial"/>
+                <w:b/>
+              </w:rPr>
+              <w:t>7 Fully agree</w:t>
+            </w:r>
+          </w:p>
+        </w:tc>
+      </w:tr>
+      <w:tr>
+        <w:trPr>
+          <w:cantSplit/>
+        </w:trPr>
+        <w:tc>
+          <w:tcPr>
+            <w:tcW w:type="dxa" w:w="1260"/>
+            <w:vAlign w:val="center"/>
+            <w:tcMar>
+              <w:top w:w="40" w:type="dxa"/>
+              <w:start w:w="90" w:type="dxa"/>
+              <w:bottom w:w="40" w:type="dxa"/>
+              <w:end w:w="90" w:type="dxa"/>
+            </w:tcMar>
+          </w:tcPr>
+          <w:p>
+            <w:pPr>
+              <w:spacing w:after="0"/>
+            </w:pPr>
+            <w:r>
+              <w:rPr>
+                <w:rFonts w:ascii="Arial" w:hAnsi="Arial"/>
+                <w:b w:val="0"/>
+              </w:rPr>
+              <w:t>G1. In the computer-generated world I had a sense of “being there.”</w:t>
+            </w:r>
+          </w:p>
+        </w:tc>
+        <w:tc>
+          <w:tcPr>
+            <w:tcW w:type="dxa" w:w="1260"/>
+            <w:vAlign w:val="center"/>
+            <w:tcMar>
+              <w:top w:w="40" w:type="dxa"/>
+              <w:start w:w="90" w:type="dxa"/>
+              <w:bottom w:w="40" w:type="dxa"/>
+              <w:end w:w="90" w:type="dxa"/>
+            </w:tcMar>
+          </w:tcPr>
+          <w:p>
+            <w:pPr>
+              <w:spacing w:after="0"/>
+            </w:pPr>
+            <w:r>
+              <w:rPr>
+                <w:rFonts w:ascii="Arial" w:hAnsi="Arial"/>
+                <w:b w:val="0"/>
+              </w:rPr>
+              <w:t>☐</w:t>
+            </w:r>
+          </w:p>
+        </w:tc>
+        <w:tc>
+          <w:tcPr>
+            <w:tcW w:type="dxa" w:w="1260"/>
+            <w:vAlign w:val="center"/>
+            <w:tcMar>
+              <w:top w:w="40" w:type="dxa"/>
+              <w:start w:w="90" w:type="dxa"/>
+              <w:bottom w:w="40" w:type="dxa"/>
+              <w:end w:w="90" w:type="dxa"/>
+            </w:tcMar>
+          </w:tcPr>
+          <w:p>
+            <w:pPr>
+              <w:spacing w:after="0"/>
+            </w:pPr>
+            <w:r>
+              <w:rPr>
+                <w:rFonts w:ascii="Arial" w:hAnsi="Arial"/>
+                <w:b w:val="0"/>
+              </w:rPr>
+              <w:t>☐</w:t>
+            </w:r>
+          </w:p>
+        </w:tc>
+        <w:tc>
+          <w:tcPr>
+            <w:tcW w:type="dxa" w:w="1260"/>
+            <w:vAlign w:val="center"/>
+            <w:tcMar>
+              <w:top w:w="40" w:type="dxa"/>
+              <w:start w:w="90" w:type="dxa"/>
+              <w:bottom w:w="40" w:type="dxa"/>
+              <w:end w:w="90" w:type="dxa"/>
+            </w:tcMar>
+          </w:tcPr>
+          <w:p>
+            <w:pPr>
+              <w:spacing w:after="0"/>
+            </w:pPr>
+            <w:r>
+              <w:rPr>
+                <w:rFonts w:ascii="Arial" w:hAnsi="Arial"/>
+                <w:b w:val="0"/>
+              </w:rPr>
+              <w:t>☐</w:t>
+            </w:r>
+          </w:p>
+        </w:tc>
+        <w:tc>
+          <w:tcPr>
+            <w:tcW w:type="dxa" w:w="1260"/>
+            <w:vAlign w:val="center"/>
+            <w:tcMar>
+              <w:top w:w="40" w:type="dxa"/>
+              <w:start w:w="90" w:type="dxa"/>
+              <w:bottom w:w="40" w:type="dxa"/>
+              <w:end w:w="90" w:type="dxa"/>
+            </w:tcMar>
+          </w:tcPr>
+          <w:p>
+            <w:pPr>
+              <w:spacing w:after="0"/>
+            </w:pPr>
+            <w:r>
+              <w:rPr>
+                <w:rFonts w:ascii="Arial" w:hAnsi="Arial"/>
+                <w:b w:val="0"/>
+              </w:rPr>
+              <w:t>☐</w:t>
+            </w:r>
+          </w:p>
+        </w:tc>
+        <w:tc>
+          <w:tcPr>
+            <w:tcW w:type="dxa" w:w="1260"/>
+            <w:vAlign w:val="center"/>
+            <w:tcMar>
+              <w:top w:w="40" w:type="dxa"/>
+              <w:start w:w="90" w:type="dxa"/>
+              <w:bottom w:w="40" w:type="dxa"/>
+              <w:end w:w="90" w:type="dxa"/>
+            </w:tcMar>
+          </w:tcPr>
+          <w:p>
+            <w:pPr>
+              <w:spacing w:after="0"/>
+            </w:pPr>
+            <w:r>
+              <w:rPr>
+                <w:rFonts w:ascii="Arial" w:hAnsi="Arial"/>
+                <w:b w:val="0"/>
+              </w:rPr>
+              <w:t>☐</w:t>
+            </w:r>
+          </w:p>
+        </w:tc>
+        <w:tc>
+          <w:tcPr>
+            <w:tcW w:type="dxa" w:w="1260"/>
+            <w:vAlign w:val="center"/>
+            <w:tcMar>
+              <w:top w:w="40" w:type="dxa"/>
+              <w:start w:w="90" w:type="dxa"/>
+              <w:bottom w:w="40" w:type="dxa"/>
+              <w:end w:w="90" w:type="dxa"/>
+            </w:tcMar>
+          </w:tcPr>
+          <w:p>
+            <w:pPr>
+              <w:spacing w:after="0"/>
+            </w:pPr>
+            <w:r>
+              <w:rPr>
+                <w:rFonts w:ascii="Arial" w:hAnsi="Arial"/>
+                <w:b w:val="0"/>
+              </w:rPr>
+              <w:t>☐</w:t>
+            </w:r>
+          </w:p>
+        </w:tc>
+        <w:tc>
+          <w:tcPr>
+            <w:tcW w:type="dxa" w:w="1260"/>
+            <w:vAlign w:val="center"/>
+            <w:tcMar>
+              <w:top w:w="40" w:type="dxa"/>
+              <w:start w:w="90" w:type="dxa"/>
+              <w:bottom w:w="40" w:type="dxa"/>
+              <w:end w:w="90" w:type="dxa"/>
+            </w:tcMar>
+          </w:tcPr>
+          <w:p>
+            <w:pPr>
+              <w:spacing w:after="0"/>
+            </w:pPr>
+            <w:r>
+              <w:rPr>
+                <w:rFonts w:ascii="Arial" w:hAnsi="Arial"/>
+                <w:b w:val="0"/>
+              </w:rPr>
+              <w:t>☐</w:t>
+            </w:r>
+          </w:p>
+        </w:tc>
+      </w:tr>
+      <w:tr>
+        <w:trPr>
+          <w:cantSplit/>
+        </w:trPr>
+        <w:tc>
+          <w:tcPr>
+            <w:tcW w:type="dxa" w:w="1260"/>
+            <w:vAlign w:val="center"/>
+            <w:tcMar>
+              <w:top w:w="40" w:type="dxa"/>
+              <w:start w:w="90" w:type="dxa"/>
+              <w:bottom w:w="40" w:type="dxa"/>
+              <w:end w:w="90" w:type="dxa"/>
+            </w:tcMar>
+          </w:tcPr>
+          <w:p>
+            <w:pPr>
+              <w:spacing w:after="0"/>
+            </w:pPr>
+            <w:r>
+              <w:rPr>
+                <w:rFonts w:ascii="Arial" w:hAnsi="Arial"/>
+                <w:b w:val="0"/>
+              </w:rPr>
+              <w:t>SP1. Somehow I felt that the virtual world surrounded me.</w:t>
+            </w:r>
+          </w:p>
+        </w:tc>
+        <w:tc>
+          <w:tcPr>
+            <w:tcW w:type="dxa" w:w="1260"/>
+            <w:vAlign w:val="center"/>
+            <w:tcMar>
+              <w:top w:w="40" w:type="dxa"/>
+              <w:start w:w="90" w:type="dxa"/>
+              <w:bottom w:w="40" w:type="dxa"/>
+              <w:end w:w="90" w:type="dxa"/>
+            </w:tcMar>
+          </w:tcPr>
+          <w:p>
+            <w:pPr>
+              <w:spacing w:after="0"/>
+            </w:pPr>
+            <w:r>
+              <w:rPr>
+                <w:rFonts w:ascii="Arial" w:hAnsi="Arial"/>
+                <w:b w:val="0"/>
+              </w:rPr>
+              <w:t>☐</w:t>
+            </w:r>
+          </w:p>
+        </w:tc>
+        <w:tc>
+          <w:tcPr>
+            <w:tcW w:type="dxa" w:w="1260"/>
+            <w:vAlign w:val="center"/>
+            <w:tcMar>
+              <w:top w:w="40" w:type="dxa"/>
+              <w:start w:w="90" w:type="dxa"/>
+              <w:bottom w:w="40" w:type="dxa"/>
+              <w:end w:w="90" w:type="dxa"/>
+            </w:tcMar>
+          </w:tcPr>
+          <w:p>
+            <w:pPr>
+              <w:spacing w:after="0"/>
+            </w:pPr>
+            <w:r>
+              <w:rPr>
+                <w:rFonts w:ascii="Arial" w:hAnsi="Arial"/>
+                <w:b w:val="0"/>
+              </w:rPr>
+              <w:t>☐</w:t>
+            </w:r>
+          </w:p>
+        </w:tc>
+        <w:tc>
+          <w:tcPr>
+            <w:tcW w:type="dxa" w:w="1260"/>
+            <w:vAlign w:val="center"/>
+            <w:tcMar>
+              <w:top w:w="40" w:type="dxa"/>
+              <w:start w:w="90" w:type="dxa"/>
+              <w:bottom w:w="40" w:type="dxa"/>
+              <w:end w:w="90" w:type="dxa"/>
+            </w:tcMar>
+          </w:tcPr>
+          <w:p>
+            <w:pPr>
+              <w:spacing w:after="0"/>
+            </w:pPr>
+            <w:r>
+              <w:rPr>
+                <w:rFonts w:ascii="Arial" w:hAnsi="Arial"/>
+                <w:b w:val="0"/>
+              </w:rPr>
+              <w:t>☐</w:t>
+            </w:r>
+          </w:p>
+        </w:tc>
+        <w:tc>
+          <w:tcPr>
+            <w:tcW w:type="dxa" w:w="1260"/>
+            <w:vAlign w:val="center"/>
+            <w:tcMar>
+              <w:top w:w="40" w:type="dxa"/>
+              <w:start w:w="90" w:type="dxa"/>
+              <w:bottom w:w="40" w:type="dxa"/>
+              <w:end w:w="90" w:type="dxa"/>
+            </w:tcMar>
+          </w:tcPr>
+          <w:p>
+            <w:pPr>
+              <w:spacing w:after="0"/>
+            </w:pPr>
+            <w:r>
+              <w:rPr>
+                <w:rFonts w:ascii="Arial" w:hAnsi="Arial"/>
+                <w:b w:val="0"/>
+              </w:rPr>
+              <w:t>☐</w:t>
+            </w:r>
+          </w:p>
+        </w:tc>
+        <w:tc>
+          <w:tcPr>
+            <w:tcW w:type="dxa" w:w="1260"/>
+            <w:vAlign w:val="center"/>
+            <w:tcMar>
+              <w:top w:w="40" w:type="dxa"/>
+              <w:start w:w="90" w:type="dxa"/>
+              <w:bottom w:w="40" w:type="dxa"/>
+              <w:end w:w="90" w:type="dxa"/>
+            </w:tcMar>
+          </w:tcPr>
+          <w:p>
+            <w:pPr>
+              <w:spacing w:after="0"/>
+            </w:pPr>
+            <w:r>
+              <w:rPr>
+                <w:rFonts w:ascii="Arial" w:hAnsi="Arial"/>
+                <w:b w:val="0"/>
+              </w:rPr>
+              <w:t>☐</w:t>
+            </w:r>
+          </w:p>
+        </w:tc>
+        <w:tc>
+          <w:tcPr>
+            <w:tcW w:type="dxa" w:w="1260"/>
+            <w:vAlign w:val="center"/>
+            <w:tcMar>
+              <w:top w:w="40" w:type="dxa"/>
+              <w:start w:w="90" w:type="dxa"/>
+              <w:bottom w:w="40" w:type="dxa"/>
+              <w:end w:w="90" w:type="dxa"/>
+            </w:tcMar>
+          </w:tcPr>
+          <w:p>
+            <w:pPr>
+              <w:spacing w:after="0"/>
+            </w:pPr>
+            <w:r>
+              <w:rPr>
+                <w:rFonts w:ascii="Arial" w:hAnsi="Arial"/>
+                <w:b w:val="0"/>
+              </w:rPr>
+              <w:t>☐</w:t>
+            </w:r>
+          </w:p>
+        </w:tc>
+        <w:tc>
+          <w:tcPr>
+            <w:tcW w:type="dxa" w:w="1260"/>
+            <w:vAlign w:val="center"/>
+            <w:tcMar>
+              <w:top w:w="40" w:type="dxa"/>
+              <w:start w:w="90" w:type="dxa"/>
+              <w:bottom w:w="40" w:type="dxa"/>
+              <w:end w:w="90" w:type="dxa"/>
+            </w:tcMar>
+          </w:tcPr>
+          <w:p>
+            <w:pPr>
+              <w:spacing w:after="0"/>
+            </w:pPr>
+            <w:r>
+              <w:rPr>
+                <w:rFonts w:ascii="Arial" w:hAnsi="Arial"/>
+                <w:b w:val="0"/>
+              </w:rPr>
+              <w:t>☐</w:t>
+            </w:r>
+          </w:p>
+        </w:tc>
+      </w:tr>
+      <w:tr>
+        <w:trPr>
+          <w:cantSplit/>
+        </w:trPr>
+        <w:tc>
+          <w:tcPr>
+            <w:tcW w:type="dxa" w:w="1260"/>
+            <w:vAlign w:val="center"/>
+            <w:tcMar>
+              <w:top w:w="40" w:type="dxa"/>
+              <w:start w:w="90" w:type="dxa"/>
+              <w:bottom w:w="40" w:type="dxa"/>
+              <w:end w:w="90" w:type="dxa"/>
+            </w:tcMar>
+          </w:tcPr>
+          <w:p>
+            <w:pPr>
+              <w:spacing w:after="0"/>
+            </w:pPr>
+            <w:r>
+              <w:rPr>
+                <w:rFonts w:ascii="Arial" w:hAnsi="Arial"/>
+                <w:b w:val="0"/>
+              </w:rPr>
+              <w:t>SP2. I felt like I was just perceiving pictures.</w:t>
+            </w:r>
+          </w:p>
+        </w:tc>
+        <w:tc>
+          <w:tcPr>
+            <w:tcW w:type="dxa" w:w="1260"/>
+            <w:vAlign w:val="center"/>
+            <w:tcMar>
+              <w:top w:w="40" w:type="dxa"/>
+              <w:start w:w="90" w:type="dxa"/>
+              <w:bottom w:w="40" w:type="dxa"/>
+              <w:end w:w="90" w:type="dxa"/>
+            </w:tcMar>
+          </w:tcPr>
+          <w:p>
+            <w:pPr>
+              <w:spacing w:after="0"/>
+            </w:pPr>
+            <w:r>
+              <w:rPr>
+                <w:rFonts w:ascii="Arial" w:hAnsi="Arial"/>
+                <w:b w:val="0"/>
+              </w:rPr>
+              <w:t>☐</w:t>
+            </w:r>
+          </w:p>
+        </w:tc>
+        <w:tc>
+          <w:tcPr>
+            <w:tcW w:type="dxa" w:w="1260"/>
+            <w:vAlign w:val="center"/>
+            <w:tcMar>
+              <w:top w:w="40" w:type="dxa"/>
+              <w:start w:w="90" w:type="dxa"/>
+              <w:bottom w:w="40" w:type="dxa"/>
+              <w:end w:w="90" w:type="dxa"/>
+            </w:tcMar>
+          </w:tcPr>
+          <w:p>
+            <w:pPr>
+              <w:spacing w:after="0"/>
+            </w:pPr>
+            <w:r>
+              <w:rPr>
+                <w:rFonts w:ascii="Arial" w:hAnsi="Arial"/>
+                <w:b w:val="0"/>
+              </w:rPr>
+              <w:t>☐</w:t>
+            </w:r>
+          </w:p>
+        </w:tc>
+        <w:tc>
+          <w:tcPr>
+            <w:tcW w:type="dxa" w:w="1260"/>
+            <w:vAlign w:val="center"/>
+            <w:tcMar>
+              <w:top w:w="40" w:type="dxa"/>
+              <w:start w:w="90" w:type="dxa"/>
+              <w:bottom w:w="40" w:type="dxa"/>
+              <w:end w:w="90" w:type="dxa"/>
+            </w:tcMar>
+          </w:tcPr>
+          <w:p>
+            <w:pPr>
+              <w:spacing w:after="0"/>
+            </w:pPr>
+            <w:r>
+              <w:rPr>
+                <w:rFonts w:ascii="Arial" w:hAnsi="Arial"/>
+                <w:b w:val="0"/>
+              </w:rPr>
+              <w:t>☐</w:t>
+            </w:r>
+          </w:p>
+        </w:tc>
+        <w:tc>
+          <w:tcPr>
+            <w:tcW w:type="dxa" w:w="1260"/>
+            <w:vAlign w:val="center"/>
+            <w:tcMar>
+              <w:top w:w="40" w:type="dxa"/>
+              <w:start w:w="90" w:type="dxa"/>
+              <w:bottom w:w="40" w:type="dxa"/>
+              <w:end w:w="90" w:type="dxa"/>
+            </w:tcMar>
+          </w:tcPr>
+          <w:p>
+            <w:pPr>
+              <w:spacing w:after="0"/>
+            </w:pPr>
+            <w:r>
+              <w:rPr>
+                <w:rFonts w:ascii="Arial" w:hAnsi="Arial"/>
+                <w:b w:val="0"/>
+              </w:rPr>
+              <w:t>☐</w:t>
+            </w:r>
+          </w:p>
+        </w:tc>
+        <w:tc>
+          <w:tcPr>
+            <w:tcW w:type="dxa" w:w="1260"/>
+            <w:vAlign w:val="center"/>
+            <w:tcMar>
+              <w:top w:w="40" w:type="dxa"/>
+              <w:start w:w="90" w:type="dxa"/>
+              <w:bottom w:w="40" w:type="dxa"/>
+              <w:end w:w="90" w:type="dxa"/>
+            </w:tcMar>
+          </w:tcPr>
+          <w:p>
+            <w:pPr>
+              <w:spacing w:after="0"/>
+            </w:pPr>
+            <w:r>
+              <w:rPr>
+                <w:rFonts w:ascii="Arial" w:hAnsi="Arial"/>
+                <w:b w:val="0"/>
+              </w:rPr>
+              <w:t>☐</w:t>
+            </w:r>
+          </w:p>
+        </w:tc>
+        <w:tc>
+          <w:tcPr>
+            <w:tcW w:type="dxa" w:w="1260"/>
+            <w:vAlign w:val="center"/>
+            <w:tcMar>
+              <w:top w:w="40" w:type="dxa"/>
+              <w:start w:w="90" w:type="dxa"/>
+              <w:bottom w:w="40" w:type="dxa"/>
+              <w:end w:w="90" w:type="dxa"/>
+            </w:tcMar>
+          </w:tcPr>
+          <w:p>
+            <w:pPr>
+              <w:spacing w:after="0"/>
+            </w:pPr>
+            <w:r>
+              <w:rPr>
+                <w:rFonts w:ascii="Arial" w:hAnsi="Arial"/>
+                <w:b w:val="0"/>
+              </w:rPr>
+              <w:t>☐</w:t>
+            </w:r>
+          </w:p>
+        </w:tc>
+        <w:tc>
+          <w:tcPr>
+            <w:tcW w:type="dxa" w:w="1260"/>
+            <w:vAlign w:val="center"/>
+            <w:tcMar>
+              <w:top w:w="40" w:type="dxa"/>
+              <w:start w:w="90" w:type="dxa"/>
+              <w:bottom w:w="40" w:type="dxa"/>
+              <w:end w:w="90" w:type="dxa"/>
+            </w:tcMar>
+          </w:tcPr>
+          <w:p>
+            <w:pPr>
+              <w:spacing w:after="0"/>
+            </w:pPr>
+            <w:r>
+              <w:rPr>
+                <w:rFonts w:ascii="Arial" w:hAnsi="Arial"/>
+                <w:b w:val="0"/>
+              </w:rPr>
+              <w:t>☐</w:t>
+            </w:r>
+          </w:p>
+        </w:tc>
+      </w:tr>
+      <w:tr>
+        <w:trPr>
+          <w:cantSplit/>
+        </w:trPr>
+        <w:tc>
+          <w:tcPr>
+            <w:tcW w:type="dxa" w:w="1260"/>
+            <w:vAlign w:val="center"/>
+            <w:tcMar>
+              <w:top w:w="40" w:type="dxa"/>
+              <w:start w:w="90" w:type="dxa"/>
+              <w:bottom w:w="40" w:type="dxa"/>
+              <w:end w:w="90" w:type="dxa"/>
+            </w:tcMar>
+          </w:tcPr>
+          <w:p>
+            <w:pPr>
+              <w:spacing w:after="0"/>
+            </w:pPr>
+            <w:r>
+              <w:rPr>
+                <w:rFonts w:ascii="Arial" w:hAnsi="Arial"/>
+                <w:b w:val="0"/>
+              </w:rPr>
+              <w:t>SP3. I did not feel present in the virtual space.</w:t>
+            </w:r>
+          </w:p>
+        </w:tc>
+        <w:tc>
+          <w:tcPr>
+            <w:tcW w:type="dxa" w:w="1260"/>
+            <w:vAlign w:val="center"/>
+            <w:tcMar>
+              <w:top w:w="40" w:type="dxa"/>
+              <w:start w:w="90" w:type="dxa"/>
+              <w:bottom w:w="40" w:type="dxa"/>
+              <w:end w:w="90" w:type="dxa"/>
+            </w:tcMar>
+          </w:tcPr>
+          <w:p>
+            <w:pPr>
+              <w:spacing w:after="0"/>
+            </w:pPr>
+            <w:r>
+              <w:rPr>
+                <w:rFonts w:ascii="Arial" w:hAnsi="Arial"/>
+                <w:b w:val="0"/>
+              </w:rPr>
+              <w:t>☐</w:t>
+            </w:r>
+          </w:p>
+        </w:tc>
+        <w:tc>
+          <w:tcPr>
+            <w:tcW w:type="dxa" w:w="1260"/>
+            <w:vAlign w:val="center"/>
+            <w:tcMar>
+              <w:top w:w="40" w:type="dxa"/>
+              <w:start w:w="90" w:type="dxa"/>
+              <w:bottom w:w="40" w:type="dxa"/>
+              <w:end w:w="90" w:type="dxa"/>
+            </w:tcMar>
+          </w:tcPr>
+          <w:p>
+            <w:pPr>
+              <w:spacing w:after="0"/>
+            </w:pPr>
+            <w:r>
+              <w:rPr>
+                <w:rFonts w:ascii="Arial" w:hAnsi="Arial"/>
+                <w:b w:val="0"/>
+              </w:rPr>
+              <w:t>☐</w:t>
+            </w:r>
+          </w:p>
+        </w:tc>
+        <w:tc>
+          <w:tcPr>
+            <w:tcW w:type="dxa" w:w="1260"/>
+            <w:vAlign w:val="center"/>
+            <w:tcMar>
+              <w:top w:w="40" w:type="dxa"/>
+              <w:start w:w="90" w:type="dxa"/>
+              <w:bottom w:w="40" w:type="dxa"/>
+              <w:end w:w="90" w:type="dxa"/>
+            </w:tcMar>
+          </w:tcPr>
+          <w:p>
+            <w:pPr>
+              <w:spacing w:after="0"/>
+            </w:pPr>
+            <w:r>
+              <w:rPr>
+                <w:rFonts w:ascii="Arial" w:hAnsi="Arial"/>
+                <w:b w:val="0"/>
+              </w:rPr>
+              <w:t>☐</w:t>
+            </w:r>
+          </w:p>
+        </w:tc>
+        <w:tc>
+          <w:tcPr>
+            <w:tcW w:type="dxa" w:w="1260"/>
+            <w:vAlign w:val="center"/>
+            <w:tcMar>
+              <w:top w:w="40" w:type="dxa"/>
+              <w:start w:w="90" w:type="dxa"/>
+              <w:bottom w:w="40" w:type="dxa"/>
+              <w:end w:w="90" w:type="dxa"/>
+            </w:tcMar>
+          </w:tcPr>
+          <w:p>
+            <w:pPr>
+              <w:spacing w:after="0"/>
+            </w:pPr>
+            <w:r>
+              <w:rPr>
+                <w:rFonts w:ascii="Arial" w:hAnsi="Arial"/>
+                <w:b w:val="0"/>
+              </w:rPr>
+              <w:t>☐</w:t>
+            </w:r>
+          </w:p>
+        </w:tc>
+        <w:tc>
+          <w:tcPr>
+            <w:tcW w:type="dxa" w:w="1260"/>
+            <w:vAlign w:val="center"/>
+            <w:tcMar>
+              <w:top w:w="40" w:type="dxa"/>
+              <w:start w:w="90" w:type="dxa"/>
+              <w:bottom w:w="40" w:type="dxa"/>
+              <w:end w:w="90" w:type="dxa"/>
+            </w:tcMar>
+          </w:tcPr>
+          <w:p>
+            <w:pPr>
+              <w:spacing w:after="0"/>
+            </w:pPr>
+            <w:r>
+              <w:rPr>
+                <w:rFonts w:ascii="Arial" w:hAnsi="Arial"/>
+                <w:b w:val="0"/>
+              </w:rPr>
+              <w:t>☐</w:t>
+            </w:r>
+          </w:p>
+        </w:tc>
+        <w:tc>
+          <w:tcPr>
+            <w:tcW w:type="dxa" w:w="1260"/>
+            <w:vAlign w:val="center"/>
+            <w:tcMar>
+              <w:top w:w="40" w:type="dxa"/>
+              <w:start w:w="90" w:type="dxa"/>
+              <w:bottom w:w="40" w:type="dxa"/>
+              <w:end w:w="90" w:type="dxa"/>
+            </w:tcMar>
+          </w:tcPr>
+          <w:p>
+            <w:pPr>
+              <w:spacing w:after="0"/>
+            </w:pPr>
+            <w:r>
+              <w:rPr>
+                <w:rFonts w:ascii="Arial" w:hAnsi="Arial"/>
+                <w:b w:val="0"/>
+              </w:rPr>
+              <w:t>☐</w:t>
+            </w:r>
+          </w:p>
+        </w:tc>
+        <w:tc>
+          <w:tcPr>
+            <w:tcW w:type="dxa" w:w="1260"/>
+            <w:vAlign w:val="center"/>
+            <w:tcMar>
+              <w:top w:w="40" w:type="dxa"/>
+              <w:start w:w="90" w:type="dxa"/>
+              <w:bottom w:w="40" w:type="dxa"/>
+              <w:end w:w="90" w:type="dxa"/>
+            </w:tcMar>
+          </w:tcPr>
+          <w:p>
+            <w:pPr>
+              <w:spacing w:after="0"/>
+            </w:pPr>
+            <w:r>
+              <w:rPr>
+                <w:rFonts w:ascii="Arial" w:hAnsi="Arial"/>
+                <w:b w:val="0"/>
+              </w:rPr>
+              <w:t>☐</w:t>
+            </w:r>
+          </w:p>
+        </w:tc>
+      </w:tr>
+      <w:tr>
+        <w:trPr>
+          <w:cantSplit/>
+        </w:trPr>
+        <w:tc>
+          <w:tcPr>
+            <w:tcW w:type="dxa" w:w="1260"/>
+            <w:vAlign w:val="center"/>
+            <w:tcMar>
+              <w:top w:w="40" w:type="dxa"/>
+              <w:start w:w="90" w:type="dxa"/>
+              <w:bottom w:w="40" w:type="dxa"/>
+              <w:end w:w="90" w:type="dxa"/>
+            </w:tcMar>
+          </w:tcPr>
+          <w:p>
+            <w:pPr>
+              <w:spacing w:after="0"/>
+            </w:pPr>
+            <w:r>
+              <w:rPr>
+                <w:rFonts w:ascii="Arial" w:hAnsi="Arial"/>
+                <w:b w:val="0"/>
+              </w:rPr>
+              <w:t>SP4. I had a sense of acting in the virtual space, rather than operating something from outside.</w:t>
+            </w:r>
+          </w:p>
+        </w:tc>
+        <w:tc>
+          <w:tcPr>
+            <w:tcW w:type="dxa" w:w="1260"/>
+            <w:vAlign w:val="center"/>
+            <w:tcMar>
+              <w:top w:w="40" w:type="dxa"/>
+              <w:start w:w="90" w:type="dxa"/>
+              <w:bottom w:w="40" w:type="dxa"/>
+              <w:end w:w="90" w:type="dxa"/>
+            </w:tcMar>
+          </w:tcPr>
+          <w:p>
+            <w:pPr>
+              <w:spacing w:after="0"/>
+            </w:pPr>
+            <w:r>
+              <w:rPr>
+                <w:rFonts w:ascii="Arial" w:hAnsi="Arial"/>
+                <w:b w:val="0"/>
+              </w:rPr>
+              <w:t>☐</w:t>
+            </w:r>
+          </w:p>
+        </w:tc>
+        <w:tc>
+          <w:tcPr>
+            <w:tcW w:type="dxa" w:w="1260"/>
+            <w:vAlign w:val="center"/>
+            <w:tcMar>
+              <w:top w:w="40" w:type="dxa"/>
+              <w:start w:w="90" w:type="dxa"/>
+              <w:bottom w:w="40" w:type="dxa"/>
+              <w:end w:w="90" w:type="dxa"/>
+            </w:tcMar>
+          </w:tcPr>
+          <w:p>
+            <w:pPr>
+              <w:spacing w:after="0"/>
+            </w:pPr>
+            <w:r>
+              <w:rPr>
+                <w:rFonts w:ascii="Arial" w:hAnsi="Arial"/>
+                <w:b w:val="0"/>
+              </w:rPr>
+              <w:t>☐</w:t>
+            </w:r>
+          </w:p>
+        </w:tc>
+        <w:tc>
+          <w:tcPr>
+            <w:tcW w:type="dxa" w:w="1260"/>
+            <w:vAlign w:val="center"/>
+            <w:tcMar>
+              <w:top w:w="40" w:type="dxa"/>
+              <w:start w:w="90" w:type="dxa"/>
+              <w:bottom w:w="40" w:type="dxa"/>
+              <w:end w:w="90" w:type="dxa"/>
+            </w:tcMar>
+          </w:tcPr>
+          <w:p>
+            <w:pPr>
+              <w:spacing w:after="0"/>
+            </w:pPr>
+            <w:r>
+              <w:rPr>
+                <w:rFonts w:ascii="Arial" w:hAnsi="Arial"/>
+                <w:b w:val="0"/>
+              </w:rPr>
+              <w:t>☐</w:t>
+            </w:r>
+          </w:p>
+        </w:tc>
+        <w:tc>
+          <w:tcPr>
+            <w:tcW w:type="dxa" w:w="1260"/>
+            <w:vAlign w:val="center"/>
+            <w:tcMar>
+              <w:top w:w="40" w:type="dxa"/>
+              <w:start w:w="90" w:type="dxa"/>
+              <w:bottom w:w="40" w:type="dxa"/>
+              <w:end w:w="90" w:type="dxa"/>
+            </w:tcMar>
+          </w:tcPr>
+          <w:p>
+            <w:pPr>
+              <w:spacing w:after="0"/>
+            </w:pPr>
+            <w:r>
+              <w:rPr>
+                <w:rFonts w:ascii="Arial" w:hAnsi="Arial"/>
+                <w:b w:val="0"/>
+              </w:rPr>
+              <w:t>☐</w:t>
+            </w:r>
+          </w:p>
+        </w:tc>
+        <w:tc>
+          <w:tcPr>
+            <w:tcW w:type="dxa" w:w="1260"/>
+            <w:vAlign w:val="center"/>
+            <w:tcMar>
+              <w:top w:w="40" w:type="dxa"/>
+              <w:start w:w="90" w:type="dxa"/>
+              <w:bottom w:w="40" w:type="dxa"/>
+              <w:end w:w="90" w:type="dxa"/>
+            </w:tcMar>
+          </w:tcPr>
+          <w:p>
+            <w:pPr>
+              <w:spacing w:after="0"/>
+            </w:pPr>
+            <w:r>
+              <w:rPr>
+                <w:rFonts w:ascii="Arial" w:hAnsi="Arial"/>
+                <w:b w:val="0"/>
+              </w:rPr>
+              <w:t>☐</w:t>
+            </w:r>
+          </w:p>
+        </w:tc>
+        <w:tc>
+          <w:tcPr>
+            <w:tcW w:type="dxa" w:w="1260"/>
+            <w:vAlign w:val="center"/>
+            <w:tcMar>
+              <w:top w:w="40" w:type="dxa"/>
+              <w:start w:w="90" w:type="dxa"/>
+              <w:bottom w:w="40" w:type="dxa"/>
+              <w:end w:w="90" w:type="dxa"/>
+            </w:tcMar>
+          </w:tcPr>
+          <w:p>
+            <w:pPr>
+              <w:spacing w:after="0"/>
+            </w:pPr>
+            <w:r>
+              <w:rPr>
+                <w:rFonts w:ascii="Arial" w:hAnsi="Arial"/>
+                <w:b w:val="0"/>
+              </w:rPr>
+              <w:t>☐</w:t>
+            </w:r>
+          </w:p>
+        </w:tc>
+        <w:tc>
+          <w:tcPr>
+            <w:tcW w:type="dxa" w:w="1260"/>
+            <w:vAlign w:val="center"/>
+            <w:tcMar>
+              <w:top w:w="40" w:type="dxa"/>
+              <w:start w:w="90" w:type="dxa"/>
+              <w:bottom w:w="40" w:type="dxa"/>
+              <w:end w:w="90" w:type="dxa"/>
+            </w:tcMar>
+          </w:tcPr>
+          <w:p>
+            <w:pPr>
+              <w:spacing w:after="0"/>
+            </w:pPr>
+            <w:r>
+              <w:rPr>
+                <w:rFonts w:ascii="Arial" w:hAnsi="Arial"/>
+                <w:b w:val="0"/>
+              </w:rPr>
+              <w:t>☐</w:t>
+            </w:r>
+          </w:p>
+        </w:tc>
+      </w:tr>
+      <w:tr>
+        <w:trPr>
+          <w:cantSplit/>
+        </w:trPr>
+        <w:tc>
+          <w:tcPr>
+            <w:tcW w:type="dxa" w:w="1260"/>
+            <w:vAlign w:val="center"/>
+            <w:tcMar>
+              <w:top w:w="40" w:type="dxa"/>
+              <w:start w:w="90" w:type="dxa"/>
+              <w:bottom w:w="40" w:type="dxa"/>
+              <w:end w:w="90" w:type="dxa"/>
+            </w:tcMar>
+          </w:tcPr>
+          <w:p>
+            <w:pPr>
+              <w:spacing w:after="0"/>
+            </w:pPr>
+            <w:r>
+              <w:rPr>
+                <w:rFonts w:ascii="Arial" w:hAnsi="Arial"/>
+                <w:b w:val="0"/>
+              </w:rPr>
+              <w:t>SP5. I felt present in the virtual space.</w:t>
+            </w:r>
+          </w:p>
+        </w:tc>
+        <w:tc>
+          <w:tcPr>
+            <w:tcW w:type="dxa" w:w="1260"/>
+            <w:vAlign w:val="center"/>
+            <w:tcMar>
+              <w:top w:w="40" w:type="dxa"/>
+              <w:start w:w="90" w:type="dxa"/>
+              <w:bottom w:w="40" w:type="dxa"/>
+              <w:end w:w="90" w:type="dxa"/>
+            </w:tcMar>
+          </w:tcPr>
+          <w:p>
+            <w:pPr>
+              <w:spacing w:after="0"/>
+            </w:pPr>
+            <w:r>
+              <w:rPr>
+                <w:rFonts w:ascii="Arial" w:hAnsi="Arial"/>
+                <w:b w:val="0"/>
+              </w:rPr>
+              <w:t>☐</w:t>
+            </w:r>
+          </w:p>
+        </w:tc>
+        <w:tc>
+          <w:tcPr>
+            <w:tcW w:type="dxa" w:w="1260"/>
+            <w:vAlign w:val="center"/>
+            <w:tcMar>
+              <w:top w:w="40" w:type="dxa"/>
+              <w:start w:w="90" w:type="dxa"/>
+              <w:bottom w:w="40" w:type="dxa"/>
+              <w:end w:w="90" w:type="dxa"/>
+            </w:tcMar>
+          </w:tcPr>
+          <w:p>
+            <w:pPr>
+              <w:spacing w:after="0"/>
+            </w:pPr>
+            <w:r>
+              <w:rPr>
+                <w:rFonts w:ascii="Arial" w:hAnsi="Arial"/>
+                <w:b w:val="0"/>
+              </w:rPr>
+              <w:t>☐</w:t>
+            </w:r>
+          </w:p>
+        </w:tc>
+        <w:tc>
+          <w:tcPr>
+            <w:tcW w:type="dxa" w:w="1260"/>
+            <w:vAlign w:val="center"/>
+            <w:tcMar>
+              <w:top w:w="40" w:type="dxa"/>
+              <w:start w:w="90" w:type="dxa"/>
+              <w:bottom w:w="40" w:type="dxa"/>
+              <w:end w:w="90" w:type="dxa"/>
+            </w:tcMar>
+          </w:tcPr>
+          <w:p>
+            <w:pPr>
+              <w:spacing w:after="0"/>
+            </w:pPr>
+            <w:r>
+              <w:rPr>
+                <w:rFonts w:ascii="Arial" w:hAnsi="Arial"/>
+                <w:b w:val="0"/>
+              </w:rPr>
+              <w:t>☐</w:t>
+            </w:r>
+          </w:p>
+        </w:tc>
+        <w:tc>
+          <w:tcPr>
+            <w:tcW w:type="dxa" w:w="1260"/>
+            <w:vAlign w:val="center"/>
+            <w:tcMar>
+              <w:top w:w="40" w:type="dxa"/>
+              <w:start w:w="90" w:type="dxa"/>
+              <w:bottom w:w="40" w:type="dxa"/>
+              <w:end w:w="90" w:type="dxa"/>
+            </w:tcMar>
+          </w:tcPr>
+          <w:p>
+            <w:pPr>
+              <w:spacing w:after="0"/>
+            </w:pPr>
+            <w:r>
+              <w:rPr>
+                <w:rFonts w:ascii="Arial" w:hAnsi="Arial"/>
+                <w:b w:val="0"/>
+              </w:rPr>
+              <w:t>☐</w:t>
+            </w:r>
+          </w:p>
+        </w:tc>
+        <w:tc>
+          <w:tcPr>
+            <w:tcW w:type="dxa" w:w="1260"/>
+            <w:vAlign w:val="center"/>
+            <w:tcMar>
+              <w:top w:w="40" w:type="dxa"/>
+              <w:start w:w="90" w:type="dxa"/>
+              <w:bottom w:w="40" w:type="dxa"/>
+              <w:end w:w="90" w:type="dxa"/>
+            </w:tcMar>
+          </w:tcPr>
+          <w:p>
+            <w:pPr>
+              <w:spacing w:after="0"/>
+            </w:pPr>
+            <w:r>
+              <w:rPr>
+                <w:rFonts w:ascii="Arial" w:hAnsi="Arial"/>
+                <w:b w:val="0"/>
+              </w:rPr>
+              <w:t>☐</w:t>
+            </w:r>
+          </w:p>
+        </w:tc>
+        <w:tc>
+          <w:tcPr>
+            <w:tcW w:type="dxa" w:w="1260"/>
+            <w:vAlign w:val="center"/>
+            <w:tcMar>
+              <w:top w:w="40" w:type="dxa"/>
+              <w:start w:w="90" w:type="dxa"/>
+              <w:bottom w:w="40" w:type="dxa"/>
+              <w:end w:w="90" w:type="dxa"/>
+            </w:tcMar>
+          </w:tcPr>
+          <w:p>
+            <w:pPr>
+              <w:spacing w:after="0"/>
+            </w:pPr>
+            <w:r>
+              <w:rPr>
+                <w:rFonts w:ascii="Arial" w:hAnsi="Arial"/>
+                <w:b w:val="0"/>
+              </w:rPr>
+              <w:t>☐</w:t>
+            </w:r>
+          </w:p>
+        </w:tc>
+        <w:tc>
+          <w:tcPr>
+            <w:tcW w:type="dxa" w:w="1260"/>
+            <w:vAlign w:val="center"/>
+            <w:tcMar>
+              <w:top w:w="40" w:type="dxa"/>
+              <w:start w:w="90" w:type="dxa"/>
+              <w:bottom w:w="40" w:type="dxa"/>
+              <w:end w:w="90" w:type="dxa"/>
+            </w:tcMar>
+          </w:tcPr>
+          <w:p>
+            <w:pPr>
+              <w:spacing w:after="0"/>
+            </w:pPr>
+            <w:r>
+              <w:rPr>
+                <w:rFonts w:ascii="Arial" w:hAnsi="Arial"/>
+                <w:b w:val="0"/>
+              </w:rPr>
+              <w:t>☐</w:t>
+            </w:r>
+          </w:p>
+        </w:tc>
+      </w:tr>
+      <w:tr>
+        <w:trPr>
+          <w:cantSplit/>
+        </w:trPr>
+        <w:tc>
+          <w:tcPr>
+            <w:tcW w:type="dxa" w:w="1260"/>
+            <w:vAlign w:val="center"/>
+            <w:tcMar>
+              <w:top w:w="40" w:type="dxa"/>
+              <w:start w:w="90" w:type="dxa"/>
+              <w:bottom w:w="40" w:type="dxa"/>
+              <w:end w:w="90" w:type="dxa"/>
+            </w:tcMar>
+          </w:tcPr>
+          <w:p>
+            <w:pPr>
+              <w:spacing w:after="0"/>
+            </w:pPr>
+            <w:r>
+              <w:rPr>
+                <w:rFonts w:ascii="Arial" w:hAnsi="Arial"/>
+                <w:b w:val="0"/>
+              </w:rPr>
+              <w:t>INV1. How aware were you of the real world surrounding you while in the virtual world (sounds, room temperature, other people, etc.)?</w:t>
+            </w:r>
+          </w:p>
+        </w:tc>
+        <w:tc>
+          <w:tcPr>
+            <w:tcW w:type="dxa" w:w="1260"/>
+            <w:vAlign w:val="center"/>
+            <w:tcMar>
+              <w:top w:w="40" w:type="dxa"/>
+              <w:start w:w="90" w:type="dxa"/>
+              <w:bottom w:w="40" w:type="dxa"/>
+              <w:end w:w="90" w:type="dxa"/>
+            </w:tcMar>
+          </w:tcPr>
+          <w:p>
+            <w:pPr>
+              <w:spacing w:after="0"/>
+            </w:pPr>
+            <w:r>
+              <w:rPr>
+                <w:rFonts w:ascii="Arial" w:hAnsi="Arial"/>
+                <w:b w:val="0"/>
+              </w:rPr>
+              <w:t>☐</w:t>
+            </w:r>
+          </w:p>
+        </w:tc>
+        <w:tc>
+          <w:tcPr>
+            <w:tcW w:type="dxa" w:w="1260"/>
+            <w:vAlign w:val="center"/>
+            <w:tcMar>
+              <w:top w:w="40" w:type="dxa"/>
+              <w:start w:w="90" w:type="dxa"/>
+              <w:bottom w:w="40" w:type="dxa"/>
+              <w:end w:w="90" w:type="dxa"/>
+            </w:tcMar>
+          </w:tcPr>
+          <w:p>
+            <w:pPr>
+              <w:spacing w:after="0"/>
+            </w:pPr>
+            <w:r>
+              <w:rPr>
+                <w:rFonts w:ascii="Arial" w:hAnsi="Arial"/>
+                <w:b w:val="0"/>
+              </w:rPr>
+              <w:t>☐</w:t>
+            </w:r>
+          </w:p>
+        </w:tc>
+        <w:tc>
+          <w:tcPr>
+            <w:tcW w:type="dxa" w:w="1260"/>
+            <w:vAlign w:val="center"/>
+            <w:tcMar>
+              <w:top w:w="40" w:type="dxa"/>
+              <w:start w:w="90" w:type="dxa"/>
+              <w:bottom w:w="40" w:type="dxa"/>
+              <w:end w:w="90" w:type="dxa"/>
+            </w:tcMar>
+          </w:tcPr>
+          <w:p>
+            <w:pPr>
+              <w:spacing w:after="0"/>
+            </w:pPr>
+            <w:r>
+              <w:rPr>
+                <w:rFonts w:ascii="Arial" w:hAnsi="Arial"/>
+                <w:b w:val="0"/>
+              </w:rPr>
+              <w:t>☐</w:t>
+            </w:r>
+          </w:p>
+        </w:tc>
+        <w:tc>
+          <w:tcPr>
+            <w:tcW w:type="dxa" w:w="1260"/>
+            <w:vAlign w:val="center"/>
+            <w:tcMar>
+              <w:top w:w="40" w:type="dxa"/>
+              <w:start w:w="90" w:type="dxa"/>
+              <w:bottom w:w="40" w:type="dxa"/>
+              <w:end w:w="90" w:type="dxa"/>
+            </w:tcMar>
+          </w:tcPr>
+          <w:p>
+            <w:pPr>
+              <w:spacing w:after="0"/>
+            </w:pPr>
+            <w:r>
+              <w:rPr>
+                <w:rFonts w:ascii="Arial" w:hAnsi="Arial"/>
+                <w:b w:val="0"/>
+              </w:rPr>
+              <w:t>☐</w:t>
+            </w:r>
+          </w:p>
+        </w:tc>
+        <w:tc>
+          <w:tcPr>
+            <w:tcW w:type="dxa" w:w="1260"/>
+            <w:vAlign w:val="center"/>
+            <w:tcMar>
+              <w:top w:w="40" w:type="dxa"/>
+              <w:start w:w="90" w:type="dxa"/>
+              <w:bottom w:w="40" w:type="dxa"/>
+              <w:end w:w="90" w:type="dxa"/>
+            </w:tcMar>
+          </w:tcPr>
+          <w:p>
+            <w:pPr>
+              <w:spacing w:after="0"/>
+            </w:pPr>
+            <w:r>
+              <w:rPr>
+                <w:rFonts w:ascii="Arial" w:hAnsi="Arial"/>
+                <w:b w:val="0"/>
+              </w:rPr>
+              <w:t>☐</w:t>
+            </w:r>
+          </w:p>
+        </w:tc>
+        <w:tc>
+          <w:tcPr>
+            <w:tcW w:type="dxa" w:w="1260"/>
+            <w:vAlign w:val="center"/>
+            <w:tcMar>
+              <w:top w:w="40" w:type="dxa"/>
+              <w:start w:w="90" w:type="dxa"/>
+              <w:bottom w:w="40" w:type="dxa"/>
+              <w:end w:w="90" w:type="dxa"/>
+            </w:tcMar>
+          </w:tcPr>
+          <w:p>
+            <w:pPr>
+              <w:spacing w:after="0"/>
+            </w:pPr>
+            <w:r>
+              <w:rPr>
+                <w:rFonts w:ascii="Arial" w:hAnsi="Arial"/>
+                <w:b w:val="0"/>
+              </w:rPr>
+              <w:t>☐</w:t>
+            </w:r>
+          </w:p>
+        </w:tc>
+        <w:tc>
+          <w:tcPr>
+            <w:tcW w:type="dxa" w:w="1260"/>
+            <w:vAlign w:val="center"/>
+            <w:tcMar>
+              <w:top w:w="40" w:type="dxa"/>
+              <w:start w:w="90" w:type="dxa"/>
+              <w:bottom w:w="40" w:type="dxa"/>
+              <w:end w:w="90" w:type="dxa"/>
+            </w:tcMar>
+          </w:tcPr>
+          <w:p>
+            <w:pPr>
+              <w:spacing w:after="0"/>
+            </w:pPr>
+            <w:r>
+              <w:rPr>
+                <w:rFonts w:ascii="Arial" w:hAnsi="Arial"/>
+                <w:b w:val="0"/>
+              </w:rPr>
+              <w:t>☐</w:t>
+            </w:r>
+          </w:p>
+        </w:tc>
+      </w:tr>
+      <w:tr>
+        <w:trPr>
+          <w:cantSplit/>
+        </w:trPr>
+        <w:tc>
+          <w:tcPr>
+            <w:tcW w:type="dxa" w:w="1260"/>
+            <w:vAlign w:val="center"/>
+            <w:tcMar>
+              <w:top w:w="40" w:type="dxa"/>
+              <w:start w:w="90" w:type="dxa"/>
+              <w:bottom w:w="40" w:type="dxa"/>
+              <w:end w:w="90" w:type="dxa"/>
+            </w:tcMar>
+          </w:tcPr>
+          <w:p>
+            <w:pPr>
+              <w:spacing w:after="0"/>
+            </w:pPr>
+            <w:r>
+              <w:rPr>
+                <w:rFonts w:ascii="Arial" w:hAnsi="Arial"/>
+                <w:b w:val="0"/>
+              </w:rPr>
+              <w:t>INV2. I was not aware of my real environment.</w:t>
+            </w:r>
+          </w:p>
+        </w:tc>
+        <w:tc>
+          <w:tcPr>
+            <w:tcW w:type="dxa" w:w="1260"/>
+            <w:vAlign w:val="center"/>
+            <w:tcMar>
+              <w:top w:w="40" w:type="dxa"/>
+              <w:start w:w="90" w:type="dxa"/>
+              <w:bottom w:w="40" w:type="dxa"/>
+              <w:end w:w="90" w:type="dxa"/>
+            </w:tcMar>
+          </w:tcPr>
+          <w:p>
+            <w:pPr>
+              <w:spacing w:after="0"/>
+            </w:pPr>
+            <w:r>
+              <w:rPr>
+                <w:rFonts w:ascii="Arial" w:hAnsi="Arial"/>
+                <w:b w:val="0"/>
+              </w:rPr>
+              <w:t>☐</w:t>
+            </w:r>
+          </w:p>
+        </w:tc>
+        <w:tc>
+          <w:tcPr>
+            <w:tcW w:type="dxa" w:w="1260"/>
+            <w:vAlign w:val="center"/>
+            <w:tcMar>
+              <w:top w:w="40" w:type="dxa"/>
+              <w:start w:w="90" w:type="dxa"/>
+              <w:bottom w:w="40" w:type="dxa"/>
+              <w:end w:w="90" w:type="dxa"/>
+            </w:tcMar>
+          </w:tcPr>
+          <w:p>
+            <w:pPr>
+              <w:spacing w:after="0"/>
+            </w:pPr>
+            <w:r>
+              <w:rPr>
+                <w:rFonts w:ascii="Arial" w:hAnsi="Arial"/>
+                <w:b w:val="0"/>
+              </w:rPr>
+              <w:t>☐</w:t>
+            </w:r>
+          </w:p>
+        </w:tc>
+        <w:tc>
+          <w:tcPr>
+            <w:tcW w:type="dxa" w:w="1260"/>
+            <w:vAlign w:val="center"/>
+            <w:tcMar>
+              <w:top w:w="40" w:type="dxa"/>
+              <w:start w:w="90" w:type="dxa"/>
+              <w:bottom w:w="40" w:type="dxa"/>
+              <w:end w:w="90" w:type="dxa"/>
+            </w:tcMar>
+          </w:tcPr>
+          <w:p>
+            <w:pPr>
+              <w:spacing w:after="0"/>
+            </w:pPr>
+            <w:r>
+              <w:rPr>
+                <w:rFonts w:ascii="Arial" w:hAnsi="Arial"/>
+                <w:b w:val="0"/>
+              </w:rPr>
+              <w:t>☐</w:t>
+            </w:r>
+          </w:p>
+        </w:tc>
+        <w:tc>
+          <w:tcPr>
+            <w:tcW w:type="dxa" w:w="1260"/>
+            <w:vAlign w:val="center"/>
+            <w:tcMar>
+              <w:top w:w="40" w:type="dxa"/>
+              <w:start w:w="90" w:type="dxa"/>
+              <w:bottom w:w="40" w:type="dxa"/>
+              <w:end w:w="90" w:type="dxa"/>
+            </w:tcMar>
+          </w:tcPr>
+          <w:p>
+            <w:pPr>
+              <w:spacing w:after="0"/>
+            </w:pPr>
+            <w:r>
+              <w:rPr>
+                <w:rFonts w:ascii="Arial" w:hAnsi="Arial"/>
+                <w:b w:val="0"/>
+              </w:rPr>
+              <w:t>☐</w:t>
+            </w:r>
+          </w:p>
+        </w:tc>
+        <w:tc>
+          <w:tcPr>
+            <w:tcW w:type="dxa" w:w="1260"/>
+            <w:vAlign w:val="center"/>
+            <w:tcMar>
+              <w:top w:w="40" w:type="dxa"/>
+              <w:start w:w="90" w:type="dxa"/>
+              <w:bottom w:w="40" w:type="dxa"/>
+              <w:end w:w="90" w:type="dxa"/>
+            </w:tcMar>
+          </w:tcPr>
+          <w:p>
+            <w:pPr>
+              <w:spacing w:after="0"/>
+            </w:pPr>
+            <w:r>
+              <w:rPr>
+                <w:rFonts w:ascii="Arial" w:hAnsi="Arial"/>
+                <w:b w:val="0"/>
+              </w:rPr>
+              <w:t>☐</w:t>
+            </w:r>
+          </w:p>
+        </w:tc>
+        <w:tc>
+          <w:tcPr>
+            <w:tcW w:type="dxa" w:w="1260"/>
+            <w:vAlign w:val="center"/>
+            <w:tcMar>
+              <w:top w:w="40" w:type="dxa"/>
+              <w:start w:w="90" w:type="dxa"/>
+              <w:bottom w:w="40" w:type="dxa"/>
+              <w:end w:w="90" w:type="dxa"/>
+            </w:tcMar>
+          </w:tcPr>
+          <w:p>
+            <w:pPr>
+              <w:spacing w:after="0"/>
+            </w:pPr>
+            <w:r>
+              <w:rPr>
+                <w:rFonts w:ascii="Arial" w:hAnsi="Arial"/>
+                <w:b w:val="0"/>
+              </w:rPr>
+              <w:t>☐</w:t>
+            </w:r>
+          </w:p>
+        </w:tc>
+        <w:tc>
+          <w:tcPr>
+            <w:tcW w:type="dxa" w:w="1260"/>
+            <w:vAlign w:val="center"/>
+            <w:tcMar>
+              <w:top w:w="40" w:type="dxa"/>
+              <w:start w:w="90" w:type="dxa"/>
+              <w:bottom w:w="40" w:type="dxa"/>
+              <w:end w:w="90" w:type="dxa"/>
+            </w:tcMar>
+          </w:tcPr>
+          <w:p>
+            <w:pPr>
+              <w:spacing w:after="0"/>
+            </w:pPr>
+            <w:r>
+              <w:rPr>
+                <w:rFonts w:ascii="Arial" w:hAnsi="Arial"/>
+                <w:b w:val="0"/>
+              </w:rPr>
+              <w:t>☐</w:t>
+            </w:r>
+          </w:p>
+        </w:tc>
+      </w:tr>
+      <w:tr>
+        <w:trPr>
+          <w:cantSplit/>
+        </w:trPr>
+        <w:tc>
+          <w:tcPr>
+            <w:tcW w:type="dxa" w:w="1260"/>
+            <w:vAlign w:val="center"/>
+            <w:tcMar>
+              <w:top w:w="40" w:type="dxa"/>
+              <w:start w:w="90" w:type="dxa"/>
+              <w:bottom w:w="40" w:type="dxa"/>
+              <w:end w:w="90" w:type="dxa"/>
+            </w:tcMar>
+          </w:tcPr>
+          <w:p>
+            <w:pPr>
+              <w:spacing w:after="0"/>
+            </w:pPr>
+            <w:r>
+              <w:rPr>
+                <w:rFonts w:ascii="Arial" w:hAnsi="Arial"/>
+                <w:b w:val="0"/>
+              </w:rPr>
+              <w:t>INV3. I still paid attention to the real environment.</w:t>
+            </w:r>
+          </w:p>
+        </w:tc>
+        <w:tc>
+          <w:tcPr>
+            <w:tcW w:type="dxa" w:w="1260"/>
+            <w:vAlign w:val="center"/>
+            <w:tcMar>
+              <w:top w:w="40" w:type="dxa"/>
+              <w:start w:w="90" w:type="dxa"/>
+              <w:bottom w:w="40" w:type="dxa"/>
+              <w:end w:w="90" w:type="dxa"/>
+            </w:tcMar>
+          </w:tcPr>
+          <w:p>
+            <w:pPr>
+              <w:spacing w:after="0"/>
+            </w:pPr>
+            <w:r>
+              <w:rPr>
+                <w:rFonts w:ascii="Arial" w:hAnsi="Arial"/>
+                <w:b w:val="0"/>
+              </w:rPr>
+              <w:t>☐</w:t>
+            </w:r>
+          </w:p>
+        </w:tc>
+        <w:tc>
+          <w:tcPr>
+            <w:tcW w:type="dxa" w:w="1260"/>
+            <w:vAlign w:val="center"/>
+            <w:tcMar>
+              <w:top w:w="40" w:type="dxa"/>
+              <w:start w:w="90" w:type="dxa"/>
+              <w:bottom w:w="40" w:type="dxa"/>
+              <w:end w:w="90" w:type="dxa"/>
+            </w:tcMar>
+          </w:tcPr>
+          <w:p>
+            <w:pPr>
+              <w:spacing w:after="0"/>
+            </w:pPr>
+            <w:r>
+              <w:rPr>
+                <w:rFonts w:ascii="Arial" w:hAnsi="Arial"/>
+                <w:b w:val="0"/>
+              </w:rPr>
+              <w:t>☐</w:t>
+            </w:r>
+          </w:p>
+        </w:tc>
+        <w:tc>
+          <w:tcPr>
+            <w:tcW w:type="dxa" w:w="1260"/>
+            <w:vAlign w:val="center"/>
+            <w:tcMar>
+              <w:top w:w="40" w:type="dxa"/>
+              <w:start w:w="90" w:type="dxa"/>
+              <w:bottom w:w="40" w:type="dxa"/>
+              <w:end w:w="90" w:type="dxa"/>
+            </w:tcMar>
+          </w:tcPr>
+          <w:p>
+            <w:pPr>
+              <w:spacing w:after="0"/>
+            </w:pPr>
+            <w:r>
+              <w:rPr>
+                <w:rFonts w:ascii="Arial" w:hAnsi="Arial"/>
+                <w:b w:val="0"/>
+              </w:rPr>
+              <w:t>☐</w:t>
+            </w:r>
+          </w:p>
+        </w:tc>
+        <w:tc>
+          <w:tcPr>
+            <w:tcW w:type="dxa" w:w="1260"/>
+            <w:vAlign w:val="center"/>
+            <w:tcMar>
+              <w:top w:w="40" w:type="dxa"/>
+              <w:start w:w="90" w:type="dxa"/>
+              <w:bottom w:w="40" w:type="dxa"/>
+              <w:end w:w="90" w:type="dxa"/>
+            </w:tcMar>
+          </w:tcPr>
+          <w:p>
+            <w:pPr>
+              <w:spacing w:after="0"/>
+            </w:pPr>
+            <w:r>
+              <w:rPr>
+                <w:rFonts w:ascii="Arial" w:hAnsi="Arial"/>
+                <w:b w:val="0"/>
+              </w:rPr>
+              <w:t>☐</w:t>
+            </w:r>
+          </w:p>
+        </w:tc>
+        <w:tc>
+          <w:tcPr>
+            <w:tcW w:type="dxa" w:w="1260"/>
+            <w:vAlign w:val="center"/>
+            <w:tcMar>
+              <w:top w:w="40" w:type="dxa"/>
+              <w:start w:w="90" w:type="dxa"/>
+              <w:bottom w:w="40" w:type="dxa"/>
+              <w:end w:w="90" w:type="dxa"/>
+            </w:tcMar>
+          </w:tcPr>
+          <w:p>
+            <w:pPr>
+              <w:spacing w:after="0"/>
+            </w:pPr>
+            <w:r>
+              <w:rPr>
+                <w:rFonts w:ascii="Arial" w:hAnsi="Arial"/>
+                <w:b w:val="0"/>
+              </w:rPr>
+              <w:t>☐</w:t>
+            </w:r>
+          </w:p>
+        </w:tc>
+        <w:tc>
+          <w:tcPr>
+            <w:tcW w:type="dxa" w:w="1260"/>
+            <w:vAlign w:val="center"/>
+            <w:tcMar>
+              <w:top w:w="40" w:type="dxa"/>
+              <w:start w:w="90" w:type="dxa"/>
+              <w:bottom w:w="40" w:type="dxa"/>
+              <w:end w:w="90" w:type="dxa"/>
+            </w:tcMar>
+          </w:tcPr>
+          <w:p>
+            <w:pPr>
+              <w:spacing w:after="0"/>
+            </w:pPr>
+            <w:r>
+              <w:rPr>
+                <w:rFonts w:ascii="Arial" w:hAnsi="Arial"/>
+                <w:b w:val="0"/>
+              </w:rPr>
+              <w:t>☐</w:t>
+            </w:r>
+          </w:p>
+        </w:tc>
+        <w:tc>
+          <w:tcPr>
+            <w:tcW w:type="dxa" w:w="1260"/>
+            <w:vAlign w:val="center"/>
+            <w:tcMar>
+              <w:top w:w="40" w:type="dxa"/>
+              <w:start w:w="90" w:type="dxa"/>
+              <w:bottom w:w="40" w:type="dxa"/>
+              <w:end w:w="90" w:type="dxa"/>
+            </w:tcMar>
+          </w:tcPr>
+          <w:p>
+            <w:pPr>
+              <w:spacing w:after="0"/>
+            </w:pPr>
+            <w:r>
+              <w:rPr>
+                <w:rFonts w:ascii="Arial" w:hAnsi="Arial"/>
+                <w:b w:val="0"/>
+              </w:rPr>
+              <w:t>☐</w:t>
+            </w:r>
+          </w:p>
+        </w:tc>
+      </w:tr>
+      <w:tr>
+        <w:trPr>
+          <w:cantSplit/>
+        </w:trPr>
+        <w:tc>
+          <w:tcPr>
+            <w:tcW w:type="dxa" w:w="1260"/>
+            <w:vAlign w:val="center"/>
+            <w:tcMar>
+              <w:top w:w="40" w:type="dxa"/>
+              <w:start w:w="90" w:type="dxa"/>
+              <w:bottom w:w="40" w:type="dxa"/>
+              <w:end w:w="90" w:type="dxa"/>
+            </w:tcMar>
+          </w:tcPr>
+          <w:p>
+            <w:pPr>
+              <w:spacing w:after="0"/>
+            </w:pPr>
+            <w:r>
+              <w:rPr>
+                <w:rFonts w:ascii="Arial" w:hAnsi="Arial"/>
+                <w:b w:val="0"/>
+              </w:rPr>
+              <w:t>INV4. I was completely captivated by the virtual world.</w:t>
+            </w:r>
+          </w:p>
+        </w:tc>
+        <w:tc>
+          <w:tcPr>
+            <w:tcW w:type="dxa" w:w="1260"/>
+            <w:vAlign w:val="center"/>
+            <w:tcMar>
+              <w:top w:w="40" w:type="dxa"/>
+              <w:start w:w="90" w:type="dxa"/>
+              <w:bottom w:w="40" w:type="dxa"/>
+              <w:end w:w="90" w:type="dxa"/>
+            </w:tcMar>
+          </w:tcPr>
+          <w:p>
+            <w:pPr>
+              <w:spacing w:after="0"/>
+            </w:pPr>
+            <w:r>
+              <w:rPr>
+                <w:rFonts w:ascii="Arial" w:hAnsi="Arial"/>
+                <w:b w:val="0"/>
+              </w:rPr>
+              <w:t>☐</w:t>
+            </w:r>
+          </w:p>
+        </w:tc>
+        <w:tc>
+          <w:tcPr>
+            <w:tcW w:type="dxa" w:w="1260"/>
+            <w:vAlign w:val="center"/>
+            <w:tcMar>
+              <w:top w:w="40" w:type="dxa"/>
+              <w:start w:w="90" w:type="dxa"/>
+              <w:bottom w:w="40" w:type="dxa"/>
+              <w:end w:w="90" w:type="dxa"/>
+            </w:tcMar>
+          </w:tcPr>
+          <w:p>
+            <w:pPr>
+              <w:spacing w:after="0"/>
+            </w:pPr>
+            <w:r>
+              <w:rPr>
+                <w:rFonts w:ascii="Arial" w:hAnsi="Arial"/>
+                <w:b w:val="0"/>
+              </w:rPr>
+              <w:t>☐</w:t>
+            </w:r>
+          </w:p>
+        </w:tc>
+        <w:tc>
+          <w:tcPr>
+            <w:tcW w:type="dxa" w:w="1260"/>
+            <w:vAlign w:val="center"/>
+            <w:tcMar>
+              <w:top w:w="40" w:type="dxa"/>
+              <w:start w:w="90" w:type="dxa"/>
+              <w:bottom w:w="40" w:type="dxa"/>
+              <w:end w:w="90" w:type="dxa"/>
+            </w:tcMar>
+          </w:tcPr>
+          <w:p>
+            <w:pPr>
+              <w:spacing w:after="0"/>
+            </w:pPr>
+            <w:r>
+              <w:rPr>
+                <w:rFonts w:ascii="Arial" w:hAnsi="Arial"/>
+                <w:b w:val="0"/>
+              </w:rPr>
+              <w:t>☐</w:t>
+            </w:r>
+          </w:p>
+        </w:tc>
+        <w:tc>
+          <w:tcPr>
+            <w:tcW w:type="dxa" w:w="1260"/>
+            <w:vAlign w:val="center"/>
+            <w:tcMar>
+              <w:top w:w="40" w:type="dxa"/>
+              <w:start w:w="90" w:type="dxa"/>
+              <w:bottom w:w="40" w:type="dxa"/>
+              <w:end w:w="90" w:type="dxa"/>
+            </w:tcMar>
+          </w:tcPr>
+          <w:p>
+            <w:pPr>
+              <w:spacing w:after="0"/>
+            </w:pPr>
+            <w:r>
+              <w:rPr>
+                <w:rFonts w:ascii="Arial" w:hAnsi="Arial"/>
+                <w:b w:val="0"/>
+              </w:rPr>
+              <w:t>☐</w:t>
+            </w:r>
+          </w:p>
+        </w:tc>
+        <w:tc>
+          <w:tcPr>
+            <w:tcW w:type="dxa" w:w="1260"/>
+            <w:vAlign w:val="center"/>
+            <w:tcMar>
+              <w:top w:w="40" w:type="dxa"/>
+              <w:start w:w="90" w:type="dxa"/>
+              <w:bottom w:w="40" w:type="dxa"/>
+              <w:end w:w="90" w:type="dxa"/>
+            </w:tcMar>
+          </w:tcPr>
+          <w:p>
+            <w:pPr>
+              <w:spacing w:after="0"/>
+            </w:pPr>
+            <w:r>
+              <w:rPr>
+                <w:rFonts w:ascii="Arial" w:hAnsi="Arial"/>
+                <w:b w:val="0"/>
+              </w:rPr>
+              <w:t>☐</w:t>
+            </w:r>
+          </w:p>
+        </w:tc>
+        <w:tc>
+          <w:tcPr>
+            <w:tcW w:type="dxa" w:w="1260"/>
+            <w:vAlign w:val="center"/>
+            <w:tcMar>
+              <w:top w:w="40" w:type="dxa"/>
+              <w:start w:w="90" w:type="dxa"/>
+              <w:bottom w:w="40" w:type="dxa"/>
+              <w:end w:w="90" w:type="dxa"/>
+            </w:tcMar>
+          </w:tcPr>
+          <w:p>
+            <w:pPr>
+              <w:spacing w:after="0"/>
+            </w:pPr>
+            <w:r>
+              <w:rPr>
+                <w:rFonts w:ascii="Arial" w:hAnsi="Arial"/>
+                <w:b w:val="0"/>
+              </w:rPr>
+              <w:t>☐</w:t>
+            </w:r>
+          </w:p>
+        </w:tc>
+        <w:tc>
+          <w:tcPr>
+            <w:tcW w:type="dxa" w:w="1260"/>
+            <w:vAlign w:val="center"/>
+            <w:tcMar>
+              <w:top w:w="40" w:type="dxa"/>
+              <w:start w:w="90" w:type="dxa"/>
+              <w:bottom w:w="40" w:type="dxa"/>
+              <w:end w:w="90" w:type="dxa"/>
+            </w:tcMar>
+          </w:tcPr>
+          <w:p>
+            <w:pPr>
+              <w:spacing w:after="0"/>
+            </w:pPr>
+            <w:r>
+              <w:rPr>
+                <w:rFonts w:ascii="Arial" w:hAnsi="Arial"/>
+                <w:b w:val="0"/>
+              </w:rPr>
+              <w:t>☐</w:t>
+            </w:r>
+          </w:p>
+        </w:tc>
+      </w:tr>
+      <w:tr>
+        <w:trPr>
+          <w:cantSplit/>
+        </w:trPr>
+        <w:tc>
+          <w:tcPr>
+            <w:tcW w:type="dxa" w:w="1260"/>
+            <w:vAlign w:val="center"/>
+            <w:tcMar>
+              <w:top w:w="40" w:type="dxa"/>
+              <w:start w:w="90" w:type="dxa"/>
+              <w:bottom w:w="40" w:type="dxa"/>
+              <w:end w:w="90" w:type="dxa"/>
+            </w:tcMar>
+          </w:tcPr>
+          <w:p>
+            <w:pPr>
+              <w:spacing w:after="0"/>
+            </w:pPr>
+            <w:r>
+              <w:rPr>
+                <w:rFonts w:ascii="Arial" w:hAnsi="Arial"/>
+                <w:b w:val="0"/>
+              </w:rPr>
+              <w:t>REAL1. How real did the virtual world seem to you?</w:t>
+            </w:r>
+          </w:p>
+        </w:tc>
+        <w:tc>
+          <w:tcPr>
+            <w:tcW w:type="dxa" w:w="1260"/>
+            <w:vAlign w:val="center"/>
+            <w:tcMar>
+              <w:top w:w="40" w:type="dxa"/>
+              <w:start w:w="90" w:type="dxa"/>
+              <w:bottom w:w="40" w:type="dxa"/>
+              <w:end w:w="90" w:type="dxa"/>
+            </w:tcMar>
+          </w:tcPr>
+          <w:p>
+            <w:pPr>
+              <w:spacing w:after="0"/>
+            </w:pPr>
+            <w:r>
+              <w:rPr>
+                <w:rFonts w:ascii="Arial" w:hAnsi="Arial"/>
+                <w:b w:val="0"/>
+              </w:rPr>
+              <w:t>☐</w:t>
+            </w:r>
+          </w:p>
+        </w:tc>
+        <w:tc>
+          <w:tcPr>
+            <w:tcW w:type="dxa" w:w="1260"/>
+            <w:vAlign w:val="center"/>
+            <w:tcMar>
+              <w:top w:w="40" w:type="dxa"/>
+              <w:start w:w="90" w:type="dxa"/>
+              <w:bottom w:w="40" w:type="dxa"/>
+              <w:end w:w="90" w:type="dxa"/>
+            </w:tcMar>
+          </w:tcPr>
+          <w:p>
+            <w:pPr>
+              <w:spacing w:after="0"/>
+            </w:pPr>
+            <w:r>
+              <w:rPr>
+                <w:rFonts w:ascii="Arial" w:hAnsi="Arial"/>
+                <w:b w:val="0"/>
+              </w:rPr>
+              <w:t>☐</w:t>
+            </w:r>
+          </w:p>
+        </w:tc>
+        <w:tc>
+          <w:tcPr>
+            <w:tcW w:type="dxa" w:w="1260"/>
+            <w:vAlign w:val="center"/>
+            <w:tcMar>
+              <w:top w:w="40" w:type="dxa"/>
+              <w:start w:w="90" w:type="dxa"/>
+              <w:bottom w:w="40" w:type="dxa"/>
+              <w:end w:w="90" w:type="dxa"/>
+            </w:tcMar>
+          </w:tcPr>
+          <w:p>
+            <w:pPr>
+              <w:spacing w:after="0"/>
+            </w:pPr>
+            <w:r>
+              <w:rPr>
+                <w:rFonts w:ascii="Arial" w:hAnsi="Arial"/>
+                <w:b w:val="0"/>
+              </w:rPr>
+              <w:t>☐</w:t>
+            </w:r>
+          </w:p>
+        </w:tc>
+        <w:tc>
+          <w:tcPr>
+            <w:tcW w:type="dxa" w:w="1260"/>
+            <w:vAlign w:val="center"/>
+            <w:tcMar>
+              <w:top w:w="40" w:type="dxa"/>
+              <w:start w:w="90" w:type="dxa"/>
+              <w:bottom w:w="40" w:type="dxa"/>
+              <w:end w:w="90" w:type="dxa"/>
+            </w:tcMar>
+          </w:tcPr>
+          <w:p>
+            <w:pPr>
+              <w:spacing w:after="0"/>
+            </w:pPr>
+            <w:r>
+              <w:rPr>
+                <w:rFonts w:ascii="Arial" w:hAnsi="Arial"/>
+                <w:b w:val="0"/>
+              </w:rPr>
+              <w:t>☐</w:t>
+            </w:r>
+          </w:p>
+        </w:tc>
+        <w:tc>
+          <w:tcPr>
+            <w:tcW w:type="dxa" w:w="1260"/>
+            <w:vAlign w:val="center"/>
+            <w:tcMar>
+              <w:top w:w="40" w:type="dxa"/>
+              <w:start w:w="90" w:type="dxa"/>
+              <w:bottom w:w="40" w:type="dxa"/>
+              <w:end w:w="90" w:type="dxa"/>
+            </w:tcMar>
+          </w:tcPr>
+          <w:p>
+            <w:pPr>
+              <w:spacing w:after="0"/>
+            </w:pPr>
+            <w:r>
+              <w:rPr>
+                <w:rFonts w:ascii="Arial" w:hAnsi="Arial"/>
+                <w:b w:val="0"/>
+              </w:rPr>
+              <w:t>☐</w:t>
+            </w:r>
+          </w:p>
+        </w:tc>
+        <w:tc>
+          <w:tcPr>
+            <w:tcW w:type="dxa" w:w="1260"/>
+            <w:vAlign w:val="center"/>
+            <w:tcMar>
+              <w:top w:w="40" w:type="dxa"/>
+              <w:start w:w="90" w:type="dxa"/>
+              <w:bottom w:w="40" w:type="dxa"/>
+              <w:end w:w="90" w:type="dxa"/>
+            </w:tcMar>
+          </w:tcPr>
+          <w:p>
+            <w:pPr>
+              <w:spacing w:after="0"/>
+            </w:pPr>
+            <w:r>
+              <w:rPr>
+                <w:rFonts w:ascii="Arial" w:hAnsi="Arial"/>
+                <w:b w:val="0"/>
+              </w:rPr>
+              <w:t>☐</w:t>
+            </w:r>
+          </w:p>
+        </w:tc>
+        <w:tc>
+          <w:tcPr>
+            <w:tcW w:type="dxa" w:w="1260"/>
+            <w:vAlign w:val="center"/>
+            <w:tcMar>
+              <w:top w:w="40" w:type="dxa"/>
+              <w:start w:w="90" w:type="dxa"/>
+              <w:bottom w:w="40" w:type="dxa"/>
+              <w:end w:w="90" w:type="dxa"/>
+            </w:tcMar>
+          </w:tcPr>
+          <w:p>
+            <w:pPr>
+              <w:spacing w:after="0"/>
+            </w:pPr>
+            <w:r>
+              <w:rPr>
+                <w:rFonts w:ascii="Arial" w:hAnsi="Arial"/>
+                <w:b w:val="0"/>
+              </w:rPr>
+              <w:t>☐</w:t>
+            </w:r>
+          </w:p>
+        </w:tc>
+      </w:tr>
+      <w:tr>
+        <w:trPr>
+          <w:cantSplit/>
+        </w:trPr>
+        <w:tc>
+          <w:tcPr>
+            <w:tcW w:type="dxa" w:w="1260"/>
+            <w:vAlign w:val="center"/>
+            <w:tcMar>
+              <w:top w:w="40" w:type="dxa"/>
+              <w:start w:w="90" w:type="dxa"/>
+              <w:bottom w:w="40" w:type="dxa"/>
+              <w:end w:w="90" w:type="dxa"/>
+            </w:tcMar>
+          </w:tcPr>
+          <w:p>
+            <w:pPr>
+              <w:spacing w:after="0"/>
+            </w:pPr>
+            <w:r>
+              <w:rPr>
+                <w:rFonts w:ascii="Arial" w:hAnsi="Arial"/>
+                <w:b w:val="0"/>
+              </w:rPr>
+              <w:t>REAL2. How much did your experience in the virtual environment seem consistent with your real-world experience?</w:t>
+            </w:r>
+          </w:p>
+        </w:tc>
+        <w:tc>
+          <w:tcPr>
+            <w:tcW w:type="dxa" w:w="1260"/>
+            <w:vAlign w:val="center"/>
+            <w:tcMar>
+              <w:top w:w="40" w:type="dxa"/>
+              <w:start w:w="90" w:type="dxa"/>
+              <w:bottom w:w="40" w:type="dxa"/>
+              <w:end w:w="90" w:type="dxa"/>
+            </w:tcMar>
+          </w:tcPr>
+          <w:p>
+            <w:pPr>
+              <w:spacing w:after="0"/>
+            </w:pPr>
+            <w:r>
+              <w:rPr>
+                <w:rFonts w:ascii="Arial" w:hAnsi="Arial"/>
+                <w:b w:val="0"/>
+              </w:rPr>
+              <w:t>☐</w:t>
+            </w:r>
+          </w:p>
+        </w:tc>
+        <w:tc>
+          <w:tcPr>
+            <w:tcW w:type="dxa" w:w="1260"/>
+            <w:vAlign w:val="center"/>
+            <w:tcMar>
+              <w:top w:w="40" w:type="dxa"/>
+              <w:start w:w="90" w:type="dxa"/>
+              <w:bottom w:w="40" w:type="dxa"/>
+              <w:end w:w="90" w:type="dxa"/>
+            </w:tcMar>
+          </w:tcPr>
+          <w:p>
+            <w:pPr>
+              <w:spacing w:after="0"/>
+            </w:pPr>
+            <w:r>
+              <w:rPr>
+                <w:rFonts w:ascii="Arial" w:hAnsi="Arial"/>
+                <w:b w:val="0"/>
+              </w:rPr>
+              <w:t>☐</w:t>
+            </w:r>
+          </w:p>
+        </w:tc>
+        <w:tc>
+          <w:tcPr>
+            <w:tcW w:type="dxa" w:w="1260"/>
+            <w:vAlign w:val="center"/>
+            <w:tcMar>
+              <w:top w:w="40" w:type="dxa"/>
+              <w:start w:w="90" w:type="dxa"/>
+              <w:bottom w:w="40" w:type="dxa"/>
+              <w:end w:w="90" w:type="dxa"/>
+            </w:tcMar>
+          </w:tcPr>
+          <w:p>
+            <w:pPr>
+              <w:spacing w:after="0"/>
+            </w:pPr>
+            <w:r>
+              <w:rPr>
+                <w:rFonts w:ascii="Arial" w:hAnsi="Arial"/>
+                <w:b w:val="0"/>
+              </w:rPr>
+              <w:t>☐</w:t>
+            </w:r>
+          </w:p>
+        </w:tc>
+        <w:tc>
+          <w:tcPr>
+            <w:tcW w:type="dxa" w:w="1260"/>
+            <w:vAlign w:val="center"/>
+            <w:tcMar>
+              <w:top w:w="40" w:type="dxa"/>
+              <w:start w:w="90" w:type="dxa"/>
+              <w:bottom w:w="40" w:type="dxa"/>
+              <w:end w:w="90" w:type="dxa"/>
+            </w:tcMar>
+          </w:tcPr>
+          <w:p>
+            <w:pPr>
+              <w:spacing w:after="0"/>
+            </w:pPr>
+            <w:r>
+              <w:rPr>
+                <w:rFonts w:ascii="Arial" w:hAnsi="Arial"/>
+                <w:b w:val="0"/>
+              </w:rPr>
+              <w:t>☐</w:t>
+            </w:r>
+          </w:p>
+        </w:tc>
+        <w:tc>
+          <w:tcPr>
+            <w:tcW w:type="dxa" w:w="1260"/>
+            <w:vAlign w:val="center"/>
+            <w:tcMar>
+              <w:top w:w="40" w:type="dxa"/>
+              <w:start w:w="90" w:type="dxa"/>
+              <w:bottom w:w="40" w:type="dxa"/>
+              <w:end w:w="90" w:type="dxa"/>
+            </w:tcMar>
+          </w:tcPr>
+          <w:p>
+            <w:pPr>
+              <w:spacing w:after="0"/>
+            </w:pPr>
+            <w:r>
+              <w:rPr>
+                <w:rFonts w:ascii="Arial" w:hAnsi="Arial"/>
+                <w:b w:val="0"/>
+              </w:rPr>
+              <w:t>☐</w:t>
+            </w:r>
+          </w:p>
+        </w:tc>
+        <w:tc>
+          <w:tcPr>
+            <w:tcW w:type="dxa" w:w="1260"/>
+            <w:vAlign w:val="center"/>
+            <w:tcMar>
+              <w:top w:w="40" w:type="dxa"/>
+              <w:start w:w="90" w:type="dxa"/>
+              <w:bottom w:w="40" w:type="dxa"/>
+              <w:end w:w="90" w:type="dxa"/>
+            </w:tcMar>
+          </w:tcPr>
+          <w:p>
+            <w:pPr>
+              <w:spacing w:after="0"/>
+            </w:pPr>
+            <w:r>
+              <w:rPr>
+                <w:rFonts w:ascii="Arial" w:hAnsi="Arial"/>
+                <w:b w:val="0"/>
+              </w:rPr>
+              <w:t>☐</w:t>
+            </w:r>
+          </w:p>
+        </w:tc>
+        <w:tc>
+          <w:tcPr>
+            <w:tcW w:type="dxa" w:w="1260"/>
+            <w:vAlign w:val="center"/>
+            <w:tcMar>
+              <w:top w:w="40" w:type="dxa"/>
+              <w:start w:w="90" w:type="dxa"/>
+              <w:bottom w:w="40" w:type="dxa"/>
+              <w:end w:w="90" w:type="dxa"/>
+            </w:tcMar>
+          </w:tcPr>
+          <w:p>
+            <w:pPr>
+              <w:spacing w:after="0"/>
+            </w:pPr>
+            <w:r>
+              <w:rPr>
+                <w:rFonts w:ascii="Arial" w:hAnsi="Arial"/>
+                <w:b w:val="0"/>
+              </w:rPr>
+              <w:t>☐</w:t>
+            </w:r>
+          </w:p>
+        </w:tc>
+      </w:tr>
+      <w:tr>
+        <w:trPr>
+          <w:cantSplit/>
+        </w:trPr>
+        <w:tc>
+          <w:tcPr>
+            <w:tcW w:type="dxa" w:w="1260"/>
+            <w:vAlign w:val="center"/>
+            <w:tcMar>
+              <w:top w:w="40" w:type="dxa"/>
+              <w:start w:w="90" w:type="dxa"/>
+              <w:bottom w:w="40" w:type="dxa"/>
+              <w:end w:w="90" w:type="dxa"/>
+            </w:tcMar>
+          </w:tcPr>
+          <w:p>
+            <w:pPr>
+              <w:spacing w:after="0"/>
+            </w:pPr>
+            <w:r>
+              <w:rPr>
+                <w:rFonts w:ascii="Arial" w:hAnsi="Arial"/>
+                <w:b w:val="0"/>
+              </w:rPr>
+              <w:t>REAL3. How real did the virtual world seem to you (compared with an imagined world)?</w:t>
+            </w:r>
+          </w:p>
+        </w:tc>
+        <w:tc>
+          <w:tcPr>
+            <w:tcW w:type="dxa" w:w="1260"/>
+            <w:vAlign w:val="center"/>
+            <w:tcMar>
+              <w:top w:w="40" w:type="dxa"/>
+              <w:start w:w="90" w:type="dxa"/>
+              <w:bottom w:w="40" w:type="dxa"/>
+              <w:end w:w="90" w:type="dxa"/>
+            </w:tcMar>
+          </w:tcPr>
+          <w:p>
+            <w:pPr>
+              <w:spacing w:after="0"/>
+            </w:pPr>
+            <w:r>
+              <w:rPr>
+                <w:rFonts w:ascii="Arial" w:hAnsi="Arial"/>
+                <w:b w:val="0"/>
+              </w:rPr>
+              <w:t>☐</w:t>
+            </w:r>
+          </w:p>
+        </w:tc>
+        <w:tc>
+          <w:tcPr>
+            <w:tcW w:type="dxa" w:w="1260"/>
+            <w:vAlign w:val="center"/>
+            <w:tcMar>
+              <w:top w:w="40" w:type="dxa"/>
+              <w:start w:w="90" w:type="dxa"/>
+              <w:bottom w:w="40" w:type="dxa"/>
+              <w:end w:w="90" w:type="dxa"/>
+            </w:tcMar>
+          </w:tcPr>
+          <w:p>
+            <w:pPr>
+              <w:spacing w:after="0"/>
+            </w:pPr>
+            <w:r>
+              <w:rPr>
+                <w:rFonts w:ascii="Arial" w:hAnsi="Arial"/>
+                <w:b w:val="0"/>
+              </w:rPr>
+              <w:t>☐</w:t>
+            </w:r>
+          </w:p>
+        </w:tc>
+        <w:tc>
+          <w:tcPr>
+            <w:tcW w:type="dxa" w:w="1260"/>
+            <w:vAlign w:val="center"/>
+            <w:tcMar>
+              <w:top w:w="40" w:type="dxa"/>
+              <w:start w:w="90" w:type="dxa"/>
+              <w:bottom w:w="40" w:type="dxa"/>
+              <w:end w:w="90" w:type="dxa"/>
+            </w:tcMar>
+          </w:tcPr>
+          <w:p>
+            <w:pPr>
+              <w:spacing w:after="0"/>
+            </w:pPr>
+            <w:r>
+              <w:rPr>
+                <w:rFonts w:ascii="Arial" w:hAnsi="Arial"/>
+                <w:b w:val="0"/>
+              </w:rPr>
+              <w:t>☐</w:t>
+            </w:r>
+          </w:p>
+        </w:tc>
+        <w:tc>
+          <w:tcPr>
+            <w:tcW w:type="dxa" w:w="1260"/>
+            <w:vAlign w:val="center"/>
+            <w:tcMar>
+              <w:top w:w="40" w:type="dxa"/>
+              <w:start w:w="90" w:type="dxa"/>
+              <w:bottom w:w="40" w:type="dxa"/>
+              <w:end w:w="90" w:type="dxa"/>
+            </w:tcMar>
+          </w:tcPr>
+          <w:p>
+            <w:pPr>
+              <w:spacing w:after="0"/>
+            </w:pPr>
+            <w:r>
+              <w:rPr>
+                <w:rFonts w:ascii="Arial" w:hAnsi="Arial"/>
+                <w:b w:val="0"/>
+              </w:rPr>
+              <w:t>☐</w:t>
+            </w:r>
+          </w:p>
+        </w:tc>
+        <w:tc>
+          <w:tcPr>
+            <w:tcW w:type="dxa" w:w="1260"/>
+            <w:vAlign w:val="center"/>
+            <w:tcMar>
+              <w:top w:w="40" w:type="dxa"/>
+              <w:start w:w="90" w:type="dxa"/>
+              <w:bottom w:w="40" w:type="dxa"/>
+              <w:end w:w="90" w:type="dxa"/>
+            </w:tcMar>
+          </w:tcPr>
+          <w:p>
+            <w:pPr>
+              <w:spacing w:after="0"/>
+            </w:pPr>
+            <w:r>
+              <w:rPr>
+                <w:rFonts w:ascii="Arial" w:hAnsi="Arial"/>
+                <w:b w:val="0"/>
+              </w:rPr>
+              <w:t>☐</w:t>
+            </w:r>
+          </w:p>
+        </w:tc>
+        <w:tc>
+          <w:tcPr>
+            <w:tcW w:type="dxa" w:w="1260"/>
+            <w:vAlign w:val="center"/>
+            <w:tcMar>
+              <w:top w:w="40" w:type="dxa"/>
+              <w:start w:w="90" w:type="dxa"/>
+              <w:bottom w:w="40" w:type="dxa"/>
+              <w:end w:w="90" w:type="dxa"/>
+            </w:tcMar>
+          </w:tcPr>
+          <w:p>
+            <w:pPr>
+              <w:spacing w:after="0"/>
+            </w:pPr>
+            <w:r>
+              <w:rPr>
+                <w:rFonts w:ascii="Arial" w:hAnsi="Arial"/>
+                <w:b w:val="0"/>
+              </w:rPr>
+              <w:t>☐</w:t>
+            </w:r>
+          </w:p>
+        </w:tc>
+        <w:tc>
+          <w:tcPr>
+            <w:tcW w:type="dxa" w:w="1260"/>
+            <w:vAlign w:val="center"/>
+            <w:tcMar>
+              <w:top w:w="40" w:type="dxa"/>
+              <w:start w:w="90" w:type="dxa"/>
+              <w:bottom w:w="40" w:type="dxa"/>
+              <w:end w:w="90" w:type="dxa"/>
+            </w:tcMar>
+          </w:tcPr>
+          <w:p>
+            <w:pPr>
+              <w:spacing w:after="0"/>
+            </w:pPr>
+            <w:r>
+              <w:rPr>
+                <w:rFonts w:ascii="Arial" w:hAnsi="Arial"/>
+                <w:b w:val="0"/>
+              </w:rPr>
+              <w:t>☐</w:t>
+            </w:r>
+          </w:p>
+        </w:tc>
+      </w:tr>
+      <w:tr>
+        <w:trPr>
+          <w:cantSplit/>
+        </w:trPr>
+        <w:tc>
+          <w:tcPr>
+            <w:tcW w:type="dxa" w:w="1260"/>
+            <w:vAlign w:val="center"/>
+            <w:tcMar>
+              <w:top w:w="40" w:type="dxa"/>
+              <w:start w:w="90" w:type="dxa"/>
+              <w:bottom w:w="40" w:type="dxa"/>
+              <w:end w:w="90" w:type="dxa"/>
+            </w:tcMar>
+          </w:tcPr>
+          <w:p>
+            <w:pPr>
+              <w:spacing w:after="0"/>
+            </w:pPr>
+            <w:r>
+              <w:rPr>
+                <w:rFonts w:ascii="Arial" w:hAnsi="Arial"/>
+                <w:b w:val="0"/>
+              </w:rPr>
+              <w:t>REAL4. The virtual world seemed more real than the real world.</w:t>
+            </w:r>
+          </w:p>
+        </w:tc>
+        <w:tc>
+          <w:tcPr>
+            <w:tcW w:type="dxa" w:w="1260"/>
+            <w:vAlign w:val="center"/>
+            <w:tcMar>
+              <w:top w:w="40" w:type="dxa"/>
+              <w:start w:w="90" w:type="dxa"/>
+              <w:bottom w:w="40" w:type="dxa"/>
+              <w:end w:w="90" w:type="dxa"/>
+            </w:tcMar>
+          </w:tcPr>
+          <w:p>
+            <w:pPr>
+              <w:spacing w:after="0"/>
+            </w:pPr>
+            <w:r>
+              <w:rPr>
+                <w:rFonts w:ascii="Arial" w:hAnsi="Arial"/>
+                <w:b w:val="0"/>
+              </w:rPr>
+              <w:t>☐</w:t>
+            </w:r>
+          </w:p>
+        </w:tc>
+        <w:tc>
+          <w:tcPr>
+            <w:tcW w:type="dxa" w:w="1260"/>
+            <w:vAlign w:val="center"/>
+            <w:tcMar>
+              <w:top w:w="40" w:type="dxa"/>
+              <w:start w:w="90" w:type="dxa"/>
+              <w:bottom w:w="40" w:type="dxa"/>
+              <w:end w:w="90" w:type="dxa"/>
+            </w:tcMar>
+          </w:tcPr>
+          <w:p>
+            <w:pPr>
+              <w:spacing w:after="0"/>
+            </w:pPr>
+            <w:r>
+              <w:rPr>
+                <w:rFonts w:ascii="Arial" w:hAnsi="Arial"/>
+                <w:b w:val="0"/>
+              </w:rPr>
+              <w:t>☐</w:t>
+            </w:r>
+          </w:p>
+        </w:tc>
+        <w:tc>
+          <w:tcPr>
+            <w:tcW w:type="dxa" w:w="1260"/>
+            <w:vAlign w:val="center"/>
+            <w:tcMar>
+              <w:top w:w="40" w:type="dxa"/>
+              <w:start w:w="90" w:type="dxa"/>
+              <w:bottom w:w="40" w:type="dxa"/>
+              <w:end w:w="90" w:type="dxa"/>
+            </w:tcMar>
+          </w:tcPr>
+          <w:p>
+            <w:pPr>
+              <w:spacing w:after="0"/>
+            </w:pPr>
+            <w:r>
+              <w:rPr>
+                <w:rFonts w:ascii="Arial" w:hAnsi="Arial"/>
+                <w:b w:val="0"/>
+              </w:rPr>
+              <w:t>☐</w:t>
+            </w:r>
+          </w:p>
+        </w:tc>
+        <w:tc>
+          <w:tcPr>
+            <w:tcW w:type="dxa" w:w="1260"/>
+            <w:vAlign w:val="center"/>
+            <w:tcMar>
+              <w:top w:w="40" w:type="dxa"/>
+              <w:start w:w="90" w:type="dxa"/>
+              <w:bottom w:w="40" w:type="dxa"/>
+              <w:end w:w="90" w:type="dxa"/>
+            </w:tcMar>
+          </w:tcPr>
+          <w:p>
+            <w:pPr>
+              <w:spacing w:after="0"/>
+            </w:pPr>
+            <w:r>
+              <w:rPr>
+                <w:rFonts w:ascii="Arial" w:hAnsi="Arial"/>
+                <w:b w:val="0"/>
+              </w:rPr>
+              <w:t>☐</w:t>
+            </w:r>
+          </w:p>
+        </w:tc>
+        <w:tc>
+          <w:tcPr>
+            <w:tcW w:type="dxa" w:w="1260"/>
+            <w:vAlign w:val="center"/>
+            <w:tcMar>
+              <w:top w:w="40" w:type="dxa"/>
+              <w:start w:w="90" w:type="dxa"/>
+              <w:bottom w:w="40" w:type="dxa"/>
+              <w:end w:w="90" w:type="dxa"/>
+            </w:tcMar>
+          </w:tcPr>
+          <w:p>
+            <w:pPr>
+              <w:spacing w:after="0"/>
+            </w:pPr>
+            <w:r>
+              <w:rPr>
+                <w:rFonts w:ascii="Arial" w:hAnsi="Arial"/>
+                <w:b w:val="0"/>
+              </w:rPr>
+              <w:t>☐</w:t>
+            </w:r>
+          </w:p>
+        </w:tc>
+        <w:tc>
+          <w:tcPr>
+            <w:tcW w:type="dxa" w:w="1260"/>
+            <w:vAlign w:val="center"/>
+            <w:tcMar>
+              <w:top w:w="40" w:type="dxa"/>
+              <w:start w:w="90" w:type="dxa"/>
+              <w:bottom w:w="40" w:type="dxa"/>
+              <w:end w:w="90" w:type="dxa"/>
+            </w:tcMar>
+          </w:tcPr>
+          <w:p>
+            <w:pPr>
+              <w:spacing w:after="0"/>
+            </w:pPr>
+            <w:r>
+              <w:rPr>
+                <w:rFonts w:ascii="Arial" w:hAnsi="Arial"/>
+                <w:b w:val="0"/>
+              </w:rPr>
+              <w:t>☐</w:t>
+            </w:r>
+          </w:p>
+        </w:tc>
+        <w:tc>
+          <w:tcPr>
+            <w:tcW w:type="dxa" w:w="1260"/>
+            <w:vAlign w:val="center"/>
+            <w:tcMar>
+              <w:top w:w="40" w:type="dxa"/>
+              <w:start w:w="90" w:type="dxa"/>
+              <w:bottom w:w="40" w:type="dxa"/>
+              <w:end w:w="90" w:type="dxa"/>
+            </w:tcMar>
+          </w:tcPr>
+          <w:p>
+            <w:pPr>
+              <w:spacing w:after="0"/>
+            </w:pPr>
+            <w:r>
+              <w:rPr>
+                <w:rFonts w:ascii="Arial" w:hAnsi="Arial"/>
+                <w:b w:val="0"/>
+              </w:rPr>
+              <w:t>☐</w:t>
+            </w:r>
+          </w:p>
+        </w:tc>
+      </w:tr>
+    </w:tbl>
+    <w:p>
+      <w:pPr>
+        <w:spacing w:after="0"/>
+      </w:pPr>
+    </w:p>
+    <w:p>
+      <w:r>
+        <w:rPr>
+          <w:rFonts w:ascii="Arial" w:hAnsi="Arial"/>
+          <w:b w:val="0"/>
+        </w:rPr>
+        <w:t>Reverse-scored items (higher rating indicates less presence): SP2, SP3, INV1, INV3. Compute General, Spatial Presence, Involvement, and Experienced Realism subscales per Schubert et al. (2001).</w:t>
+      </w:r>
+    </w:p>
+    <w:p>
+      <w:r>
+        <w:rPr>
+          <w:rFonts w:ascii="Arial" w:hAnsi="Arial"/>
+          <w:b w:val="0"/>
+        </w:rPr>
+        <w:t>Reference: Schubert, T., Friedmann, F., &amp; Regenbrecht, H. (2001). The experience of presence: Factor analytic insights. *Presence: Teleoperators and Virtual Environments, 10*(3), 266–281. https://doi.org/10.1162/105474601300343603</w:t>
       </w:r>
     </w:p>
     <w:p>

</xml_diff>